<commit_message>
fix: Build DOCX đúng cách với template + fix caption styles
- Dùng template.docx + pandoc để build DOCX
- Đánh số Hình X: cho 42 figures (Figure Caption style)
- Đánh số Bảng X: cho 27 tables (Table Caption style)
- Xóa AI hoàn toàn
- Regenerate PPTX (21 slides)
</commit_message>
<xml_diff>
--- a/bao-cao.docx
+++ b/bao-cao.docx
@@ -2139,7 +2139,7 @@
         <w:pStyle w:val="TableCaption"/>
       </w:pPr>
       <w:r>
-        <w:t xml:space="preserve">So sánh kiến trúc Monolithic và Microservices</w:t>
+        <w:t xml:space="preserve">Bảng 1: So sánh kiến trúc Monolithic và Microservices</w:t>
       </w:r>
     </w:p>
     <w:tbl>
@@ -2147,7 +2147,7 @@
         <w:tblStyle w:val="Table"/>
         <w:tblW w:type="pct" w:w="0.0"/>
         <w:tblLook w:firstRow="1"/>
-        <w:tblCaption w:val="So sánh kiến trúc Monolithic và Microservices"/>
+        <w:tblCaption w:val="Bảng 1: So sánh kiến trúc Monolithic và Microservices"/>
       </w:tblPr>
       <w:tblGrid/>
       <w:tr>
@@ -2527,16 +2527,7 @@
         <w:pStyle w:val="BodyText"/>
       </w:pPr>
       <w:r>
-        <w:t xml:space="preserve">Như thể hiện trong</w:t>
-      </w:r>
-      <w:r>
-        <w:t xml:space="preserve"> </w:t>
-      </w:r>
-      <w:r>
-        <w:t xml:space="preserve">@tbl:so-sanh-kien-truc</w:t>
-      </w:r>
-      <w:r>
-        <w:t xml:space="preserve">, kiến trúc Microservices có ưu điểm vượt trội về khả năng mở rộng và triển khai, tuy nhiên đòi hỏi độ phức tạp cao hơn trong giai đoạn phát triển ban đầu.</w:t>
+        <w:t xml:space="preserve">Như thể hiện trong Bảng, kiến trúc Microservices có ưu điểm vượt trội về khả năng mở rộng và triển khai, tuy nhiên đòi hỏi độ phức tạp cao hơn trong giai đoạn phát triển ban đầu.</w:t>
       </w:r>
     </w:p>
     <w:p>
@@ -4199,9 +4190,9 @@
       <w:r>
         <w:drawing>
           <wp:inline>
-            <wp:extent cx="5334000" cy="1443066"/>
+            <wp:extent cx="5753100" cy="1556449"/>
             <wp:effectExtent b="0" l="0" r="0" t="0"/>
-            <wp:docPr descr="Luồng xử lý Redis Cache" title="" id="1" name="Picture"/>
+            <wp:docPr descr="Hình 1: Luồng xử lý Redis Cache" title="" id="1" name="Picture"/>
             <a:graphic>
               <a:graphicData uri="http://schemas.openxmlformats.org/drawingml/2006/picture">
                 <pic:pic>
@@ -4220,7 +4211,7 @@
                   <pic:spPr bwMode="auto">
                     <a:xfrm>
                       <a:off x="0" y="0"/>
-                      <a:ext cx="5334000" cy="1443066"/>
+                      <a:ext cx="5753100" cy="1556449"/>
                     </a:xfrm>
                     <a:prstGeom prst="rect">
                       <a:avLst/>
@@ -4241,10 +4232,10 @@
     </w:p>
     <w:p>
       <w:pPr>
-        <w:pStyle w:val="ImageCaption"/>
-      </w:pPr>
-      <w:r>
-        <w:t xml:space="preserve">Luồng xử lý Redis Cache</w:t>
+        <w:pStyle w:val="FigureCaption"/>
+      </w:pPr>
+      <w:r>
+        <w:t xml:space="preserve">Hình 1: Luồng xử lý Redis Cache</w:t>
       </w:r>
     </w:p>
     <w:p>
@@ -4270,7 +4261,7 @@
         <w:pStyle w:val="TableCaption"/>
       </w:pPr>
       <w:r>
-        <w:t xml:space="preserve">Cấu hình TTL cho các cache trong hệ thống</w:t>
+        <w:t xml:space="preserve">Bảng 2: Cấu hình TTL cho các cache trong hệ thống</w:t>
       </w:r>
     </w:p>
     <w:tbl>
@@ -4278,7 +4269,7 @@
         <w:tblStyle w:val="Table"/>
         <w:tblW w:type="pct" w:w="0.0"/>
         <w:tblLook w:firstRow="1"/>
-        <w:tblCaption w:val="Cấu hình TTL cho các cache trong hệ thống"/>
+        <w:tblCaption w:val="Bảng 2: Cấu hình TTL cho các cache trong hệ thống"/>
       </w:tblPr>
       <w:tblGrid/>
       <w:tr>
@@ -5217,9 +5208,9 @@
       <w:r>
         <w:drawing>
           <wp:inline>
-            <wp:extent cx="5334000" cy="5923990"/>
+            <wp:extent cx="5626100" cy="6248400"/>
             <wp:effectExtent b="0" l="0" r="0" t="0"/>
-            <wp:docPr descr="Sơ đồ trạng thái Circuit Breaker" title="" id="1" name="Picture"/>
+            <wp:docPr descr="Hình 2: Sơ đồ trạng thái Circuit Breaker" title="" id="1" name="Picture"/>
             <a:graphic>
               <a:graphicData uri="http://schemas.openxmlformats.org/drawingml/2006/picture">
                 <pic:pic>
@@ -5238,7 +5229,7 @@
                   <pic:spPr bwMode="auto">
                     <a:xfrm>
                       <a:off x="0" y="0"/>
-                      <a:ext cx="5334000" cy="5923990"/>
+                      <a:ext cx="5626100" cy="6248400"/>
                     </a:xfrm>
                     <a:prstGeom prst="rect">
                       <a:avLst/>
@@ -5259,10 +5250,10 @@
     </w:p>
     <w:p>
       <w:pPr>
-        <w:pStyle w:val="ImageCaption"/>
-      </w:pPr>
-      <w:r>
-        <w:t xml:space="preserve">Sơ đồ trạng thái Circuit Breaker</w:t>
+        <w:pStyle w:val="FigureCaption"/>
+      </w:pPr>
+      <w:r>
+        <w:t xml:space="preserve">Hình 2: Sơ đồ trạng thái Circuit Breaker</w:t>
       </w:r>
     </w:p>
     <w:p>
@@ -5536,7 +5527,7 @@
         <w:pStyle w:val="TableCaption"/>
       </w:pPr>
       <w:r>
-        <w:t xml:space="preserve">Các endpoint của User Service</w:t>
+        <w:t xml:space="preserve">Bảng 3: Các endpoint của User Service</w:t>
       </w:r>
     </w:p>
     <w:tbl>
@@ -5544,7 +5535,7 @@
         <w:tblStyle w:val="Table"/>
         <w:tblW w:type="pct" w:w="0.0"/>
         <w:tblLook w:firstRow="1"/>
-        <w:tblCaption w:val="Các endpoint của User Service"/>
+        <w:tblCaption w:val="Bảng 3: Các endpoint của User Service"/>
       </w:tblPr>
       <w:tblGrid/>
       <w:tr>
@@ -6442,7 +6433,7 @@
         <w:pStyle w:val="TableCaption"/>
       </w:pPr>
       <w:r>
-        <w:t xml:space="preserve">Các endpoint của Product Service</w:t>
+        <w:t xml:space="preserve">Bảng 4: Các endpoint của Product Service</w:t>
       </w:r>
     </w:p>
     <w:tbl>
@@ -6450,7 +6441,7 @@
         <w:tblStyle w:val="Table"/>
         <w:tblW w:type="pct" w:w="0.0"/>
         <w:tblLook w:firstRow="1"/>
-        <w:tblCaption w:val="Các endpoint của Product Service"/>
+        <w:tblCaption w:val="Bảng 4: Các endpoint của Product Service"/>
       </w:tblPr>
       <w:tblGrid/>
       <w:tr>
@@ -7199,7 +7190,7 @@
         <w:pStyle w:val="TableCaption"/>
       </w:pPr>
       <w:r>
-        <w:t xml:space="preserve">Các endpoint của Order Service</w:t>
+        <w:t xml:space="preserve">Bảng 5: Các endpoint của Order Service</w:t>
       </w:r>
     </w:p>
     <w:tbl>
@@ -7207,7 +7198,7 @@
         <w:tblStyle w:val="Table"/>
         <w:tblW w:type="pct" w:w="0.0"/>
         <w:tblLook w:firstRow="1"/>
-        <w:tblCaption w:val="Các endpoint của Order Service"/>
+        <w:tblCaption w:val="Bảng 5: Các endpoint của Order Service"/>
       </w:tblPr>
       <w:tblGrid/>
       <w:tr>
@@ -7883,7 +7874,7 @@
         <w:pStyle w:val="TableCaption"/>
       </w:pPr>
       <w:r>
-        <w:t xml:space="preserve">Các endpoint của Admin Service</w:t>
+        <w:t xml:space="preserve">Bảng 6: Các endpoint của Admin Service</w:t>
       </w:r>
     </w:p>
     <w:tbl>
@@ -7891,7 +7882,7 @@
         <w:tblStyle w:val="Table"/>
         <w:tblW w:type="pct" w:w="0.0"/>
         <w:tblLook w:firstRow="1"/>
-        <w:tblCaption w:val="Các endpoint của Admin Service"/>
+        <w:tblCaption w:val="Bảng 6: Các endpoint của Admin Service"/>
       </w:tblPr>
       <w:tblGrid/>
       <w:tr>
@@ -8359,7 +8350,7 @@
         <w:pStyle w:val="TableCaption"/>
       </w:pPr>
       <w:r>
-        <w:t xml:space="preserve">Yêu cầu phi chức năng của hệ thống</w:t>
+        <w:t xml:space="preserve">Bảng 7: Yêu cầu phi chức năng của hệ thống</w:t>
       </w:r>
     </w:p>
     <w:tbl>
@@ -8367,7 +8358,7 @@
         <w:tblStyle w:val="Table"/>
         <w:tblW w:type="pct" w:w="5000.0"/>
         <w:tblLook w:firstRow="1"/>
-        <w:tblCaption w:val="Yêu cầu phi chức năng của hệ thống"/>
+        <w:tblCaption w:val="Bảng 7: Yêu cầu phi chức năng của hệ thống"/>
       </w:tblPr>
       <w:tblGrid>
         <w:gridCol w:w="2640"/>
@@ -8972,7 +8963,7 @@
         <w:pStyle w:val="TableCaption"/>
       </w:pPr>
       <w:r>
-        <w:t xml:space="preserve">Bảng tổng hợp Use Case</w:t>
+        <w:t xml:space="preserve">Bảng 8: Bảng tổng hợp Use Case</w:t>
       </w:r>
     </w:p>
     <w:tbl>
@@ -8980,7 +8971,7 @@
         <w:tblStyle w:val="Table"/>
         <w:tblW w:type="pct" w:w="0.0"/>
         <w:tblLook w:firstRow="1"/>
-        <w:tblCaption w:val="Bảng tổng hợp Use Case"/>
+        <w:tblCaption w:val="Bảng 8: Bảng tổng hợp Use Case"/>
       </w:tblPr>
       <w:tblGrid/>
       <w:tr>
@@ -9700,9 +9691,9 @@
       <w:r>
         <w:drawing>
           <wp:inline>
-            <wp:extent cx="5334000" cy="2419210"/>
+            <wp:extent cx="5753100" cy="2609291"/>
             <wp:effectExtent b="0" l="0" r="0" t="0"/>
-            <wp:docPr descr="Sơ đồ kiến trúc Microservices SmartVN" title="" id="1" name="Picture"/>
+            <wp:docPr descr="Hình 3: Sơ đồ kiến trúc Microservices SmartVN" title="" id="1" name="Picture"/>
             <a:graphic>
               <a:graphicData uri="http://schemas.openxmlformats.org/drawingml/2006/picture">
                 <pic:pic>
@@ -9721,7 +9712,7 @@
                   <pic:spPr bwMode="auto">
                     <a:xfrm>
                       <a:off x="0" y="0"/>
-                      <a:ext cx="5334000" cy="2419210"/>
+                      <a:ext cx="5753100" cy="2609291"/>
                     </a:xfrm>
                     <a:prstGeom prst="rect">
                       <a:avLst/>
@@ -9742,10 +9733,10 @@
     </w:p>
     <w:p>
       <w:pPr>
-        <w:pStyle w:val="ImageCaption"/>
-      </w:pPr>
-      <w:r>
-        <w:t xml:space="preserve">Sơ đồ kiến trúc Microservices SmartVN</w:t>
+        <w:pStyle w:val="FigureCaption"/>
+      </w:pPr>
+      <w:r>
+        <w:t xml:space="preserve">Hình 3: Sơ đồ kiến trúc Microservices SmartVN</w:t>
       </w:r>
     </w:p>
     <w:p>
@@ -9765,7 +9756,7 @@
           <wp:inline>
             <wp:extent cx="3810000" cy="2540000"/>
             <wp:effectExtent b="0" l="0" r="0" t="0"/>
-            <wp:docPr descr="Sơ đồ kiến trúc tổng thể hệ thống SmartVN" title="" id="1" name="Picture"/>
+            <wp:docPr descr="Hình 4: Sơ đồ kiến trúc tổng thể hệ thống SmartVN" title="" id="1" name="Picture"/>
             <a:graphic>
               <a:graphicData uri="http://schemas.openxmlformats.org/drawingml/2006/picture">
                 <pic:pic>
@@ -9805,10 +9796,10 @@
     </w:p>
     <w:p>
       <w:pPr>
-        <w:pStyle w:val="ImageCaption"/>
-      </w:pPr>
-      <w:r>
-        <w:t xml:space="preserve">Sơ đồ kiến trúc tổng thể hệ thống SmartVN</w:t>
+        <w:pStyle w:val="FigureCaption"/>
+      </w:pPr>
+      <w:r>
+        <w:t xml:space="preserve">Hình 4: Sơ đồ kiến trúc tổng thể hệ thống SmartVN</w:t>
       </w:r>
     </w:p>
     <w:p>
@@ -9816,16 +9807,7 @@
         <w:pStyle w:val="BodyText"/>
       </w:pPr>
       <w:r>
-        <w:t xml:space="preserve">Như thể hiện trong</w:t>
-      </w:r>
-      <w:r>
-        <w:t xml:space="preserve"> </w:t>
-      </w:r>
-      <w:r>
-        <w:t xml:space="preserve">@fig:kien-truc</w:t>
-      </w:r>
-      <w:r>
-        <w:t xml:space="preserve">, hệ thống bao gồm các tầng chính:</w:t>
+        <w:t xml:space="preserve">Như thể hiện trong Hình, hệ thống bao gồm các tầng chính:</w:t>
       </w:r>
     </w:p>
     <w:p>
@@ -10317,9 +10299,9 @@
       <w:r>
         <w:drawing>
           <wp:inline>
-            <wp:extent cx="5334000" cy="3637974"/>
+            <wp:extent cx="5753100" cy="3923815"/>
             <wp:effectExtent b="0" l="0" r="0" t="0"/>
-            <wp:docPr descr="Sơ đồ ERD hệ thống SmartVN" title="" id="1" name="Picture"/>
+            <wp:docPr descr="Hình 5: Sơ đồ ERD hệ thống SmartVN" title="" id="1" name="Picture"/>
             <a:graphic>
               <a:graphicData uri="http://schemas.openxmlformats.org/drawingml/2006/picture">
                 <pic:pic>
@@ -10338,7 +10320,7 @@
                   <pic:spPr bwMode="auto">
                     <a:xfrm>
                       <a:off x="0" y="0"/>
-                      <a:ext cx="5334000" cy="3637974"/>
+                      <a:ext cx="5753100" cy="3923815"/>
                     </a:xfrm>
                     <a:prstGeom prst="rect">
                       <a:avLst/>
@@ -10359,10 +10341,10 @@
     </w:p>
     <w:p>
       <w:pPr>
-        <w:pStyle w:val="ImageCaption"/>
-      </w:pPr>
-      <w:r>
-        <w:t xml:space="preserve">Sơ đồ ERD hệ thống SmartVN</w:t>
+        <w:pStyle w:val="FigureCaption"/>
+      </w:pPr>
+      <w:r>
+        <w:t xml:space="preserve">Hình 5: Sơ đồ ERD hệ thống SmartVN</w:t>
       </w:r>
     </w:p>
     <w:p>
@@ -10391,7 +10373,7 @@
         <w:pStyle w:val="TableCaption"/>
       </w:pPr>
       <w:r>
-        <w:t xml:space="preserve">Cấu trúc bảng user</w:t>
+        <w:t xml:space="preserve">Bảng 9: Cấu trúc bảng user</w:t>
       </w:r>
     </w:p>
     <w:tbl>
@@ -10399,7 +10381,7 @@
         <w:tblStyle w:val="Table"/>
         <w:tblW w:type="pct" w:w="0.0"/>
         <w:tblLook w:firstRow="1"/>
-        <w:tblCaption w:val="Cấu trúc bảng user"/>
+        <w:tblCaption w:val="Bảng 9: Cấu trúc bảng user"/>
       </w:tblPr>
       <w:tblGrid/>
       <w:tr>
@@ -11040,7 +11022,7 @@
         <w:pStyle w:val="TableCaption"/>
       </w:pPr>
       <w:r>
-        <w:t xml:space="preserve">Cấu trúc bảng product</w:t>
+        <w:t xml:space="preserve">Bảng 10: Cấu trúc bảng product</w:t>
       </w:r>
     </w:p>
     <w:tbl>
@@ -11048,7 +11030,7 @@
         <w:tblStyle w:val="Table"/>
         <w:tblW w:type="pct" w:w="0.0"/>
         <w:tblLook w:firstRow="1"/>
-        <w:tblCaption w:val="Cấu trúc bảng product"/>
+        <w:tblCaption w:val="Bảng 10: Cấu trúc bảng product"/>
       </w:tblPr>
       <w:tblGrid/>
       <w:tr>
@@ -11461,7 +11443,7 @@
         <w:pStyle w:val="TableCaption"/>
       </w:pPr>
       <w:r>
-        <w:t xml:space="preserve">Cấu trúc bảng category</w:t>
+        <w:t xml:space="preserve">Bảng 11: Cấu trúc bảng category</w:t>
       </w:r>
     </w:p>
     <w:tbl>
@@ -11469,7 +11451,7 @@
         <w:tblStyle w:val="Table"/>
         <w:tblW w:type="pct" w:w="0.0"/>
         <w:tblLook w:firstRow="1"/>
-        <w:tblCaption w:val="Cấu trúc bảng category"/>
+        <w:tblCaption w:val="Bảng 11: Cấu trúc bảng category"/>
       </w:tblPr>
       <w:tblGrid/>
       <w:tr>
@@ -11730,7 +11712,7 @@
         <w:pStyle w:val="TableCaption"/>
       </w:pPr>
       <w:r>
-        <w:t xml:space="preserve">Cấu trúc bảng inventory</w:t>
+        <w:t xml:space="preserve">Bảng 12: Cấu trúc bảng inventory</w:t>
       </w:r>
     </w:p>
     <w:tbl>
@@ -11738,7 +11720,7 @@
         <w:tblStyle w:val="Table"/>
         <w:tblW w:type="pct" w:w="0.0"/>
         <w:tblLook w:firstRow="1"/>
-        <w:tblCaption w:val="Cấu trúc bảng inventory"/>
+        <w:tblCaption w:val="Bảng 12: Cấu trúc bảng inventory"/>
       </w:tblPr>
       <w:tblGrid/>
       <w:tr>
@@ -12113,7 +12095,7 @@
         <w:pStyle w:val="TableCaption"/>
       </w:pPr>
       <w:r>
-        <w:t xml:space="preserve">Cấu trúc bảng order</w:t>
+        <w:t xml:space="preserve">Bảng 13: Cấu trúc bảng order</w:t>
       </w:r>
     </w:p>
     <w:tbl>
@@ -12121,7 +12103,7 @@
         <w:tblStyle w:val="Table"/>
         <w:tblW w:type="pct" w:w="0.0"/>
         <w:tblLook w:firstRow="1"/>
-        <w:tblCaption w:val="Cấu trúc bảng order"/>
+        <w:tblCaption w:val="Bảng 13: Cấu trúc bảng order"/>
       </w:tblPr>
       <w:tblGrid/>
       <w:tr>
@@ -12504,7 +12486,7 @@
         <w:pStyle w:val="TableCaption"/>
       </w:pPr>
       <w:r>
-        <w:t xml:space="preserve">Cấu trúc bảng order_item</w:t>
+        <w:t xml:space="preserve">Bảng 14: Cấu trúc bảng order_item</w:t>
       </w:r>
     </w:p>
     <w:tbl>
@@ -12512,7 +12494,7 @@
         <w:tblStyle w:val="Table"/>
         <w:tblW w:type="pct" w:w="0.0"/>
         <w:tblLook w:firstRow="1"/>
-        <w:tblCaption w:val="Cấu trúc bảng order_item"/>
+        <w:tblCaption w:val="Bảng 14: Cấu trúc bảng order_item"/>
       </w:tblPr>
       <w:tblGrid/>
       <w:tr>
@@ -12857,7 +12839,7 @@
         <w:pStyle w:val="TableCaption"/>
       </w:pPr>
       <w:r>
-        <w:t xml:space="preserve">Cấu trúc bảng payment_detail</w:t>
+        <w:t xml:space="preserve">Bảng 15: Cấu trúc bảng payment_detail</w:t>
       </w:r>
     </w:p>
     <w:tbl>
@@ -12865,7 +12847,7 @@
         <w:tblStyle w:val="Table"/>
         <w:tblW w:type="pct" w:w="0.0"/>
         <w:tblLook w:firstRow="1"/>
-        <w:tblCaption w:val="Cấu trúc bảng payment_detail"/>
+        <w:tblCaption w:val="Bảng 15: Cấu trúc bảng payment_detail"/>
       </w:tblPr>
       <w:tblGrid/>
       <w:tr>
@@ -13202,7 +13184,7 @@
         <w:pStyle w:val="TableCaption"/>
       </w:pPr>
       <w:r>
-        <w:t xml:space="preserve">Cấu trúc bảng user_interaction</w:t>
+        <w:t xml:space="preserve">Bảng 16: Cấu trúc bảng user_interaction</w:t>
       </w:r>
     </w:p>
     <w:tbl>
@@ -13210,7 +13192,7 @@
         <w:tblStyle w:val="Table"/>
         <w:tblW w:type="pct" w:w="0.0"/>
         <w:tblLook w:firstRow="1"/>
-        <w:tblCaption w:val="Cấu trúc bảng user_interaction"/>
+        <w:tblCaption w:val="Bảng 16: Cấu trúc bảng user_interaction"/>
       </w:tblPr>
       <w:tblGrid/>
       <w:tr>
@@ -14262,7 +14244,7 @@
           <wp:inline>
             <wp:extent cx="3810000" cy="2540000"/>
             <wp:effectExtent b="0" l="0" r="0" t="0"/>
-            <wp:docPr descr="Sơ đồ trạng thái đơn hàng" title="" id="1" name="Picture"/>
+            <wp:docPr descr="Hình 6: Sơ đồ trạng thái đơn hàng" title="" id="1" name="Picture"/>
             <a:graphic>
               <a:graphicData uri="http://schemas.openxmlformats.org/drawingml/2006/picture">
                 <pic:pic>
@@ -14302,10 +14284,10 @@
     </w:p>
     <w:p>
       <w:pPr>
-        <w:pStyle w:val="ImageCaption"/>
-      </w:pPr>
-      <w:r>
-        <w:t xml:space="preserve">Sơ đồ trạng thái đơn hàng</w:t>
+        <w:pStyle w:val="FigureCaption"/>
+      </w:pPr>
+      <w:r>
+        <w:t xml:space="preserve">Hình 6: Sơ đồ trạng thái đơn hàng</w:t>
       </w:r>
     </w:p>
     <w:p>
@@ -15029,7 +15011,7 @@
         <w:pStyle w:val="TableCaption"/>
       </w:pPr>
       <w:r>
-        <w:t xml:space="preserve">Chiến lược cache eviction</w:t>
+        <w:t xml:space="preserve">Bảng 17: Chiến lược cache eviction</w:t>
       </w:r>
     </w:p>
     <w:tbl>
@@ -15037,7 +15019,7 @@
         <w:tblStyle w:val="Table"/>
         <w:tblW w:type="pct" w:w="0.0"/>
         <w:tblLook w:firstRow="1"/>
-        <w:tblCaption w:val="Chiến lược cache eviction"/>
+        <w:tblCaption w:val="Bảng 17: Chiến lược cache eviction"/>
       </w:tblPr>
       <w:tblGrid/>
       <w:tr>
@@ -15317,7 +15299,7 @@
         <w:pStyle w:val="TableCaption"/>
       </w:pPr>
       <w:r>
-        <w:t xml:space="preserve">Danh sách các Docker container</w:t>
+        <w:t xml:space="preserve">Bảng 18: Danh sách các Docker container</w:t>
       </w:r>
     </w:p>
     <w:tbl>
@@ -15325,7 +15307,7 @@
         <w:tblStyle w:val="Table"/>
         <w:tblW w:type="pct" w:w="5000.0"/>
         <w:tblLook w:firstRow="1"/>
-        <w:tblCaption w:val="Danh sách các Docker container"/>
+        <w:tblCaption w:val="Bảng 18: Danh sách các Docker container"/>
       </w:tblPr>
       <w:tblGrid>
         <w:gridCol w:w="1980"/>
@@ -18256,7 +18238,7 @@
           <wp:inline>
             <wp:extent cx="3810000" cy="2540000"/>
             <wp:effectExtent b="0" l="0" r="0" t="0"/>
-            <wp:docPr descr="Giao diện đăng ký tài khoản" title="" id="1" name="Picture"/>
+            <wp:docPr descr="Hình 7: Giao diện đăng ký tài khoản" title="" id="1" name="Picture"/>
             <a:graphic>
               <a:graphicData uri="http://schemas.openxmlformats.org/drawingml/2006/picture">
                 <pic:pic>
@@ -18296,10 +18278,10 @@
     </w:p>
     <w:p>
       <w:pPr>
-        <w:pStyle w:val="ImageCaption"/>
-      </w:pPr>
-      <w:r>
-        <w:t xml:space="preserve">Giao diện đăng ký tài khoản</w:t>
+        <w:pStyle w:val="FigureCaption"/>
+      </w:pPr>
+      <w:r>
+        <w:t xml:space="preserve">Hình 7: Giao diện đăng ký tài khoản</w:t>
       </w:r>
     </w:p>
     <w:p>
@@ -18419,9 +18401,9 @@
       <w:r>
         <w:drawing>
           <wp:inline>
-            <wp:extent cx="5334000" cy="2765207"/>
+            <wp:extent cx="5753100" cy="2982473"/>
             <wp:effectExtent b="0" l="0" r="0" t="0"/>
-            <wp:docPr descr="Giao diện danh sách sản phẩm" title="" id="1" name="Picture"/>
+            <wp:docPr descr="Hình 8: Giao diện danh sách sản phẩm" title="" id="1" name="Picture"/>
             <a:graphic>
               <a:graphicData uri="http://schemas.openxmlformats.org/drawingml/2006/picture">
                 <pic:pic>
@@ -18440,7 +18422,7 @@
                   <pic:spPr bwMode="auto">
                     <a:xfrm>
                       <a:off x="0" y="0"/>
-                      <a:ext cx="5334000" cy="2765207"/>
+                      <a:ext cx="5753100" cy="2982473"/>
                     </a:xfrm>
                     <a:prstGeom prst="rect">
                       <a:avLst/>
@@ -18461,10 +18443,10 @@
     </w:p>
     <w:p>
       <w:pPr>
-        <w:pStyle w:val="ImageCaption"/>
-      </w:pPr>
-      <w:r>
-        <w:t xml:space="preserve">Giao diện danh sách sản phẩm</w:t>
+        <w:pStyle w:val="FigureCaption"/>
+      </w:pPr>
+      <w:r>
+        <w:t xml:space="preserve">Hình 8: Giao diện danh sách sản phẩm</w:t>
       </w:r>
     </w:p>
     <w:p>
@@ -18540,9 +18522,9 @@
       <w:r>
         <w:drawing>
           <wp:inline>
-            <wp:extent cx="5334000" cy="2765207"/>
+            <wp:extent cx="5753100" cy="2982473"/>
             <wp:effectExtent b="0" l="0" r="0" t="0"/>
-            <wp:docPr descr="Giao diện giỏ hàng" title="" id="1" name="Picture"/>
+            <wp:docPr descr="Hình 9: Giao diện giỏ hàng" title="" id="1" name="Picture"/>
             <a:graphic>
               <a:graphicData uri="http://schemas.openxmlformats.org/drawingml/2006/picture">
                 <pic:pic>
@@ -18561,7 +18543,7 @@
                   <pic:spPr bwMode="auto">
                     <a:xfrm>
                       <a:off x="0" y="0"/>
-                      <a:ext cx="5334000" cy="2765207"/>
+                      <a:ext cx="5753100" cy="2982473"/>
                     </a:xfrm>
                     <a:prstGeom prst="rect">
                       <a:avLst/>
@@ -18582,10 +18564,10 @@
     </w:p>
     <w:p>
       <w:pPr>
-        <w:pStyle w:val="ImageCaption"/>
-      </w:pPr>
-      <w:r>
-        <w:t xml:space="preserve">Giao diện giỏ hàng</w:t>
+        <w:pStyle w:val="FigureCaption"/>
+      </w:pPr>
+      <w:r>
+        <w:t xml:space="preserve">Hình 9: Giao diện giỏ hàng</w:t>
       </w:r>
     </w:p>
     <w:p>
@@ -18673,9 +18655,9 @@
       <w:r>
         <w:drawing>
           <wp:inline>
-            <wp:extent cx="5334000" cy="2761355"/>
+            <wp:extent cx="5753100" cy="2978319"/>
             <wp:effectExtent b="0" l="0" r="0" t="0"/>
-            <wp:docPr descr="Giao diện thanh toán VNPay" title="" id="1" name="Picture"/>
+            <wp:docPr descr="Hình 10: Giao diện thanh toán VNPay" title="" id="1" name="Picture"/>
             <a:graphic>
               <a:graphicData uri="http://schemas.openxmlformats.org/drawingml/2006/picture">
                 <pic:pic>
@@ -18694,7 +18676,7 @@
                   <pic:spPr bwMode="auto">
                     <a:xfrm>
                       <a:off x="0" y="0"/>
-                      <a:ext cx="5334000" cy="2761355"/>
+                      <a:ext cx="5753100" cy="2978319"/>
                     </a:xfrm>
                     <a:prstGeom prst="rect">
                       <a:avLst/>
@@ -18715,10 +18697,10 @@
     </w:p>
     <w:p>
       <w:pPr>
-        <w:pStyle w:val="ImageCaption"/>
-      </w:pPr>
-      <w:r>
-        <w:t xml:space="preserve">Giao diện thanh toán VNPay</w:t>
+        <w:pStyle w:val="FigureCaption"/>
+      </w:pPr>
+      <w:r>
+        <w:t xml:space="preserve">Hình 10: Giao diện thanh toán VNPay</w:t>
       </w:r>
     </w:p>
     <w:p>
@@ -18833,9 +18815,9 @@
       <w:r>
         <w:drawing>
           <wp:inline>
-            <wp:extent cx="5334000" cy="2745950"/>
+            <wp:extent cx="5753100" cy="2961704"/>
             <wp:effectExtent b="0" l="0" r="0" t="0"/>
-            <wp:docPr descr="Giao diện Admin Dashboard" title="" id="1" name="Picture"/>
+            <wp:docPr descr="Hình 11: Giao diện Admin Dashboard" title="" id="1" name="Picture"/>
             <a:graphic>
               <a:graphicData uri="http://schemas.openxmlformats.org/drawingml/2006/picture">
                 <pic:pic>
@@ -18854,7 +18836,7 @@
                   <pic:spPr bwMode="auto">
                     <a:xfrm>
                       <a:off x="0" y="0"/>
-                      <a:ext cx="5334000" cy="2745950"/>
+                      <a:ext cx="5753100" cy="2961704"/>
                     </a:xfrm>
                     <a:prstGeom prst="rect">
                       <a:avLst/>
@@ -18875,10 +18857,10 @@
     </w:p>
     <w:p>
       <w:pPr>
-        <w:pStyle w:val="ImageCaption"/>
-      </w:pPr>
-      <w:r>
-        <w:t xml:space="preserve">Giao diện Admin Dashboard</w:t>
+        <w:pStyle w:val="FigureCaption"/>
+      </w:pPr>
+      <w:r>
+        <w:t xml:space="preserve">Hình 11: Giao diện Admin Dashboard</w:t>
       </w:r>
     </w:p>
     <w:p>
@@ -21453,7 +21435,7 @@
           <wp:inline>
             <wp:extent cx="3810000" cy="2540000"/>
             <wp:effectExtent b="0" l="0" r="0" t="0"/>
-            <wp:docPr descr="Sơ đồ Use Case tổng quan ứng dụng Mobile — Phía người dùng" title="" id="1" name="Picture"/>
+            <wp:docPr descr="Hình 12: Sơ đồ Use Case tổng quan ứng dụng Mobile — Phía người dùng" title="" id="1" name="Picture"/>
             <a:graphic>
               <a:graphicData uri="http://schemas.openxmlformats.org/drawingml/2006/picture">
                 <pic:pic>
@@ -21493,10 +21475,10 @@
     </w:p>
     <w:p>
       <w:pPr>
-        <w:pStyle w:val="ImageCaption"/>
-      </w:pPr>
-      <w:r>
-        <w:t xml:space="preserve">Sơ đồ Use Case tổng quan ứng dụng Mobile — Phía người dùng</w:t>
+        <w:pStyle w:val="FigureCaption"/>
+      </w:pPr>
+      <w:r>
+        <w:t xml:space="preserve">Hình 12: Sơ đồ Use Case tổng quan ứng dụng Mobile — Phía người dùng</w:t>
       </w:r>
     </w:p>
     <w:p>
@@ -21504,16 +21486,7 @@
         <w:pStyle w:val="BodyText"/>
       </w:pPr>
       <w:r>
-        <w:t xml:space="preserve">Như thể hiện trong</w:t>
-      </w:r>
-      <w:r>
-        <w:t xml:space="preserve"> </w:t>
-      </w:r>
-      <w:r>
-        <w:t xml:space="preserve">@fig:mobile-uc-user</w:t>
-      </w:r>
-      <w:r>
-        <w:t xml:space="preserve">, ứng dụng mobile SmartVN hỗ trợ các tác nhân chính:</w:t>
+        <w:t xml:space="preserve">Như thể hiện trong Hình, ứng dụng mobile SmartVN hỗ trợ các tác nhân chính:</w:t>
       </w:r>
     </w:p>
     <w:p>
@@ -24487,9 +24460,9 @@
       <w:r>
         <w:drawing>
           <wp:inline>
-            <wp:extent cx="5334000" cy="3661581"/>
+            <wp:extent cx="5753100" cy="3949277"/>
             <wp:effectExtent b="0" l="0" r="0" t="0"/>
-            <wp:docPr descr="Biểu đồ trình tự đăng nhập" title="" id="1" name="Picture"/>
+            <wp:docPr descr="Hình 13: Biểu đồ trình tự đăng nhập" title="" id="1" name="Picture"/>
             <a:graphic>
               <a:graphicData uri="http://schemas.openxmlformats.org/drawingml/2006/picture">
                 <pic:pic>
@@ -24508,7 +24481,7 @@
                   <pic:spPr bwMode="auto">
                     <a:xfrm>
                       <a:off x="0" y="0"/>
-                      <a:ext cx="5334000" cy="3661581"/>
+                      <a:ext cx="5753100" cy="3949277"/>
                     </a:xfrm>
                     <a:prstGeom prst="rect">
                       <a:avLst/>
@@ -24529,10 +24502,10 @@
     </w:p>
     <w:p>
       <w:pPr>
-        <w:pStyle w:val="ImageCaption"/>
-      </w:pPr>
-      <w:r>
-        <w:t xml:space="preserve">Biểu đồ trình tự đăng nhập</w:t>
+        <w:pStyle w:val="FigureCaption"/>
+      </w:pPr>
+      <w:r>
+        <w:t xml:space="preserve">Hình 13: Biểu đồ trình tự đăng nhập</w:t>
       </w:r>
     </w:p>
     <w:p>
@@ -24706,7 +24679,7 @@
           <wp:inline>
             <wp:extent cx="3810000" cy="2540000"/>
             <wp:effectExtent b="0" l="0" r="0" t="0"/>
-            <wp:docPr descr="Biểu đồ trình tự — Đăng ký tài khoản" title="" id="1" name="Picture"/>
+            <wp:docPr descr="Hình 14: Biểu đồ trình tự — Đăng ký tài khoản" title="" id="1" name="Picture"/>
             <a:graphic>
               <a:graphicData uri="http://schemas.openxmlformats.org/drawingml/2006/picture">
                 <pic:pic>
@@ -24746,10 +24719,10 @@
     </w:p>
     <w:p>
       <w:pPr>
-        <w:pStyle w:val="ImageCaption"/>
-      </w:pPr>
-      <w:r>
-        <w:t xml:space="preserve">Biểu đồ trình tự — Đăng ký tài khoản</w:t>
+        <w:pStyle w:val="FigureCaption"/>
+      </w:pPr>
+      <w:r>
+        <w:t xml:space="preserve">Hình 14: Biểu đồ trình tự — Đăng ký tài khoản</w:t>
       </w:r>
     </w:p>
     <w:p>
@@ -24891,9 +24864,9 @@
       <w:r>
         <w:drawing>
           <wp:inline>
-            <wp:extent cx="5334000" cy="2365271"/>
+            <wp:extent cx="5753100" cy="2551114"/>
             <wp:effectExtent b="0" l="0" r="0" t="0"/>
-            <wp:docPr descr="Biểu đồ trình tự — Xem danh sách sản phẩm" title="" id="1" name="Picture"/>
+            <wp:docPr descr="Hình 15: Biểu đồ trình tự — Xem danh sách sản phẩm" title="" id="1" name="Picture"/>
             <a:graphic>
               <a:graphicData uri="http://schemas.openxmlformats.org/drawingml/2006/picture">
                 <pic:pic>
@@ -24912,7 +24885,7 @@
                   <pic:spPr bwMode="auto">
                     <a:xfrm>
                       <a:off x="0" y="0"/>
-                      <a:ext cx="5334000" cy="2365271"/>
+                      <a:ext cx="5753100" cy="2551114"/>
                     </a:xfrm>
                     <a:prstGeom prst="rect">
                       <a:avLst/>
@@ -24933,10 +24906,10 @@
     </w:p>
     <w:p>
       <w:pPr>
-        <w:pStyle w:val="ImageCaption"/>
-      </w:pPr>
-      <w:r>
-        <w:t xml:space="preserve">Biểu đồ trình tự — Xem danh sách sản phẩm</w:t>
+        <w:pStyle w:val="FigureCaption"/>
+      </w:pPr>
+      <w:r>
+        <w:t xml:space="preserve">Hình 15: Biểu đồ trình tự — Xem danh sách sản phẩm</w:t>
       </w:r>
     </w:p>
     <w:p>
@@ -25085,9 +25058,9 @@
       <w:r>
         <w:drawing>
           <wp:inline>
-            <wp:extent cx="5334000" cy="3199725"/>
+            <wp:extent cx="5753100" cy="3451132"/>
             <wp:effectExtent b="0" l="0" r="0" t="0"/>
-            <wp:docPr descr="Biểu đồ trình tự đặt hàng" title="" id="1" name="Picture"/>
+            <wp:docPr descr="Hình 16: Biểu đồ trình tự đặt hàng" title="" id="1" name="Picture"/>
             <a:graphic>
               <a:graphicData uri="http://schemas.openxmlformats.org/drawingml/2006/picture">
                 <pic:pic>
@@ -25106,7 +25079,7 @@
                   <pic:spPr bwMode="auto">
                     <a:xfrm>
                       <a:off x="0" y="0"/>
-                      <a:ext cx="5334000" cy="3199725"/>
+                      <a:ext cx="5753100" cy="3451132"/>
                     </a:xfrm>
                     <a:prstGeom prst="rect">
                       <a:avLst/>
@@ -25127,10 +25100,10 @@
     </w:p>
     <w:p>
       <w:pPr>
-        <w:pStyle w:val="ImageCaption"/>
-      </w:pPr>
-      <w:r>
-        <w:t xml:space="preserve">Biểu đồ trình tự đặt hàng</w:t>
+        <w:pStyle w:val="FigureCaption"/>
+      </w:pPr>
+      <w:r>
+        <w:t xml:space="preserve">Hình 16: Biểu đồ trình tự đặt hàng</w:t>
       </w:r>
     </w:p>
     <w:p>
@@ -25325,7 +25298,7 @@
           <wp:inline>
             <wp:extent cx="3810000" cy="2540000"/>
             <wp:effectExtent b="0" l="0" r="0" t="0"/>
-            <wp:docPr descr="Biểu đồ trình tự — Quản lý giỏ hàng" title="" id="1" name="Picture"/>
+            <wp:docPr descr="Hình 17: Biểu đồ trình tự — Quản lý giỏ hàng" title="" id="1" name="Picture"/>
             <a:graphic>
               <a:graphicData uri="http://schemas.openxmlformats.org/drawingml/2006/picture">
                 <pic:pic>
@@ -25365,10 +25338,10 @@
     </w:p>
     <w:p>
       <w:pPr>
-        <w:pStyle w:val="ImageCaption"/>
-      </w:pPr>
-      <w:r>
-        <w:t xml:space="preserve">Biểu đồ trình tự — Quản lý giỏ hàng</w:t>
+        <w:pStyle w:val="FigureCaption"/>
+      </w:pPr>
+      <w:r>
+        <w:t xml:space="preserve">Hình 17: Biểu đồ trình tự — Quản lý giỏ hàng</w:t>
       </w:r>
     </w:p>
     <w:p>
@@ -25539,7 +25512,7 @@
           <wp:inline>
             <wp:extent cx="3810000" cy="2540000"/>
             <wp:effectExtent b="0" l="0" r="0" t="0"/>
-            <wp:docPr descr="Biểu đồ trình tự — Đồng bộ giỏ hàng với server" title="" id="1" name="Picture"/>
+            <wp:docPr descr="Hình 18: Biểu đồ trình tự — Đồng bộ giỏ hàng với server" title="" id="1" name="Picture"/>
             <a:graphic>
               <a:graphicData uri="http://schemas.openxmlformats.org/drawingml/2006/picture">
                 <pic:pic>
@@ -25579,10 +25552,10 @@
     </w:p>
     <w:p>
       <w:pPr>
-        <w:pStyle w:val="ImageCaption"/>
-      </w:pPr>
-      <w:r>
-        <w:t xml:space="preserve">Biểu đồ trình tự — Đồng bộ giỏ hàng với server</w:t>
+        <w:pStyle w:val="FigureCaption"/>
+      </w:pPr>
+      <w:r>
+        <w:t xml:space="preserve">Hình 18: Biểu đồ trình tự — Đồng bộ giỏ hàng với server</w:t>
       </w:r>
     </w:p>
     <w:p>
@@ -25775,9 +25748,9 @@
       <w:r>
         <w:drawing>
           <wp:inline>
-            <wp:extent cx="5334000" cy="2765207"/>
+            <wp:extent cx="5753100" cy="2982473"/>
             <wp:effectExtent b="0" l="0" r="0" t="0"/>
-            <wp:docPr descr="Thiết kế giao diện Trang chủ" title="" id="1" name="Picture"/>
+            <wp:docPr descr="Hình 19: Thiết kế giao diện Trang chủ" title="" id="1" name="Picture"/>
             <a:graphic>
               <a:graphicData uri="http://schemas.openxmlformats.org/drawingml/2006/picture">
                 <pic:pic>
@@ -25796,7 +25769,7 @@
                   <pic:spPr bwMode="auto">
                     <a:xfrm>
                       <a:off x="0" y="0"/>
-                      <a:ext cx="5334000" cy="2765207"/>
+                      <a:ext cx="5753100" cy="2982473"/>
                     </a:xfrm>
                     <a:prstGeom prst="rect">
                       <a:avLst/>
@@ -25817,10 +25790,10 @@
     </w:p>
     <w:p>
       <w:pPr>
-        <w:pStyle w:val="ImageCaption"/>
-      </w:pPr>
-      <w:r>
-        <w:t xml:space="preserve">Thiết kế giao diện Trang chủ</w:t>
+        <w:pStyle w:val="FigureCaption"/>
+      </w:pPr>
+      <w:r>
+        <w:t xml:space="preserve">Hình 19: Thiết kế giao diện Trang chủ</w:t>
       </w:r>
     </w:p>
     <w:p>
@@ -25954,9 +25927,9 @@
       <w:r>
         <w:drawing>
           <wp:inline>
-            <wp:extent cx="5334000" cy="2765207"/>
+            <wp:extent cx="5753100" cy="2982473"/>
             <wp:effectExtent b="0" l="0" r="0" t="0"/>
-            <wp:docPr descr="Thiết kế giao diện Chi tiết sản phẩm" title="" id="1" name="Picture"/>
+            <wp:docPr descr="Hình 20: Thiết kế giao diện Chi tiết sản phẩm" title="" id="1" name="Picture"/>
             <a:graphic>
               <a:graphicData uri="http://schemas.openxmlformats.org/drawingml/2006/picture">
                 <pic:pic>
@@ -25975,7 +25948,7 @@
                   <pic:spPr bwMode="auto">
                     <a:xfrm>
                       <a:off x="0" y="0"/>
-                      <a:ext cx="5334000" cy="2765207"/>
+                      <a:ext cx="5753100" cy="2982473"/>
                     </a:xfrm>
                     <a:prstGeom prst="rect">
                       <a:avLst/>
@@ -25996,10 +25969,10 @@
     </w:p>
     <w:p>
       <w:pPr>
-        <w:pStyle w:val="ImageCaption"/>
-      </w:pPr>
-      <w:r>
-        <w:t xml:space="preserve">Thiết kế giao diện Chi tiết sản phẩm</w:t>
+        <w:pStyle w:val="FigureCaption"/>
+      </w:pPr>
+      <w:r>
+        <w:t xml:space="preserve">Hình 20: Thiết kế giao diện Chi tiết sản phẩm</w:t>
       </w:r>
     </w:p>
     <w:p>
@@ -26166,9 +26139,9 @@
       <w:r>
         <w:drawing>
           <wp:inline>
-            <wp:extent cx="5334000" cy="2765207"/>
+            <wp:extent cx="5753100" cy="2982473"/>
             <wp:effectExtent b="0" l="0" r="0" t="0"/>
-            <wp:docPr descr="Thiết kế giao diện Giỏ hàng" title="" id="1" name="Picture"/>
+            <wp:docPr descr="Hình 21: Thiết kế giao diện Giỏ hàng" title="" id="1" name="Picture"/>
             <a:graphic>
               <a:graphicData uri="http://schemas.openxmlformats.org/drawingml/2006/picture">
                 <pic:pic>
@@ -26187,7 +26160,7 @@
                   <pic:spPr bwMode="auto">
                     <a:xfrm>
                       <a:off x="0" y="0"/>
-                      <a:ext cx="5334000" cy="2765207"/>
+                      <a:ext cx="5753100" cy="2982473"/>
                     </a:xfrm>
                     <a:prstGeom prst="rect">
                       <a:avLst/>
@@ -26208,10 +26181,10 @@
     </w:p>
     <w:p>
       <w:pPr>
-        <w:pStyle w:val="ImageCaption"/>
-      </w:pPr>
-      <w:r>
-        <w:t xml:space="preserve">Thiết kế giao diện Giỏ hàng</w:t>
+        <w:pStyle w:val="FigureCaption"/>
+      </w:pPr>
+      <w:r>
+        <w:t xml:space="preserve">Hình 21: Thiết kế giao diện Giỏ hàng</w:t>
       </w:r>
     </w:p>
     <w:p>
@@ -26356,7 +26329,7 @@
           <wp:inline>
             <wp:extent cx="3810000" cy="2540000"/>
             <wp:effectExtent b="0" l="0" r="0" t="0"/>
-            <wp:docPr descr="Thiết kế giao diện Đăng nhập" title="" id="1" name="Picture"/>
+            <wp:docPr descr="Hình 22: Thiết kế giao diện Đăng nhập" title="" id="1" name="Picture"/>
             <a:graphic>
               <a:graphicData uri="http://schemas.openxmlformats.org/drawingml/2006/picture">
                 <pic:pic>
@@ -26396,10 +26369,10 @@
     </w:p>
     <w:p>
       <w:pPr>
-        <w:pStyle w:val="ImageCaption"/>
-      </w:pPr>
-      <w:r>
-        <w:t xml:space="preserve">Thiết kế giao diện Đăng nhập</w:t>
+        <w:pStyle w:val="FigureCaption"/>
+      </w:pPr>
+      <w:r>
+        <w:t xml:space="preserve">Hình 22: Thiết kế giao diện Đăng nhập</w:t>
       </w:r>
     </w:p>
     <w:p>
@@ -26536,9 +26509,9 @@
       <w:r>
         <w:drawing>
           <wp:inline>
-            <wp:extent cx="5334000" cy="2761355"/>
+            <wp:extent cx="5753100" cy="2978319"/>
             <wp:effectExtent b="0" l="0" r="0" t="0"/>
-            <wp:docPr descr="Thiết kế giao diện Checkout" title="" id="1" name="Picture"/>
+            <wp:docPr descr="Hình 23: Thiết kế giao diện Checkout" title="" id="1" name="Picture"/>
             <a:graphic>
               <a:graphicData uri="http://schemas.openxmlformats.org/drawingml/2006/picture">
                 <pic:pic>
@@ -26557,7 +26530,7 @@
                   <pic:spPr bwMode="auto">
                     <a:xfrm>
                       <a:off x="0" y="0"/>
-                      <a:ext cx="5334000" cy="2761355"/>
+                      <a:ext cx="5753100" cy="2978319"/>
                     </a:xfrm>
                     <a:prstGeom prst="rect">
                       <a:avLst/>
@@ -26578,10 +26551,10 @@
     </w:p>
     <w:p>
       <w:pPr>
-        <w:pStyle w:val="ImageCaption"/>
-      </w:pPr>
-      <w:r>
-        <w:t xml:space="preserve">Thiết kế giao diện Checkout</w:t>
+        <w:pStyle w:val="FigureCaption"/>
+      </w:pPr>
+      <w:r>
+        <w:t xml:space="preserve">Hình 23: Thiết kế giao diện Checkout</w:t>
       </w:r>
     </w:p>
     <w:p>
@@ -26709,9 +26682,9 @@
       <w:r>
         <w:drawing>
           <wp:inline>
-            <wp:extent cx="5334000" cy="2761355"/>
+            <wp:extent cx="5753100" cy="2978319"/>
             <wp:effectExtent b="0" l="0" r="0" t="0"/>
-            <wp:docPr descr="Thiết kế giao diện Danh sách đơn hàng" title="" id="1" name="Picture"/>
+            <wp:docPr descr="Hình 24: Thiết kế giao diện Danh sách đơn hàng" title="" id="1" name="Picture"/>
             <a:graphic>
               <a:graphicData uri="http://schemas.openxmlformats.org/drawingml/2006/picture">
                 <pic:pic>
@@ -26730,7 +26703,7 @@
                   <pic:spPr bwMode="auto">
                     <a:xfrm>
                       <a:off x="0" y="0"/>
-                      <a:ext cx="5334000" cy="2761355"/>
+                      <a:ext cx="5753100" cy="2978319"/>
                     </a:xfrm>
                     <a:prstGeom prst="rect">
                       <a:avLst/>
@@ -26751,10 +26724,10 @@
     </w:p>
     <w:p>
       <w:pPr>
-        <w:pStyle w:val="ImageCaption"/>
-      </w:pPr>
-      <w:r>
-        <w:t xml:space="preserve">Thiết kế giao diện Danh sách đơn hàng</w:t>
+        <w:pStyle w:val="FigureCaption"/>
+      </w:pPr>
+      <w:r>
+        <w:t xml:space="preserve">Hình 24: Thiết kế giao diện Danh sách đơn hàng</w:t>
       </w:r>
     </w:p>
     <w:p>
@@ -26863,7 +26836,7 @@
           <wp:inline>
             <wp:extent cx="3810000" cy="2540000"/>
             <wp:effectExtent b="0" l="0" r="0" t="0"/>
-            <wp:docPr descr="Thiết kế giao diện Tài khoản" title="" id="1" name="Picture"/>
+            <wp:docPr descr="Hình 25: Thiết kế giao diện Tài khoản" title="" id="1" name="Picture"/>
             <a:graphic>
               <a:graphicData uri="http://schemas.openxmlformats.org/drawingml/2006/picture">
                 <pic:pic>
@@ -26903,10 +26876,10 @@
     </w:p>
     <w:p>
       <w:pPr>
-        <w:pStyle w:val="ImageCaption"/>
-      </w:pPr>
-      <w:r>
-        <w:t xml:space="preserve">Thiết kế giao diện Tài khoản</w:t>
+        <w:pStyle w:val="FigureCaption"/>
+      </w:pPr>
+      <w:r>
+        <w:t xml:space="preserve">Hình 25: Thiết kế giao diện Tài khoản</w:t>
       </w:r>
     </w:p>
     <w:p>
@@ -27694,9 +27667,9 @@
       <w:r>
         <w:drawing>
           <wp:inline>
-            <wp:extent cx="5334000" cy="6931664"/>
+            <wp:extent cx="5753100" cy="7476294"/>
             <wp:effectExtent b="0" l="0" r="0" t="0"/>
-            <wp:docPr descr="Mô hình ERD cơ sở dữ liệu cục bộ trên Android" title="" id="1" name="Picture"/>
+            <wp:docPr descr="Hình 26: Mô hình ERD cơ sở dữ liệu cục bộ trên Android" title="" id="1" name="Picture"/>
             <a:graphic>
               <a:graphicData uri="http://schemas.openxmlformats.org/drawingml/2006/picture">
                 <pic:pic>
@@ -27715,7 +27688,7 @@
                   <pic:spPr bwMode="auto">
                     <a:xfrm>
                       <a:off x="0" y="0"/>
-                      <a:ext cx="5334000" cy="6931664"/>
+                      <a:ext cx="5753100" cy="7476294"/>
                     </a:xfrm>
                     <a:prstGeom prst="rect">
                       <a:avLst/>
@@ -27736,10 +27709,10 @@
     </w:p>
     <w:p>
       <w:pPr>
-        <w:pStyle w:val="ImageCaption"/>
-      </w:pPr>
-      <w:r>
-        <w:t xml:space="preserve">Mô hình ERD cơ sở dữ liệu cục bộ trên Android</w:t>
+        <w:pStyle w:val="FigureCaption"/>
+      </w:pPr>
+      <w:r>
+        <w:t xml:space="preserve">Hình 26: Mô hình ERD cơ sở dữ liệu cục bộ trên Android</w:t>
       </w:r>
     </w:p>
     <w:p>
@@ -27769,9 +27742,9 @@
       <w:r>
         <w:drawing>
           <wp:inline>
-            <wp:extent cx="5334000" cy="6304471"/>
+            <wp:extent cx="5753100" cy="6799823"/>
             <wp:effectExtent b="0" l="0" r="0" t="0"/>
-            <wp:docPr descr="Sơ đồ kiến trúc MVVM" title="" id="1" name="Picture"/>
+            <wp:docPr descr="Hình 27: Sơ đồ kiến trúc MVVM" title="" id="1" name="Picture"/>
             <a:graphic>
               <a:graphicData uri="http://schemas.openxmlformats.org/drawingml/2006/picture">
                 <pic:pic>
@@ -27790,7 +27763,7 @@
                   <pic:spPr bwMode="auto">
                     <a:xfrm>
                       <a:off x="0" y="0"/>
-                      <a:ext cx="5334000" cy="6304471"/>
+                      <a:ext cx="5753100" cy="6799823"/>
                     </a:xfrm>
                     <a:prstGeom prst="rect">
                       <a:avLst/>
@@ -27811,10 +27784,10 @@
     </w:p>
     <w:p>
       <w:pPr>
-        <w:pStyle w:val="ImageCaption"/>
-      </w:pPr>
-      <w:r>
-        <w:t xml:space="preserve">Sơ đồ kiến trúc MVVM</w:t>
+        <w:pStyle w:val="FigureCaption"/>
+      </w:pPr>
+      <w:r>
+        <w:t xml:space="preserve">Hình 27: Sơ đồ kiến trúc MVVM</w:t>
       </w:r>
     </w:p>
     <w:p>
@@ -27836,7 +27809,7 @@
           <wp:inline>
             <wp:extent cx="3810000" cy="2540000"/>
             <wp:effectExtent b="0" l="0" r="0" t="0"/>
-            <wp:docPr descr="Luồng dữ liệu trong ứng dụng Mobile" title="" id="1" name="Picture"/>
+            <wp:docPr descr="Hình 28: Luồng dữ liệu trong ứng dụng Mobile" title="" id="1" name="Picture"/>
             <a:graphic>
               <a:graphicData uri="http://schemas.openxmlformats.org/drawingml/2006/picture">
                 <pic:pic>
@@ -27876,10 +27849,10 @@
     </w:p>
     <w:p>
       <w:pPr>
-        <w:pStyle w:val="ImageCaption"/>
-      </w:pPr>
-      <w:r>
-        <w:t xml:space="preserve">Luồng dữ liệu trong ứng dụng Mobile</w:t>
+        <w:pStyle w:val="FigureCaption"/>
+      </w:pPr>
+      <w:r>
+        <w:t xml:space="preserve">Hình 28: Luồng dữ liệu trong ứng dụng Mobile</w:t>
       </w:r>
     </w:p>
     <w:p>
@@ -28457,7 +28430,7 @@
           <wp:inline>
             <wp:extent cx="3810000" cy="2540000"/>
             <wp:effectExtent b="0" l="0" r="0" t="0"/>
-            <wp:docPr descr="Giao diện trang Đăng ký" title="" id="1" name="Picture"/>
+            <wp:docPr descr="Hình 29: Giao diện trang Đăng ký" title="" id="1" name="Picture"/>
             <a:graphic>
               <a:graphicData uri="http://schemas.openxmlformats.org/drawingml/2006/picture">
                 <pic:pic>
@@ -28497,10 +28470,10 @@
     </w:p>
     <w:p>
       <w:pPr>
-        <w:pStyle w:val="ImageCaption"/>
-      </w:pPr>
-      <w:r>
-        <w:t xml:space="preserve">Giao diện trang Đăng ký</w:t>
+        <w:pStyle w:val="FigureCaption"/>
+      </w:pPr>
+      <w:r>
+        <w:t xml:space="preserve">Hình 29: Giao diện trang Đăng ký</w:t>
       </w:r>
     </w:p>
     <w:p>
@@ -28574,7 +28547,7 @@
           <wp:inline>
             <wp:extent cx="3810000" cy="2540000"/>
             <wp:effectExtent b="0" l="0" r="0" t="0"/>
-            <wp:docPr descr="Giao diện trang Đăng nhập" title="" id="1" name="Picture"/>
+            <wp:docPr descr="Hình 30: Giao diện trang Đăng nhập" title="" id="1" name="Picture"/>
             <a:graphic>
               <a:graphicData uri="http://schemas.openxmlformats.org/drawingml/2006/picture">
                 <pic:pic>
@@ -28614,10 +28587,10 @@
     </w:p>
     <w:p>
       <w:pPr>
-        <w:pStyle w:val="ImageCaption"/>
-      </w:pPr>
-      <w:r>
-        <w:t xml:space="preserve">Giao diện trang Đăng nhập</w:t>
+        <w:pStyle w:val="FigureCaption"/>
+      </w:pPr>
+      <w:r>
+        <w:t xml:space="preserve">Hình 30: Giao diện trang Đăng nhập</w:t>
       </w:r>
     </w:p>
     <w:p>
@@ -28710,9 +28683,9 @@
       <w:r>
         <w:drawing>
           <wp:inline>
-            <wp:extent cx="5334000" cy="2765207"/>
+            <wp:extent cx="5753100" cy="2982473"/>
             <wp:effectExtent b="0" l="0" r="0" t="0"/>
-            <wp:docPr descr="Giao diện Trang chủ" title="" id="1" name="Picture"/>
+            <wp:docPr descr="Hình 31: Giao diện Trang chủ" title="" id="1" name="Picture"/>
             <a:graphic>
               <a:graphicData uri="http://schemas.openxmlformats.org/drawingml/2006/picture">
                 <pic:pic>
@@ -28731,7 +28704,7 @@
                   <pic:spPr bwMode="auto">
                     <a:xfrm>
                       <a:off x="0" y="0"/>
-                      <a:ext cx="5334000" cy="2765207"/>
+                      <a:ext cx="5753100" cy="2982473"/>
                     </a:xfrm>
                     <a:prstGeom prst="rect">
                       <a:avLst/>
@@ -28752,10 +28725,10 @@
     </w:p>
     <w:p>
       <w:pPr>
-        <w:pStyle w:val="ImageCaption"/>
-      </w:pPr>
-      <w:r>
-        <w:t xml:space="preserve">Giao diện Trang chủ</w:t>
+        <w:pStyle w:val="FigureCaption"/>
+      </w:pPr>
+      <w:r>
+        <w:t xml:space="preserve">Hình 31: Giao diện Trang chủ</w:t>
       </w:r>
     </w:p>
     <w:p>
@@ -28867,9 +28840,9 @@
       <w:r>
         <w:drawing>
           <wp:inline>
-            <wp:extent cx="5334000" cy="2765207"/>
+            <wp:extent cx="5753100" cy="2982473"/>
             <wp:effectExtent b="0" l="0" r="0" t="0"/>
-            <wp:docPr descr="Giao diện Chi tiết sản phẩm" title="" id="1" name="Picture"/>
+            <wp:docPr descr="Hình 32: Giao diện Chi tiết sản phẩm" title="" id="1" name="Picture"/>
             <a:graphic>
               <a:graphicData uri="http://schemas.openxmlformats.org/drawingml/2006/picture">
                 <pic:pic>
@@ -28888,7 +28861,7 @@
                   <pic:spPr bwMode="auto">
                     <a:xfrm>
                       <a:off x="0" y="0"/>
-                      <a:ext cx="5334000" cy="2765207"/>
+                      <a:ext cx="5753100" cy="2982473"/>
                     </a:xfrm>
                     <a:prstGeom prst="rect">
                       <a:avLst/>
@@ -28909,10 +28882,10 @@
     </w:p>
     <w:p>
       <w:pPr>
-        <w:pStyle w:val="ImageCaption"/>
-      </w:pPr>
-      <w:r>
-        <w:t xml:space="preserve">Giao diện Chi tiết sản phẩm</w:t>
+        <w:pStyle w:val="FigureCaption"/>
+      </w:pPr>
+      <w:r>
+        <w:t xml:space="preserve">Hình 32: Giao diện Chi tiết sản phẩm</w:t>
       </w:r>
     </w:p>
     <w:p>
@@ -28929,7 +28902,7 @@
           <w:ilvl w:val="0"/>
           <w:numId w:val="1101"/>
         </w:numPr>
-        <w:pStyle w:val="Compact"/>
+        <w:pStyle w:val="FigureCaption"/>
       </w:pPr>
       <w:r>
         <w:rPr>
@@ -29119,9 +29092,9 @@
       <w:r>
         <w:drawing>
           <wp:inline>
-            <wp:extent cx="5334000" cy="2765207"/>
+            <wp:extent cx="5753100" cy="2982473"/>
             <wp:effectExtent b="0" l="0" r="0" t="0"/>
-            <wp:docPr descr="Giao diện Tìm kiếm sản phẩm" title="" id="1" name="Picture"/>
+            <wp:docPr descr="Hình 33: Giao diện Tìm kiếm sản phẩm" title="" id="1" name="Picture"/>
             <a:graphic>
               <a:graphicData uri="http://schemas.openxmlformats.org/drawingml/2006/picture">
                 <pic:pic>
@@ -29140,7 +29113,7 @@
                   <pic:spPr bwMode="auto">
                     <a:xfrm>
                       <a:off x="0" y="0"/>
-                      <a:ext cx="5334000" cy="2765207"/>
+                      <a:ext cx="5753100" cy="2982473"/>
                     </a:xfrm>
                     <a:prstGeom prst="rect">
                       <a:avLst/>
@@ -29161,10 +29134,10 @@
     </w:p>
     <w:p>
       <w:pPr>
-        <w:pStyle w:val="ImageCaption"/>
-      </w:pPr>
-      <w:r>
-        <w:t xml:space="preserve">Giao diện Tìm kiếm sản phẩm</w:t>
+        <w:pStyle w:val="FigureCaption"/>
+      </w:pPr>
+      <w:r>
+        <w:t xml:space="preserve">Hình 33: Giao diện Tìm kiếm sản phẩm</w:t>
       </w:r>
     </w:p>
     <w:p>
@@ -29258,9 +29231,9 @@
       <w:r>
         <w:drawing>
           <wp:inline>
-            <wp:extent cx="5334000" cy="2765207"/>
+            <wp:extent cx="5753100" cy="2982473"/>
             <wp:effectExtent b="0" l="0" r="0" t="0"/>
-            <wp:docPr descr="Giao diện Giỏ hàng" title="" id="1" name="Picture"/>
+            <wp:docPr descr="Hình 34: Giao diện Giỏ hàng" title="" id="1" name="Picture"/>
             <a:graphic>
               <a:graphicData uri="http://schemas.openxmlformats.org/drawingml/2006/picture">
                 <pic:pic>
@@ -29279,7 +29252,7 @@
                   <pic:spPr bwMode="auto">
                     <a:xfrm>
                       <a:off x="0" y="0"/>
-                      <a:ext cx="5334000" cy="2765207"/>
+                      <a:ext cx="5753100" cy="2982473"/>
                     </a:xfrm>
                     <a:prstGeom prst="rect">
                       <a:avLst/>
@@ -29300,10 +29273,10 @@
     </w:p>
     <w:p>
       <w:pPr>
-        <w:pStyle w:val="ImageCaption"/>
-      </w:pPr>
-      <w:r>
-        <w:t xml:space="preserve">Giao diện Giỏ hàng</w:t>
+        <w:pStyle w:val="FigureCaption"/>
+      </w:pPr>
+      <w:r>
+        <w:t xml:space="preserve">Hình 34: Giao diện Giỏ hàng</w:t>
       </w:r>
     </w:p>
     <w:p>
@@ -29414,9 +29387,9 @@
       <w:r>
         <w:drawing>
           <wp:inline>
-            <wp:extent cx="5334000" cy="2761355"/>
+            <wp:extent cx="5753100" cy="2978319"/>
             <wp:effectExtent b="0" l="0" r="0" t="0"/>
-            <wp:docPr descr="Giao diện Checkout" title="" id="1" name="Picture"/>
+            <wp:docPr descr="Hình 35: Giao diện Checkout" title="" id="1" name="Picture"/>
             <a:graphic>
               <a:graphicData uri="http://schemas.openxmlformats.org/drawingml/2006/picture">
                 <pic:pic>
@@ -29435,7 +29408,7 @@
                   <pic:spPr bwMode="auto">
                     <a:xfrm>
                       <a:off x="0" y="0"/>
-                      <a:ext cx="5334000" cy="2761355"/>
+                      <a:ext cx="5753100" cy="2978319"/>
                     </a:xfrm>
                     <a:prstGeom prst="rect">
                       <a:avLst/>
@@ -29456,10 +29429,10 @@
     </w:p>
     <w:p>
       <w:pPr>
-        <w:pStyle w:val="ImageCaption"/>
-      </w:pPr>
-      <w:r>
-        <w:t xml:space="preserve">Giao diện Checkout</w:t>
+        <w:pStyle w:val="FigureCaption"/>
+      </w:pPr>
+      <w:r>
+        <w:t xml:space="preserve">Hình 35: Giao diện Checkout</w:t>
       </w:r>
     </w:p>
     <w:p>
@@ -29573,9 +29546,9 @@
       <w:r>
         <w:drawing>
           <wp:inline>
-            <wp:extent cx="5334000" cy="2761355"/>
+            <wp:extent cx="5753100" cy="2978319"/>
             <wp:effectExtent b="0" l="0" r="0" t="0"/>
-            <wp:docPr descr="Giao diện Thanh toán VNPay" title="" id="1" name="Picture"/>
+            <wp:docPr descr="Hình 36: Giao diện Thanh toán VNPay" title="" id="1" name="Picture"/>
             <a:graphic>
               <a:graphicData uri="http://schemas.openxmlformats.org/drawingml/2006/picture">
                 <pic:pic>
@@ -29594,7 +29567,7 @@
                   <pic:spPr bwMode="auto">
                     <a:xfrm>
                       <a:off x="0" y="0"/>
-                      <a:ext cx="5334000" cy="2761355"/>
+                      <a:ext cx="5753100" cy="2978319"/>
                     </a:xfrm>
                     <a:prstGeom prst="rect">
                       <a:avLst/>
@@ -29615,10 +29588,10 @@
     </w:p>
     <w:p>
       <w:pPr>
-        <w:pStyle w:val="ImageCaption"/>
-      </w:pPr>
-      <w:r>
-        <w:t xml:space="preserve">Giao diện Thanh toán VNPay</w:t>
+        <w:pStyle w:val="FigureCaption"/>
+      </w:pPr>
+      <w:r>
+        <w:t xml:space="preserve">Hình 36: Giao diện Thanh toán VNPay</w:t>
       </w:r>
     </w:p>
     <w:p>
@@ -29706,9 +29679,9 @@
       <w:r>
         <w:drawing>
           <wp:inline>
-            <wp:extent cx="5334000" cy="2761355"/>
+            <wp:extent cx="5753100" cy="2978319"/>
             <wp:effectExtent b="0" l="0" r="0" t="0"/>
-            <wp:docPr descr="Giao diện Đặt hàng thành công" title="" id="1" name="Picture"/>
+            <wp:docPr descr="Hình 37: Giao diện Đặt hàng thành công" title="" id="1" name="Picture"/>
             <a:graphic>
               <a:graphicData uri="http://schemas.openxmlformats.org/drawingml/2006/picture">
                 <pic:pic>
@@ -29727,7 +29700,7 @@
                   <pic:spPr bwMode="auto">
                     <a:xfrm>
                       <a:off x="0" y="0"/>
-                      <a:ext cx="5334000" cy="2761355"/>
+                      <a:ext cx="5753100" cy="2978319"/>
                     </a:xfrm>
                     <a:prstGeom prst="rect">
                       <a:avLst/>
@@ -29748,10 +29721,10 @@
     </w:p>
     <w:p>
       <w:pPr>
-        <w:pStyle w:val="ImageCaption"/>
-      </w:pPr>
-      <w:r>
-        <w:t xml:space="preserve">Giao diện Đặt hàng thành công</w:t>
+        <w:pStyle w:val="FigureCaption"/>
+      </w:pPr>
+      <w:r>
+        <w:t xml:space="preserve">Hình 37: Giao diện Đặt hàng thành công</w:t>
       </w:r>
     </w:p>
     <w:p>
@@ -29890,9 +29863,9 @@
       <w:r>
         <w:drawing>
           <wp:inline>
-            <wp:extent cx="5334000" cy="2761355"/>
+            <wp:extent cx="5753100" cy="2978319"/>
             <wp:effectExtent b="0" l="0" r="0" t="0"/>
-            <wp:docPr descr="Giao diện Danh sách đơn hàng" title="" id="1" name="Picture"/>
+            <wp:docPr descr="Hình 38: Giao diện Danh sách đơn hàng" title="" id="1" name="Picture"/>
             <a:graphic>
               <a:graphicData uri="http://schemas.openxmlformats.org/drawingml/2006/picture">
                 <pic:pic>
@@ -29911,7 +29884,7 @@
                   <pic:spPr bwMode="auto">
                     <a:xfrm>
                       <a:off x="0" y="0"/>
-                      <a:ext cx="5334000" cy="2761355"/>
+                      <a:ext cx="5753100" cy="2978319"/>
                     </a:xfrm>
                     <a:prstGeom prst="rect">
                       <a:avLst/>
@@ -29932,10 +29905,10 @@
     </w:p>
     <w:p>
       <w:pPr>
-        <w:pStyle w:val="ImageCaption"/>
-      </w:pPr>
-      <w:r>
-        <w:t xml:space="preserve">Giao diện Danh sách đơn hàng</w:t>
+        <w:pStyle w:val="FigureCaption"/>
+      </w:pPr>
+      <w:r>
+        <w:t xml:space="preserve">Hình 38: Giao diện Danh sách đơn hàng</w:t>
       </w:r>
     </w:p>
     <w:p>
@@ -30071,9 +30044,9 @@
       <w:r>
         <w:drawing>
           <wp:inline>
-            <wp:extent cx="5334000" cy="2761355"/>
+            <wp:extent cx="5753100" cy="2978319"/>
             <wp:effectExtent b="0" l="0" r="0" t="0"/>
-            <wp:docPr descr="Giao diện Chi tiết đơn hàng" title="" id="1" name="Picture"/>
+            <wp:docPr descr="Hình 39: Giao diện Chi tiết đơn hàng" title="" id="1" name="Picture"/>
             <a:graphic>
               <a:graphicData uri="http://schemas.openxmlformats.org/drawingml/2006/picture">
                 <pic:pic>
@@ -30092,7 +30065,7 @@
                   <pic:spPr bwMode="auto">
                     <a:xfrm>
                       <a:off x="0" y="0"/>
-                      <a:ext cx="5334000" cy="2761355"/>
+                      <a:ext cx="5753100" cy="2978319"/>
                     </a:xfrm>
                     <a:prstGeom prst="rect">
                       <a:avLst/>
@@ -30113,10 +30086,10 @@
     </w:p>
     <w:p>
       <w:pPr>
-        <w:pStyle w:val="ImageCaption"/>
-      </w:pPr>
-      <w:r>
-        <w:t xml:space="preserve">Giao diện Chi tiết đơn hàng</w:t>
+        <w:pStyle w:val="FigureCaption"/>
+      </w:pPr>
+      <w:r>
+        <w:t xml:space="preserve">Hình 39: Giao diện Chi tiết đơn hàng</w:t>
       </w:r>
     </w:p>
     <w:p>
@@ -30218,7 +30191,7 @@
           <wp:inline>
             <wp:extent cx="3810000" cy="2540000"/>
             <wp:effectExtent b="0" l="0" r="0" t="0"/>
-            <wp:docPr descr="Giao diện Quản lý tài khoản" title="" id="1" name="Picture"/>
+            <wp:docPr descr="Hình 40: Giao diện Quản lý tài khoản" title="" id="1" name="Picture"/>
             <a:graphic>
               <a:graphicData uri="http://schemas.openxmlformats.org/drawingml/2006/picture">
                 <pic:pic>
@@ -30258,10 +30231,10 @@
     </w:p>
     <w:p>
       <w:pPr>
-        <w:pStyle w:val="ImageCaption"/>
-      </w:pPr>
-      <w:r>
-        <w:t xml:space="preserve">Giao diện Quản lý tài khoản</w:t>
+        <w:pStyle w:val="FigureCaption"/>
+      </w:pPr>
+      <w:r>
+        <w:t xml:space="preserve">Hình 40: Giao diện Quản lý tài khoản</w:t>
       </w:r>
     </w:p>
     <w:p>
@@ -31563,7 +31536,7 @@
         <w:pStyle w:val="TableCaption"/>
       </w:pPr>
       <w:r>
-        <w:t xml:space="preserve">Test cases cho User Service</w:t>
+        <w:t xml:space="preserve">Bảng 19: Test cases cho User Service</w:t>
       </w:r>
     </w:p>
     <w:tbl>
@@ -31571,7 +31544,7 @@
         <w:tblStyle w:val="Table"/>
         <w:tblW w:type="pct" w:w="0.0"/>
         <w:tblLook w:firstRow="1"/>
-        <w:tblCaption w:val="Test cases cho User Service"/>
+        <w:tblCaption w:val="Bảng 19: Test cases cho User Service"/>
       </w:tblPr>
       <w:tblGrid/>
       <w:tr>
@@ -32251,7 +32224,7 @@
         <w:pStyle w:val="TableCaption"/>
       </w:pPr>
       <w:r>
-        <w:t xml:space="preserve">Test cases cho Product Service</w:t>
+        <w:t xml:space="preserve">Bảng 20: Test cases cho Product Service</w:t>
       </w:r>
     </w:p>
     <w:tbl>
@@ -32259,7 +32232,7 @@
         <w:tblStyle w:val="Table"/>
         <w:tblW w:type="pct" w:w="0.0"/>
         <w:tblLook w:firstRow="1"/>
-        <w:tblCaption w:val="Test cases cho Product Service"/>
+        <w:tblCaption w:val="Bảng 20: Test cases cho Product Service"/>
       </w:tblPr>
       <w:tblGrid/>
       <w:tr>
@@ -32939,7 +32912,7 @@
         <w:pStyle w:val="TableCaption"/>
       </w:pPr>
       <w:r>
-        <w:t xml:space="preserve">Test cases cho Order Service</w:t>
+        <w:t xml:space="preserve">Bảng 21: Test cases cho Order Service</w:t>
       </w:r>
     </w:p>
     <w:tbl>
@@ -32947,7 +32920,7 @@
         <w:tblStyle w:val="Table"/>
         <w:tblW w:type="pct" w:w="0.0"/>
         <w:tblLook w:firstRow="1"/>
-        <w:tblCaption w:val="Test cases cho Order Service"/>
+        <w:tblCaption w:val="Bảng 21: Test cases cho Order Service"/>
       </w:tblPr>
       <w:tblGrid/>
       <w:tr>
@@ -33627,7 +33600,7 @@
         <w:pStyle w:val="TableCaption"/>
       </w:pPr>
       <w:r>
-        <w:t xml:space="preserve">Test cases cho Admin Service</w:t>
+        <w:t xml:space="preserve">Bảng 22: Test cases cho Admin Service</w:t>
       </w:r>
     </w:p>
     <w:tbl>
@@ -33635,7 +33608,7 @@
         <w:tblStyle w:val="Table"/>
         <w:tblW w:type="pct" w:w="0.0"/>
         <w:tblLook w:firstRow="1"/>
-        <w:tblCaption w:val="Test cases cho Admin Service"/>
+        <w:tblCaption w:val="Bảng 22: Test cases cho Admin Service"/>
       </w:tblPr>
       <w:tblGrid/>
       <w:tr>
@@ -34406,9 +34379,9 @@
       <w:r>
         <w:drawing>
           <wp:inline>
-            <wp:extent cx="5334000" cy="2745950"/>
+            <wp:extent cx="5753100" cy="2961704"/>
             <wp:effectExtent b="0" l="0" r="0" t="0"/>
-            <wp:docPr descr="Kết quả benchmark không sử dụng cache" title="" id="1" name="Picture"/>
+            <wp:docPr descr="Hình 41: Kết quả benchmark không sử dụng cache" title="" id="1" name="Picture"/>
             <a:graphic>
               <a:graphicData uri="http://schemas.openxmlformats.org/drawingml/2006/picture">
                 <pic:pic>
@@ -34427,7 +34400,7 @@
                   <pic:spPr bwMode="auto">
                     <a:xfrm>
                       <a:off x="0" y="0"/>
-                      <a:ext cx="5334000" cy="2745950"/>
+                      <a:ext cx="5753100" cy="2961704"/>
                     </a:xfrm>
                     <a:prstGeom prst="rect">
                       <a:avLst/>
@@ -34448,10 +34421,10 @@
     </w:p>
     <w:p>
       <w:pPr>
-        <w:pStyle w:val="ImageCaption"/>
-      </w:pPr>
-      <w:r>
-        <w:t xml:space="preserve">Kết quả benchmark không sử dụng cache</w:t>
+        <w:pStyle w:val="FigureCaption"/>
+      </w:pPr>
+      <w:r>
+        <w:t xml:space="preserve">Hình 41: Kết quả benchmark không sử dụng cache</w:t>
       </w:r>
     </w:p>
     <w:p>
@@ -34474,7 +34447,7 @@
           <wp:inline>
             <wp:extent cx="3810000" cy="2540000"/>
             <wp:effectExtent b="0" l="0" r="0" t="0"/>
-            <wp:docPr descr="Kết quả benchmark với Redis cache" title="" id="1" name="Picture"/>
+            <wp:docPr descr="Hình 42: Kết quả benchmark với Redis cache" title="" id="1" name="Picture"/>
             <a:graphic>
               <a:graphicData uri="http://schemas.openxmlformats.org/drawingml/2006/picture">
                 <pic:pic>
@@ -34514,10 +34487,10 @@
     </w:p>
     <w:p>
       <w:pPr>
-        <w:pStyle w:val="ImageCaption"/>
-      </w:pPr>
-      <w:r>
-        <w:t xml:space="preserve">Kết quả benchmark với Redis cache</w:t>
+        <w:pStyle w:val="FigureCaption"/>
+      </w:pPr>
+      <w:r>
+        <w:t xml:space="preserve">Hình 42: Kết quả benchmark với Redis cache</w:t>
       </w:r>
     </w:p>
     <w:p>
@@ -34546,7 +34519,7 @@
         <w:pStyle w:val="TableCaption"/>
       </w:pPr>
       <w:r>
-        <w:t xml:space="preserve">So sánh thời gian phản hồi</w:t>
+        <w:t xml:space="preserve">Bảng 23: So sánh thời gian phản hồi</w:t>
       </w:r>
     </w:p>
     <w:tbl>
@@ -34554,7 +34527,7 @@
         <w:tblStyle w:val="Table"/>
         <w:tblW w:type="pct" w:w="0.0"/>
         <w:tblLook w:firstRow="1"/>
-        <w:tblCaption w:val="So sánh thời gian phản hồi"/>
+        <w:tblCaption w:val="Bảng 23: So sánh thời gian phản hồi"/>
       </w:tblPr>
       <w:tblGrid/>
       <w:tr>
@@ -34927,16 +34900,7 @@
         <w:pStyle w:val="BodyText"/>
       </w:pPr>
       <w:r>
-        <w:t xml:space="preserve">Như thể hiện trong</w:t>
-      </w:r>
-      <w:r>
-        <w:t xml:space="preserve"> </w:t>
-      </w:r>
-      <w:r>
-        <w:t xml:space="preserve">@tbl:response-time</w:t>
-      </w:r>
-      <w:r>
-        <w:t xml:space="preserve">, Redis cache giúp giảm đáng kể thời gian phản hồi ở mọi percentile. Đặc biệt, percentile 95 giảm từ 172.88ms xuống 19.11ms — cải thiện gấp</w:t>
+        <w:t xml:space="preserve">Như thể hiện trong Bảng, Redis cache giúp giảm đáng kể thời gian phản hồi ở mọi percentile. Đặc biệt, percentile 95 giảm từ 172.88ms xuống 19.11ms — cải thiện gấp</w:t>
       </w:r>
       <w:r>
         <w:t xml:space="preserve"> </w:t>
@@ -34967,7 +34931,7 @@
         <w:pStyle w:val="TableCaption"/>
       </w:pPr>
       <w:r>
-        <w:t xml:space="preserve">So sánh throughput</w:t>
+        <w:t xml:space="preserve">Bảng 24: So sánh throughput</w:t>
       </w:r>
     </w:p>
     <w:tbl>
@@ -34975,7 +34939,7 @@
         <w:tblStyle w:val="Table"/>
         <w:tblW w:type="pct" w:w="0.0"/>
         <w:tblLook w:firstRow="1"/>
-        <w:tblCaption w:val="So sánh throughput"/>
+        <w:tblCaption w:val="Bảng 24: So sánh throughput"/>
       </w:tblPr>
       <w:tblGrid/>
       <w:tr>
@@ -35223,7 +35187,7 @@
         <w:pStyle w:val="TableCaption"/>
       </w:pPr>
       <w:r>
-        <w:t xml:space="preserve">So sánh tỷ lệ lỗi</w:t>
+        <w:t xml:space="preserve">Bảng 25: So sánh tỷ lệ lỗi</w:t>
       </w:r>
     </w:p>
     <w:tbl>
@@ -35231,7 +35195,7 @@
         <w:tblStyle w:val="Table"/>
         <w:tblW w:type="pct" w:w="0.0"/>
         <w:tblLook w:firstRow="1"/>
-        <w:tblCaption w:val="So sánh tỷ lệ lỗi"/>
+        <w:tblCaption w:val="Bảng 25: So sánh tỷ lệ lỗi"/>
       </w:tblPr>
       <w:tblGrid/>
       <w:tr>
@@ -37048,7 +37012,7 @@
         <w:pStyle w:val="TableCaption"/>
       </w:pPr>
       <w:r>
-        <w:t xml:space="preserve">Bảng phân công công việc</w:t>
+        <w:t xml:space="preserve">Bảng 26: Bảng phân công công việc</w:t>
       </w:r>
     </w:p>
     <w:tbl>
@@ -37056,7 +37020,7 @@
         <w:tblStyle w:val="Table"/>
         <w:tblW w:type="pct" w:w="5000.0"/>
         <w:tblLook w:firstRow="1"/>
-        <w:tblCaption w:val="Bảng phân công công việc"/>
+        <w:tblCaption w:val="Bảng 26: Bảng phân công công việc"/>
       </w:tblPr>
       <w:tblGrid>
         <w:gridCol w:w="2640"/>
@@ -37240,7 +37204,7 @@
         <w:pStyle w:val="TableCaption"/>
       </w:pPr>
       <w:r>
-        <w:t xml:space="preserve">Danh sách đầy đủ API endpoints</w:t>
+        <w:t xml:space="preserve">Bảng 27: Danh sách đầy đủ API endpoints</w:t>
       </w:r>
     </w:p>
     <w:tbl>
@@ -37248,7 +37212,7 @@
         <w:tblStyle w:val="Table"/>
         <w:tblW w:type="pct" w:w="0.0"/>
         <w:tblLook w:firstRow="1"/>
-        <w:tblCaption w:val="Danh sách đầy đủ API endpoints"/>
+        <w:tblCaption w:val="Bảng 27: Danh sách đầy đủ API endpoints"/>
       </w:tblPr>
       <w:tblGrid/>
       <w:tr>
@@ -40881,7 +40845,13 @@
         <w:t xml:space="preserve"> system prune -f</w:t>
       </w:r>
     </w:p>
-    <w:sectPr/>
+    <w:sectPr>
+      <w:footerReference w:type="default" r:id="rId9"/>
+      <w:pgSz w:w="11906" w:h="16838" w:code="9"/>
+      <w:pgMar w:top="1699" w:right="1418" w:bottom="1701" w:left="1418" w:header="720" w:footer="720" w:gutter="0"/>
+      <w:cols w:space="720"/>
+      <w:docGrid w:linePitch="360"/>
+    </w:sectPr>
   </w:body>
 </w:document>
 </file>
@@ -40890,6 +40860,59 @@
 <w:comments xmlns:w="http://schemas.openxmlformats.org/wordprocessingml/2006/main" xmlns:m="http://schemas.openxmlformats.org/officeDocument/2006/math" xmlns:r="http://schemas.openxmlformats.org/officeDocument/2006/relationships" xmlns:o="urn:schemas-microsoft-com:office:office" xmlns:v="urn:schemas-microsoft-com:vml" xmlns:w10="urn:schemas-microsoft-com:office:word" xmlns:a="http://schemas.openxmlformats.org/drawingml/2006/main" xmlns:pic="http://schemas.openxmlformats.org/drawingml/2006/picture" xmlns:wp="http://schemas.openxmlformats.org/drawingml/2006/wordprocessingDrawing"/>
 </file>
 
+<file path=word/footer1.xml><?xml version="1.0" encoding="utf-8"?>
+<w:ftr xmlns:wpc="http://schemas.microsoft.com/office/word/2010/wordprocessingCanvas" xmlns:cx="http://schemas.microsoft.com/office/drawing/2014/chartex" xmlns:cx1="http://schemas.microsoft.com/office/drawing/2015/9/8/chartex" xmlns:cx2="http://schemas.microsoft.com/office/drawing/2015/10/21/chartex" xmlns:cx3="http://schemas.microsoft.com/office/drawing/2016/5/9/chartex" xmlns:cx4="http://schemas.microsoft.com/office/drawing/2016/5/10/chartex" xmlns:cx5="http://schemas.microsoft.com/office/drawing/2016/5/11/chartex" xmlns:cx6="http://schemas.microsoft.com/office/drawing/2016/5/12/chartex" xmlns:cx7="http://schemas.microsoft.com/office/drawing/2016/5/13/chartex" xmlns:cx8="http://schemas.microsoft.com/office/drawing/2016/5/14/chartex" xmlns:mc="http://schemas.openxmlformats.org/markup-compatibility/2006" xmlns:aink="http://schemas.microsoft.com/office/drawing/2016/ink" xmlns:am3d="http://schemas.microsoft.com/office/drawing/2017/model3d" xmlns:o="urn:schemas-microsoft-com:office:office" xmlns:oel="http://schemas.microsoft.com/office/2019/extlst" xmlns:r="http://schemas.openxmlformats.org/officeDocument/2006/relationships" xmlns:m="http://schemas.openxmlformats.org/officeDocument/2006/math" xmlns:v="urn:schemas-microsoft-com:vml" xmlns:wp14="http://schemas.microsoft.com/office/word/2010/wordprocessingDrawing" xmlns:wp="http://schemas.openxmlformats.org/drawingml/2006/wordprocessingDrawing" xmlns:w10="urn:schemas-microsoft-com:office:word" xmlns:w="http://schemas.openxmlformats.org/wordprocessingml/2006/main" xmlns:w14="http://schemas.microsoft.com/office/word/2010/wordml" xmlns:w15="http://schemas.microsoft.com/office/word/2012/wordml" xmlns:w16cex="http://schemas.microsoft.com/office/word/2018/wordml/cex" xmlns:w16cid="http://schemas.microsoft.com/office/word/2016/wordml/cid" xmlns:w16="http://schemas.microsoft.com/office/word/2018/wordml" xmlns:w16sdtdh="http://schemas.microsoft.com/office/word/2020/wordml/sdtdatahash" xmlns:w16se="http://schemas.microsoft.com/office/word/2015/wordml/symex" xmlns:wpg="http://schemas.microsoft.com/office/word/2010/wordprocessingGroup" xmlns:wpi="http://schemas.microsoft.com/office/word/2010/wordprocessingInk" xmlns:wne="http://schemas.microsoft.com/office/word/2006/wordml" xmlns:wps="http://schemas.microsoft.com/office/word/2010/wordprocessingShape" mc:Ignorable="w14 w15 w16se w16cid w16 w16cex w16sdtdh wp14">
+  <w:sdt>
+    <w:sdtPr>
+      <w:id w:val="2107460505"/>
+      <w:docPartObj>
+        <w:docPartGallery w:val="Page Numbers (Bottom of Page)"/>
+        <w:docPartUnique/>
+      </w:docPartObj>
+    </w:sdtPr>
+    <w:sdtEndPr>
+      <w:rPr>
+        <w:noProof/>
+      </w:rPr>
+    </w:sdtEndPr>
+    <w:sdtContent>
+      <w:p>
+        <w:pPr>
+          <w:pStyle w:val="Footer"/>
+          <w:jc w:val="center"/>
+        </w:pPr>
+        <w:r>
+          <w:fldChar w:fldCharType="begin"/>
+        </w:r>
+        <w:r>
+          <w:instrText xml:space="preserve"> PAGE   \* MERGEFORMAT </w:instrText>
+        </w:r>
+        <w:r>
+          <w:fldChar w:fldCharType="separate"/>
+        </w:r>
+        <w:r>
+          <w:rPr>
+            <w:noProof/>
+          </w:rPr>
+          <w:t>2</w:t>
+        </w:r>
+        <w:r>
+          <w:rPr>
+            <w:noProof/>
+          </w:rPr>
+          <w:fldChar w:fldCharType="end"/>
+        </w:r>
+      </w:p>
+    </w:sdtContent>
+  </w:sdt>
+  <w:p>
+    <w:pPr>
+      <w:pStyle w:val="Footer"/>
+    </w:pPr>
+  </w:p>
+</w:ftr>
+</file>
+
 <file path=word/footnotes.xml><?xml version="1.0" encoding="utf-8"?>
 <w:footnotes xmlns:w="http://schemas.openxmlformats.org/wordprocessingml/2006/main" xmlns:m="http://schemas.openxmlformats.org/officeDocument/2006/math" xmlns:r="http://schemas.openxmlformats.org/officeDocument/2006/relationships" xmlns:o="urn:schemas-microsoft-com:office:office" xmlns:v="urn:schemas-microsoft-com:vml" xmlns:w10="urn:schemas-microsoft-com:office:word" xmlns:a="http://schemas.openxmlformats.org/drawingml/2006/main" xmlns:pic="http://schemas.openxmlformats.org/drawingml/2006/picture" xmlns:wp="http://schemas.openxmlformats.org/drawingml/2006/wordprocessingDrawing">
   <w:footnote w:type="continuationSeparator" w:id="0">
@@ -40910,7 +40933,217 @@
 </file>
 
 <file path=word/numbering.xml><?xml version="1.0" encoding="utf-8"?>
-<w:numbering xmlns:w="http://schemas.openxmlformats.org/wordprocessingml/2006/main">
+<w:numbering xmlns:wpc="http://schemas.microsoft.com/office/word/2010/wordprocessingCanvas" xmlns:cx="http://schemas.microsoft.com/office/drawing/2014/chartex" xmlns:cx1="http://schemas.microsoft.com/office/drawing/2015/9/8/chartex" xmlns:cx2="http://schemas.microsoft.com/office/drawing/2015/10/21/chartex" xmlns:cx3="http://schemas.microsoft.com/office/drawing/2016/5/9/chartex" xmlns:cx4="http://schemas.microsoft.com/office/drawing/2016/5/10/chartex" xmlns:cx5="http://schemas.microsoft.com/office/drawing/2016/5/11/chartex" xmlns:cx6="http://schemas.microsoft.com/office/drawing/2016/5/12/chartex" xmlns:cx7="http://schemas.microsoft.com/office/drawing/2016/5/13/chartex" xmlns:cx8="http://schemas.microsoft.com/office/drawing/2016/5/14/chartex" xmlns:mc="http://schemas.openxmlformats.org/markup-compatibility/2006" xmlns:aink="http://schemas.microsoft.com/office/drawing/2016/ink" xmlns:am3d="http://schemas.microsoft.com/office/drawing/2017/model3d" xmlns:o="urn:schemas-microsoft-com:office:office" xmlns:oel="http://schemas.microsoft.com/office/2019/extlst" xmlns:r="http://schemas.openxmlformats.org/officeDocument/2006/relationships" xmlns:m="http://schemas.openxmlformats.org/officeDocument/2006/math" xmlns:v="urn:schemas-microsoft-com:vml" xmlns:wp14="http://schemas.microsoft.com/office/word/2010/wordprocessingDrawing" xmlns:wp="http://schemas.openxmlformats.org/drawingml/2006/wordprocessingDrawing" xmlns:w10="urn:schemas-microsoft-com:office:word" xmlns:w="http://schemas.openxmlformats.org/wordprocessingml/2006/main" xmlns:w14="http://schemas.microsoft.com/office/word/2010/wordml" xmlns:w15="http://schemas.microsoft.com/office/word/2012/wordml" xmlns:w16cex="http://schemas.microsoft.com/office/word/2018/wordml/cex" xmlns:w16cid="http://schemas.microsoft.com/office/word/2016/wordml/cid" xmlns:w16="http://schemas.microsoft.com/office/word/2018/wordml" xmlns:w16sdtdh="http://schemas.microsoft.com/office/word/2020/wordml/sdtdatahash" xmlns:w16se="http://schemas.microsoft.com/office/word/2015/wordml/symex" xmlns:wpg="http://schemas.microsoft.com/office/word/2010/wordprocessingGroup" xmlns:wpi="http://schemas.microsoft.com/office/word/2010/wordprocessingInk" xmlns:wne="http://schemas.microsoft.com/office/word/2006/wordml" xmlns:wps="http://schemas.microsoft.com/office/word/2010/wordprocessingShape" mc:Ignorable="w14 w15 w16se w16cid w16 w16cex w16sdtdh wp14">
+  <w:abstractNum w:abstractNumId="0" w15:restartNumberingAfterBreak="0">
+    <w:nsid w:val="06D663C7"/>
+    <w:multiLevelType w:val="multilevel"/>
+    <w:tmpl w:val="3A7CF794"/>
+    <w:lvl w:ilvl="0">
+      <w:start w:val="1"/>
+      <w:numFmt w:val="decimal"/>
+      <w:pStyle w:val="Heading1"/>
+      <w:lvlText w:val="CHƯƠNG %1:"/>
+      <w:lvlJc w:val="left"/>
+      <w:pPr>
+        <w:ind w:left="567" w:hanging="567"/>
+      </w:pPr>
+      <w:rPr>
+        <w:rFonts w:ascii="Times New Roman" w:hAnsi="Times New Roman" w:hint="default"/>
+        <w:b/>
+        <w:i w:val="0"/>
+        <w:color w:val="auto"/>
+        <w:sz w:val="32"/>
+      </w:rPr>
+    </w:lvl>
+    <w:lvl w:ilvl="1">
+      <w:start w:val="1"/>
+      <w:numFmt w:val="decimal"/>
+      <w:pStyle w:val="Heading2"/>
+      <w:lvlText w:val="%1.%2"/>
+      <w:lvlJc w:val="left"/>
+      <w:pPr>
+        <w:ind w:left="851" w:hanging="851"/>
+      </w:pPr>
+      <w:rPr>
+        <w:rFonts w:hint="default"/>
+      </w:rPr>
+    </w:lvl>
+    <w:lvl w:ilvl="2">
+      <w:start w:val="1"/>
+      <w:numFmt w:val="decimal"/>
+      <w:pStyle w:val="Heading3"/>
+      <w:lvlText w:val="%1.%2.%3"/>
+      <w:lvlJc w:val="left"/>
+      <w:pPr>
+        <w:ind w:left="1134" w:hanging="1134"/>
+      </w:pPr>
+      <w:rPr>
+        <w:rFonts w:hint="default"/>
+      </w:rPr>
+    </w:lvl>
+    <w:lvl w:ilvl="3">
+      <w:start w:val="1"/>
+      <w:numFmt w:val="decimal"/>
+      <w:pStyle w:val="Heading4"/>
+      <w:lvlText w:val="%1.%2.%3.%4"/>
+      <w:lvlJc w:val="left"/>
+      <w:pPr>
+        <w:ind w:left="1418" w:hanging="1418"/>
+      </w:pPr>
+      <w:rPr>
+        <w:rFonts w:hint="default"/>
+      </w:rPr>
+    </w:lvl>
+    <w:lvl w:ilvl="4">
+      <w:start w:val="1"/>
+      <w:numFmt w:val="lowerLetter"/>
+      <w:lvlText w:val="(%5)"/>
+      <w:lvlJc w:val="left"/>
+      <w:pPr>
+        <w:ind w:left="1800" w:hanging="360"/>
+      </w:pPr>
+      <w:rPr>
+        <w:rFonts w:hint="default"/>
+      </w:rPr>
+    </w:lvl>
+    <w:lvl w:ilvl="5">
+      <w:start w:val="1"/>
+      <w:numFmt w:val="lowerRoman"/>
+      <w:lvlText w:val="(%6)"/>
+      <w:lvlJc w:val="left"/>
+      <w:pPr>
+        <w:ind w:left="2160" w:hanging="360"/>
+      </w:pPr>
+      <w:rPr>
+        <w:rFonts w:hint="default"/>
+      </w:rPr>
+    </w:lvl>
+    <w:lvl w:ilvl="6">
+      <w:start w:val="1"/>
+      <w:numFmt w:val="decimal"/>
+      <w:lvlText w:val="%7."/>
+      <w:lvlJc w:val="left"/>
+      <w:pPr>
+        <w:ind w:left="2520" w:hanging="360"/>
+      </w:pPr>
+      <w:rPr>
+        <w:rFonts w:hint="default"/>
+      </w:rPr>
+    </w:lvl>
+    <w:lvl w:ilvl="7">
+      <w:start w:val="1"/>
+      <w:numFmt w:val="lowerLetter"/>
+      <w:lvlText w:val="%8."/>
+      <w:lvlJc w:val="left"/>
+      <w:pPr>
+        <w:ind w:left="2880" w:hanging="360"/>
+      </w:pPr>
+      <w:rPr>
+        <w:rFonts w:hint="default"/>
+      </w:rPr>
+    </w:lvl>
+    <w:lvl w:ilvl="8">
+      <w:start w:val="1"/>
+      <w:numFmt w:val="lowerRoman"/>
+      <w:lvlText w:val="%9."/>
+      <w:lvlJc w:val="left"/>
+      <w:pPr>
+        <w:ind w:left="3240" w:hanging="360"/>
+      </w:pPr>
+      <w:rPr>
+        <w:rFonts w:hint="default"/>
+      </w:rPr>
+    </w:lvl>
+  </w:abstractNum>
+  <w:abstractNum w:abstractNumId="1" w15:restartNumberingAfterBreak="0">
+    <w:nsid w:val="3E080124"/>
+    <w:multiLevelType w:val="hybridMultilevel"/>
+    <w:tmpl w:val="281E5B32"/>
+    <w:lvl w:ilvl="0" w:tplc="67F6BD10">
+      <w:start w:val="1"/>
+      <w:numFmt w:val="decimal"/>
+      <w:lvlText w:val="CHƯƠNG %1:"/>
+      <w:lvlJc w:val="center"/>
+      <w:pPr>
+        <w:ind w:left="720" w:hanging="360"/>
+      </w:pPr>
+      <w:rPr>
+        <w:rFonts w:hint="default"/>
+      </w:rPr>
+    </w:lvl>
+    <w:lvl w:ilvl="1" w:tplc="042A0019" w:tentative="1">
+      <w:start w:val="1"/>
+      <w:numFmt w:val="lowerLetter"/>
+      <w:lvlText w:val="%2."/>
+      <w:lvlJc w:val="left"/>
+      <w:pPr>
+        <w:ind w:left="1440" w:hanging="360"/>
+      </w:pPr>
+    </w:lvl>
+    <w:lvl w:ilvl="2" w:tplc="042A001B" w:tentative="1">
+      <w:start w:val="1"/>
+      <w:numFmt w:val="lowerRoman"/>
+      <w:lvlText w:val="%3."/>
+      <w:lvlJc w:val="right"/>
+      <w:pPr>
+        <w:ind w:left="2160" w:hanging="180"/>
+      </w:pPr>
+    </w:lvl>
+    <w:lvl w:ilvl="3" w:tplc="042A000F" w:tentative="1">
+      <w:start w:val="1"/>
+      <w:numFmt w:val="decimal"/>
+      <w:lvlText w:val="%4."/>
+      <w:lvlJc w:val="left"/>
+      <w:pPr>
+        <w:ind w:left="2880" w:hanging="360"/>
+      </w:pPr>
+    </w:lvl>
+    <w:lvl w:ilvl="4" w:tplc="042A0019" w:tentative="1">
+      <w:start w:val="1"/>
+      <w:numFmt w:val="lowerLetter"/>
+      <w:lvlText w:val="%5."/>
+      <w:lvlJc w:val="left"/>
+      <w:pPr>
+        <w:ind w:left="3600" w:hanging="360"/>
+      </w:pPr>
+    </w:lvl>
+    <w:lvl w:ilvl="5" w:tplc="042A001B" w:tentative="1">
+      <w:start w:val="1"/>
+      <w:numFmt w:val="lowerRoman"/>
+      <w:lvlText w:val="%6."/>
+      <w:lvlJc w:val="right"/>
+      <w:pPr>
+        <w:ind w:left="4320" w:hanging="180"/>
+      </w:pPr>
+    </w:lvl>
+    <w:lvl w:ilvl="6" w:tplc="042A000F" w:tentative="1">
+      <w:start w:val="1"/>
+      <w:numFmt w:val="decimal"/>
+      <w:lvlText w:val="%7."/>
+      <w:lvlJc w:val="left"/>
+      <w:pPr>
+        <w:ind w:left="5040" w:hanging="360"/>
+      </w:pPr>
+    </w:lvl>
+    <w:lvl w:ilvl="7" w:tplc="042A0019" w:tentative="1">
+      <w:start w:val="1"/>
+      <w:numFmt w:val="lowerLetter"/>
+      <w:lvlText w:val="%8."/>
+      <w:lvlJc w:val="left"/>
+      <w:pPr>
+        <w:ind w:left="5760" w:hanging="360"/>
+      </w:pPr>
+    </w:lvl>
+    <w:lvl w:ilvl="8" w:tplc="042A001B" w:tentative="1">
+      <w:start w:val="1"/>
+      <w:numFmt w:val="lowerRoman"/>
+      <w:lvlText w:val="%9."/>
+      <w:lvlJc w:val="right"/>
+      <w:pPr>
+        <w:ind w:left="6480" w:hanging="180"/>
+      </w:pPr>
+    </w:lvl>
+  </w:abstractNum>
   <w:abstractNum w:abstractNumId="990">
     <w:nsid w:val="2c1ae401"/>
     <w:multiLevelType w:val="multilevel"/>
@@ -41229,6 +41462,12 @@
       </w:pPr>
     </w:lvl>
   </w:abstractNum>
+  <w:num w:numId="1" w16cid:durableId="1291520622">
+    <w:abstractNumId w:val="1"/>
+  </w:num>
+  <w:num w:numId="2" w16cid:durableId="199246048">
+    <w:abstractNumId w:val="0"/>
+  </w:num>
   <w:num w:numId="1000">
     <w:abstractNumId w:val="990"/>
   </w:num>
@@ -41917,348 +42156,642 @@
 </file>
 
 <file path=word/styles.xml><?xml version="1.0" encoding="utf-8"?>
-<w:styles xmlns:r="http://schemas.openxmlformats.org/officeDocument/2006/relationships" xmlns:w="http://schemas.openxmlformats.org/wordprocessingml/2006/main">
+<w:styles xmlns:mc="http://schemas.openxmlformats.org/markup-compatibility/2006" xmlns:r="http://schemas.openxmlformats.org/officeDocument/2006/relationships" xmlns:w="http://schemas.openxmlformats.org/wordprocessingml/2006/main" xmlns:w14="http://schemas.microsoft.com/office/word/2010/wordml" xmlns:w15="http://schemas.microsoft.com/office/word/2012/wordml" xmlns:w16cex="http://schemas.microsoft.com/office/word/2018/wordml/cex" xmlns:w16cid="http://schemas.microsoft.com/office/word/2016/wordml/cid" xmlns:w16="http://schemas.microsoft.com/office/word/2018/wordml" xmlns:w16sdtdh="http://schemas.microsoft.com/office/word/2020/wordml/sdtdatahash" xmlns:w16se="http://schemas.microsoft.com/office/word/2015/wordml/symex" mc:Ignorable="w14 w15 w16se w16cid w16 w16cex w16sdtdh">
   <w:docDefaults>
     <w:rPrDefault>
       <w:rPr>
-        <w:rFonts w:asciiTheme="minorHAnsi" w:eastAsiaTheme="minorHAnsi" w:hAnsiTheme="minorHAnsi" w:cstheme="minorBidi"/>
-        <w:sz w:val="24"/>
-        <w:szCs w:val="24"/>
+        <w:rFonts w:ascii="Times New Roman" w:eastAsiaTheme="minorHAnsi" w:hAnsi="Times New Roman" w:cstheme="majorHAnsi"/>
+        <w:kern w:val="2"/>
+        <w:sz w:val="26"/>
+        <w:szCs w:val="26"/>
         <w:lang w:val="vi-VN" w:eastAsia="en-US" w:bidi="ar-SA"/>
+        <w14:ligatures w14:val="standardContextual"/>
       </w:rPr>
     </w:rPrDefault>
     <w:pPrDefault>
       <w:pPr>
-        <w:spacing w:after="200"/>
+        <w:spacing w:after="160" w:line="278" w:lineRule="auto"/>
       </w:pPr>
     </w:pPrDefault>
   </w:docDefaults>
-  <w:latentStyles w:defLockedState="0" w:defUIPriority="0" w:defSemiHidden="0" w:defUnhideWhenUsed="0" w:defQFormat="0" w:count="276"/>
+  <w:latentStyles w:defLockedState="0" w:defUIPriority="99" w:defSemiHidden="0" w:defUnhideWhenUsed="0" w:defQFormat="0" w:count="376">
+    <w:lsdException w:name="Normal" w:uiPriority="0" w:qFormat="1"/>
+    <w:lsdException w:name="heading 1" w:uiPriority="9" w:qFormat="1"/>
+    <w:lsdException w:name="heading 2" w:semiHidden="1" w:uiPriority="9" w:unhideWhenUsed="1" w:qFormat="1"/>
+    <w:lsdException w:name="heading 3" w:semiHidden="1" w:uiPriority="9" w:unhideWhenUsed="1" w:qFormat="1"/>
+    <w:lsdException w:name="heading 4" w:semiHidden="1" w:uiPriority="9" w:unhideWhenUsed="1" w:qFormat="1"/>
+    <w:lsdException w:name="heading 5" w:semiHidden="1" w:uiPriority="9" w:unhideWhenUsed="1" w:qFormat="1"/>
+    <w:lsdException w:name="heading 6" w:semiHidden="1" w:uiPriority="9" w:unhideWhenUsed="1" w:qFormat="1"/>
+    <w:lsdException w:name="heading 7" w:semiHidden="1" w:uiPriority="9" w:unhideWhenUsed="1" w:qFormat="1"/>
+    <w:lsdException w:name="heading 8" w:semiHidden="1" w:uiPriority="9" w:unhideWhenUsed="1" w:qFormat="1"/>
+    <w:lsdException w:name="heading 9" w:semiHidden="1" w:uiPriority="9" w:unhideWhenUsed="1" w:qFormat="1"/>
+    <w:lsdException w:name="index 1" w:semiHidden="1" w:unhideWhenUsed="1"/>
+    <w:lsdException w:name="index 2" w:semiHidden="1" w:unhideWhenUsed="1"/>
+    <w:lsdException w:name="index 3" w:semiHidden="1" w:unhideWhenUsed="1"/>
+    <w:lsdException w:name="index 4" w:semiHidden="1" w:unhideWhenUsed="1"/>
+    <w:lsdException w:name="index 5" w:semiHidden="1" w:unhideWhenUsed="1"/>
+    <w:lsdException w:name="index 6" w:semiHidden="1" w:unhideWhenUsed="1"/>
+    <w:lsdException w:name="index 7" w:semiHidden="1" w:unhideWhenUsed="1"/>
+    <w:lsdException w:name="index 8" w:semiHidden="1" w:unhideWhenUsed="1"/>
+    <w:lsdException w:name="index 9" w:semiHidden="1" w:unhideWhenUsed="1"/>
+    <w:lsdException w:name="toc 1" w:semiHidden="1" w:uiPriority="39" w:unhideWhenUsed="1"/>
+    <w:lsdException w:name="toc 2" w:semiHidden="1" w:uiPriority="39" w:unhideWhenUsed="1"/>
+    <w:lsdException w:name="toc 3" w:semiHidden="1" w:uiPriority="39" w:unhideWhenUsed="1"/>
+    <w:lsdException w:name="toc 4" w:semiHidden="1" w:uiPriority="39" w:unhideWhenUsed="1"/>
+    <w:lsdException w:name="toc 5" w:semiHidden="1" w:uiPriority="39" w:unhideWhenUsed="1"/>
+    <w:lsdException w:name="toc 6" w:semiHidden="1" w:uiPriority="39" w:unhideWhenUsed="1"/>
+    <w:lsdException w:name="toc 7" w:semiHidden="1" w:uiPriority="39" w:unhideWhenUsed="1"/>
+    <w:lsdException w:name="toc 8" w:semiHidden="1" w:uiPriority="39" w:unhideWhenUsed="1"/>
+    <w:lsdException w:name="toc 9" w:semiHidden="1" w:uiPriority="39" w:unhideWhenUsed="1"/>
+    <w:lsdException w:name="Normal Indent" w:semiHidden="1" w:unhideWhenUsed="1"/>
+    <w:lsdException w:name="footnote text" w:semiHidden="1" w:unhideWhenUsed="1"/>
+    <w:lsdException w:name="annotation text" w:semiHidden="1" w:unhideWhenUsed="1"/>
+    <w:lsdException w:name="header" w:semiHidden="1" w:unhideWhenUsed="1"/>
+    <w:lsdException w:name="footer" w:semiHidden="1" w:unhideWhenUsed="1"/>
+    <w:lsdException w:name="index heading" w:semiHidden="1" w:unhideWhenUsed="1"/>
+    <w:lsdException w:name="caption" w:semiHidden="1" w:uiPriority="35" w:unhideWhenUsed="1" w:qFormat="1"/>
+    <w:lsdException w:name="table of figures" w:semiHidden="1" w:unhideWhenUsed="1"/>
+    <w:lsdException w:name="envelope address" w:semiHidden="1" w:unhideWhenUsed="1"/>
+    <w:lsdException w:name="envelope return" w:semiHidden="1" w:unhideWhenUsed="1"/>
+    <w:lsdException w:name="footnote reference" w:semiHidden="1" w:unhideWhenUsed="1"/>
+    <w:lsdException w:name="annotation reference" w:semiHidden="1" w:unhideWhenUsed="1"/>
+    <w:lsdException w:name="line number" w:semiHidden="1" w:unhideWhenUsed="1"/>
+    <w:lsdException w:name="page number" w:semiHidden="1" w:unhideWhenUsed="1"/>
+    <w:lsdException w:name="endnote reference" w:semiHidden="1" w:unhideWhenUsed="1"/>
+    <w:lsdException w:name="endnote text" w:semiHidden="1" w:unhideWhenUsed="1"/>
+    <w:lsdException w:name="table of authorities" w:semiHidden="1" w:unhideWhenUsed="1"/>
+    <w:lsdException w:name="macro" w:semiHidden="1" w:unhideWhenUsed="1"/>
+    <w:lsdException w:name="toa heading" w:semiHidden="1" w:unhideWhenUsed="1"/>
+    <w:lsdException w:name="List" w:semiHidden="1" w:unhideWhenUsed="1"/>
+    <w:lsdException w:name="List Bullet" w:semiHidden="1" w:unhideWhenUsed="1"/>
+    <w:lsdException w:name="List Number" w:semiHidden="1" w:unhideWhenUsed="1"/>
+    <w:lsdException w:name="List 2" w:semiHidden="1" w:unhideWhenUsed="1"/>
+    <w:lsdException w:name="List 3" w:semiHidden="1" w:unhideWhenUsed="1"/>
+    <w:lsdException w:name="List 4" w:semiHidden="1" w:unhideWhenUsed="1"/>
+    <w:lsdException w:name="List 5" w:semiHidden="1" w:unhideWhenUsed="1"/>
+    <w:lsdException w:name="List Bullet 2" w:semiHidden="1" w:unhideWhenUsed="1"/>
+    <w:lsdException w:name="List Bullet 3" w:semiHidden="1" w:unhideWhenUsed="1"/>
+    <w:lsdException w:name="List Bullet 4" w:semiHidden="1" w:unhideWhenUsed="1"/>
+    <w:lsdException w:name="List Bullet 5" w:semiHidden="1" w:unhideWhenUsed="1"/>
+    <w:lsdException w:name="List Number 2" w:semiHidden="1" w:unhideWhenUsed="1"/>
+    <w:lsdException w:name="List Number 3" w:semiHidden="1" w:unhideWhenUsed="1"/>
+    <w:lsdException w:name="List Number 4" w:semiHidden="1" w:unhideWhenUsed="1"/>
+    <w:lsdException w:name="List Number 5" w:semiHidden="1" w:unhideWhenUsed="1"/>
+    <w:lsdException w:name="Title" w:uiPriority="10" w:qFormat="1"/>
+    <w:lsdException w:name="Closing" w:semiHidden="1" w:unhideWhenUsed="1"/>
+    <w:lsdException w:name="Signature" w:semiHidden="1" w:unhideWhenUsed="1"/>
+    <w:lsdException w:name="Default Paragraph Font" w:semiHidden="1" w:uiPriority="1" w:unhideWhenUsed="1"/>
+    <w:lsdException w:name="Body Text" w:semiHidden="1" w:unhideWhenUsed="1"/>
+    <w:lsdException w:name="Body Text Indent" w:semiHidden="1" w:unhideWhenUsed="1"/>
+    <w:lsdException w:name="List Continue" w:semiHidden="1" w:unhideWhenUsed="1"/>
+    <w:lsdException w:name="List Continue 2" w:semiHidden="1" w:unhideWhenUsed="1"/>
+    <w:lsdException w:name="List Continue 3" w:semiHidden="1" w:unhideWhenUsed="1"/>
+    <w:lsdException w:name="List Continue 4" w:semiHidden="1" w:unhideWhenUsed="1"/>
+    <w:lsdException w:name="List Continue 5" w:semiHidden="1" w:unhideWhenUsed="1"/>
+    <w:lsdException w:name="Message Header" w:semiHidden="1" w:unhideWhenUsed="1"/>
+    <w:lsdException w:name="Subtitle" w:uiPriority="11" w:qFormat="1"/>
+    <w:lsdException w:name="Salutation" w:semiHidden="1" w:unhideWhenUsed="1"/>
+    <w:lsdException w:name="Date" w:semiHidden="1" w:unhideWhenUsed="1"/>
+    <w:lsdException w:name="Body Text First Indent" w:semiHidden="1" w:unhideWhenUsed="1"/>
+    <w:lsdException w:name="Body Text First Indent 2" w:semiHidden="1" w:unhideWhenUsed="1"/>
+    <w:lsdException w:name="Note Heading" w:semiHidden="1" w:unhideWhenUsed="1"/>
+    <w:lsdException w:name="Body Text 2" w:semiHidden="1" w:unhideWhenUsed="1"/>
+    <w:lsdException w:name="Body Text 3" w:semiHidden="1" w:unhideWhenUsed="1"/>
+    <w:lsdException w:name="Body Text Indent 2" w:semiHidden="1" w:unhideWhenUsed="1"/>
+    <w:lsdException w:name="Body Text Indent 3" w:semiHidden="1" w:unhideWhenUsed="1"/>
+    <w:lsdException w:name="Block Text" w:semiHidden="1" w:unhideWhenUsed="1"/>
+    <w:lsdException w:name="Hyperlink" w:semiHidden="1" w:unhideWhenUsed="1"/>
+    <w:lsdException w:name="FollowedHyperlink" w:semiHidden="1" w:unhideWhenUsed="1"/>
+    <w:lsdException w:name="Strong" w:uiPriority="22" w:qFormat="1"/>
+    <w:lsdException w:name="Emphasis" w:uiPriority="20" w:qFormat="1"/>
+    <w:lsdException w:name="Document Map" w:semiHidden="1" w:unhideWhenUsed="1"/>
+    <w:lsdException w:name="Plain Text" w:semiHidden="1" w:unhideWhenUsed="1"/>
+    <w:lsdException w:name="E-mail Signature" w:semiHidden="1" w:unhideWhenUsed="1"/>
+    <w:lsdException w:name="HTML Top of Form" w:semiHidden="1" w:unhideWhenUsed="1"/>
+    <w:lsdException w:name="HTML Bottom of Form" w:semiHidden="1" w:unhideWhenUsed="1"/>
+    <w:lsdException w:name="Normal (Web)" w:semiHidden="1" w:unhideWhenUsed="1"/>
+    <w:lsdException w:name="HTML Acronym" w:semiHidden="1" w:unhideWhenUsed="1"/>
+    <w:lsdException w:name="HTML Address" w:semiHidden="1" w:unhideWhenUsed="1"/>
+    <w:lsdException w:name="HTML Cite" w:semiHidden="1" w:unhideWhenUsed="1"/>
+    <w:lsdException w:name="HTML Code" w:semiHidden="1" w:unhideWhenUsed="1"/>
+    <w:lsdException w:name="HTML Definition" w:semiHidden="1" w:unhideWhenUsed="1"/>
+    <w:lsdException w:name="HTML Keyboard" w:semiHidden="1" w:unhideWhenUsed="1"/>
+    <w:lsdException w:name="HTML Preformatted" w:semiHidden="1" w:unhideWhenUsed="1"/>
+    <w:lsdException w:name="HTML Sample" w:semiHidden="1" w:unhideWhenUsed="1"/>
+    <w:lsdException w:name="HTML Typewriter" w:semiHidden="1" w:unhideWhenUsed="1"/>
+    <w:lsdException w:name="HTML Variable" w:semiHidden="1" w:unhideWhenUsed="1"/>
+    <w:lsdException w:name="Normal Table" w:semiHidden="1" w:unhideWhenUsed="1"/>
+    <w:lsdException w:name="annotation subject" w:semiHidden="1" w:unhideWhenUsed="1"/>
+    <w:lsdException w:name="No List" w:semiHidden="1" w:unhideWhenUsed="1"/>
+    <w:lsdException w:name="Outline List 1" w:semiHidden="1" w:unhideWhenUsed="1"/>
+    <w:lsdException w:name="Outline List 2" w:semiHidden="1" w:unhideWhenUsed="1"/>
+    <w:lsdException w:name="Outline List 3" w:semiHidden="1" w:unhideWhenUsed="1"/>
+    <w:lsdException w:name="Table Simple 1" w:semiHidden="1" w:unhideWhenUsed="1"/>
+    <w:lsdException w:name="Table Simple 2" w:semiHidden="1" w:unhideWhenUsed="1"/>
+    <w:lsdException w:name="Table Simple 3" w:semiHidden="1" w:unhideWhenUsed="1"/>
+    <w:lsdException w:name="Table Classic 1" w:semiHidden="1" w:unhideWhenUsed="1"/>
+    <w:lsdException w:name="Table Classic 2" w:semiHidden="1" w:unhideWhenUsed="1"/>
+    <w:lsdException w:name="Table Classic 3" w:semiHidden="1" w:unhideWhenUsed="1"/>
+    <w:lsdException w:name="Table Classic 4" w:semiHidden="1" w:unhideWhenUsed="1"/>
+    <w:lsdException w:name="Table Colorful 1" w:semiHidden="1" w:unhideWhenUsed="1"/>
+    <w:lsdException w:name="Table Colorful 2" w:semiHidden="1" w:unhideWhenUsed="1"/>
+    <w:lsdException w:name="Table Colorful 3" w:semiHidden="1" w:unhideWhenUsed="1"/>
+    <w:lsdException w:name="Table Columns 1" w:semiHidden="1" w:unhideWhenUsed="1"/>
+    <w:lsdException w:name="Table Columns 2" w:semiHidden="1" w:unhideWhenUsed="1"/>
+    <w:lsdException w:name="Table Columns 3" w:semiHidden="1" w:unhideWhenUsed="1"/>
+    <w:lsdException w:name="Table Columns 4" w:semiHidden="1" w:unhideWhenUsed="1"/>
+    <w:lsdException w:name="Table Columns 5" w:semiHidden="1" w:unhideWhenUsed="1"/>
+    <w:lsdException w:name="Table Grid 1" w:semiHidden="1" w:unhideWhenUsed="1"/>
+    <w:lsdException w:name="Table Grid 2" w:semiHidden="1" w:unhideWhenUsed="1"/>
+    <w:lsdException w:name="Table Grid 3" w:semiHidden="1" w:unhideWhenUsed="1"/>
+    <w:lsdException w:name="Table Grid 4" w:semiHidden="1" w:unhideWhenUsed="1"/>
+    <w:lsdException w:name="Table Grid 5" w:semiHidden="1" w:unhideWhenUsed="1"/>
+    <w:lsdException w:name="Table Grid 6" w:semiHidden="1" w:unhideWhenUsed="1"/>
+    <w:lsdException w:name="Table Grid 7" w:semiHidden="1" w:unhideWhenUsed="1"/>
+    <w:lsdException w:name="Table Grid 8" w:semiHidden="1" w:unhideWhenUsed="1"/>
+    <w:lsdException w:name="Table List 1" w:semiHidden="1" w:unhideWhenUsed="1"/>
+    <w:lsdException w:name="Table List 2" w:semiHidden="1" w:unhideWhenUsed="1"/>
+    <w:lsdException w:name="Table List 3" w:semiHidden="1" w:unhideWhenUsed="1"/>
+    <w:lsdException w:name="Table List 4" w:semiHidden="1" w:unhideWhenUsed="1"/>
+    <w:lsdException w:name="Table List 5" w:semiHidden="1" w:unhideWhenUsed="1"/>
+    <w:lsdException w:name="Table List 6" w:semiHidden="1" w:unhideWhenUsed="1"/>
+    <w:lsdException w:name="Table List 7" w:semiHidden="1" w:unhideWhenUsed="1"/>
+    <w:lsdException w:name="Table List 8" w:semiHidden="1" w:unhideWhenUsed="1"/>
+    <w:lsdException w:name="Table 3D effects 1" w:semiHidden="1" w:unhideWhenUsed="1"/>
+    <w:lsdException w:name="Table 3D effects 2" w:semiHidden="1" w:unhideWhenUsed="1"/>
+    <w:lsdException w:name="Table 3D effects 3" w:semiHidden="1" w:unhideWhenUsed="1"/>
+    <w:lsdException w:name="Table Contemporary" w:semiHidden="1" w:unhideWhenUsed="1"/>
+    <w:lsdException w:name="Table Elegant" w:semiHidden="1" w:unhideWhenUsed="1"/>
+    <w:lsdException w:name="Table Professional" w:semiHidden="1" w:unhideWhenUsed="1"/>
+    <w:lsdException w:name="Table Subtle 1" w:semiHidden="1" w:unhideWhenUsed="1"/>
+    <w:lsdException w:name="Table Subtle 2" w:semiHidden="1" w:unhideWhenUsed="1"/>
+    <w:lsdException w:name="Table Web 1" w:semiHidden="1" w:unhideWhenUsed="1"/>
+    <w:lsdException w:name="Table Web 2" w:semiHidden="1" w:unhideWhenUsed="1"/>
+    <w:lsdException w:name="Table Web 3" w:semiHidden="1" w:unhideWhenUsed="1"/>
+    <w:lsdException w:name="Balloon Text" w:semiHidden="1" w:unhideWhenUsed="1"/>
+    <w:lsdException w:name="Table Grid" w:uiPriority="39"/>
+    <w:lsdException w:name="Table Theme" w:semiHidden="1" w:unhideWhenUsed="1"/>
+    <w:lsdException w:name="Placeholder Text" w:semiHidden="1"/>
+    <w:lsdException w:name="No Spacing" w:uiPriority="1" w:qFormat="1"/>
+    <w:lsdException w:name="Light Shading" w:uiPriority="60"/>
+    <w:lsdException w:name="Light List" w:uiPriority="61"/>
+    <w:lsdException w:name="Light Grid" w:uiPriority="62"/>
+    <w:lsdException w:name="Medium Shading 1" w:uiPriority="63"/>
+    <w:lsdException w:name="Medium Shading 2" w:uiPriority="64"/>
+    <w:lsdException w:name="Medium List 1" w:uiPriority="65"/>
+    <w:lsdException w:name="Medium List 2" w:uiPriority="66"/>
+    <w:lsdException w:name="Medium Grid 1" w:uiPriority="67"/>
+    <w:lsdException w:name="Medium Grid 2" w:uiPriority="68"/>
+    <w:lsdException w:name="Medium Grid 3" w:uiPriority="69"/>
+    <w:lsdException w:name="Dark List" w:uiPriority="70"/>
+    <w:lsdException w:name="Colorful Shading" w:uiPriority="71"/>
+    <w:lsdException w:name="Colorful List" w:uiPriority="72"/>
+    <w:lsdException w:name="Colorful Grid" w:uiPriority="73"/>
+    <w:lsdException w:name="Light Shading Accent 1" w:uiPriority="60"/>
+    <w:lsdException w:name="Light List Accent 1" w:uiPriority="61"/>
+    <w:lsdException w:name="Light Grid Accent 1" w:uiPriority="62"/>
+    <w:lsdException w:name="Medium Shading 1 Accent 1" w:uiPriority="63"/>
+    <w:lsdException w:name="Medium Shading 2 Accent 1" w:uiPriority="64"/>
+    <w:lsdException w:name="Medium List 1 Accent 1" w:uiPriority="65"/>
+    <w:lsdException w:name="Revision" w:semiHidden="1"/>
+    <w:lsdException w:name="List Paragraph" w:uiPriority="34" w:qFormat="1"/>
+    <w:lsdException w:name="Quote" w:uiPriority="29" w:qFormat="1"/>
+    <w:lsdException w:name="Intense Quote" w:uiPriority="30" w:qFormat="1"/>
+    <w:lsdException w:name="Medium List 2 Accent 1" w:uiPriority="66"/>
+    <w:lsdException w:name="Medium Grid 1 Accent 1" w:uiPriority="67"/>
+    <w:lsdException w:name="Medium Grid 2 Accent 1" w:uiPriority="68"/>
+    <w:lsdException w:name="Medium Grid 3 Accent 1" w:uiPriority="69"/>
+    <w:lsdException w:name="Dark List Accent 1" w:uiPriority="70"/>
+    <w:lsdException w:name="Colorful Shading Accent 1" w:uiPriority="71"/>
+    <w:lsdException w:name="Colorful List Accent 1" w:uiPriority="72"/>
+    <w:lsdException w:name="Colorful Grid Accent 1" w:uiPriority="73"/>
+    <w:lsdException w:name="Light Shading Accent 2" w:uiPriority="60"/>
+    <w:lsdException w:name="Light List Accent 2" w:uiPriority="61"/>
+    <w:lsdException w:name="Light Grid Accent 2" w:uiPriority="62"/>
+    <w:lsdException w:name="Medium Shading 1 Accent 2" w:uiPriority="63"/>
+    <w:lsdException w:name="Medium Shading 2 Accent 2" w:uiPriority="64"/>
+    <w:lsdException w:name="Medium List 1 Accent 2" w:uiPriority="65"/>
+    <w:lsdException w:name="Medium List 2 Accent 2" w:uiPriority="66"/>
+    <w:lsdException w:name="Medium Grid 1 Accent 2" w:uiPriority="67"/>
+    <w:lsdException w:name="Medium Grid 2 Accent 2" w:uiPriority="68"/>
+    <w:lsdException w:name="Medium Grid 3 Accent 2" w:uiPriority="69"/>
+    <w:lsdException w:name="Dark List Accent 2" w:uiPriority="70"/>
+    <w:lsdException w:name="Colorful Shading Accent 2" w:uiPriority="71"/>
+    <w:lsdException w:name="Colorful List Accent 2" w:uiPriority="72"/>
+    <w:lsdException w:name="Colorful Grid Accent 2" w:uiPriority="73"/>
+    <w:lsdException w:name="Light Shading Accent 3" w:uiPriority="60"/>
+    <w:lsdException w:name="Light List Accent 3" w:uiPriority="61"/>
+    <w:lsdException w:name="Light Grid Accent 3" w:uiPriority="62"/>
+    <w:lsdException w:name="Medium Shading 1 Accent 3" w:uiPriority="63"/>
+    <w:lsdException w:name="Medium Shading 2 Accent 3" w:uiPriority="64"/>
+    <w:lsdException w:name="Medium List 1 Accent 3" w:uiPriority="65"/>
+    <w:lsdException w:name="Medium List 2 Accent 3" w:uiPriority="66"/>
+    <w:lsdException w:name="Medium Grid 1 Accent 3" w:uiPriority="67"/>
+    <w:lsdException w:name="Medium Grid 2 Accent 3" w:uiPriority="68"/>
+    <w:lsdException w:name="Medium Grid 3 Accent 3" w:uiPriority="69"/>
+    <w:lsdException w:name="Dark List Accent 3" w:uiPriority="70"/>
+    <w:lsdException w:name="Colorful Shading Accent 3" w:uiPriority="71"/>
+    <w:lsdException w:name="Colorful List Accent 3" w:uiPriority="72"/>
+    <w:lsdException w:name="Colorful Grid Accent 3" w:uiPriority="73"/>
+    <w:lsdException w:name="Light Shading Accent 4" w:uiPriority="60"/>
+    <w:lsdException w:name="Light List Accent 4" w:uiPriority="61"/>
+    <w:lsdException w:name="Light Grid Accent 4" w:uiPriority="62"/>
+    <w:lsdException w:name="Medium Shading 1 Accent 4" w:uiPriority="63"/>
+    <w:lsdException w:name="Medium Shading 2 Accent 4" w:uiPriority="64"/>
+    <w:lsdException w:name="Medium List 1 Accent 4" w:uiPriority="65"/>
+    <w:lsdException w:name="Medium List 2 Accent 4" w:uiPriority="66"/>
+    <w:lsdException w:name="Medium Grid 1 Accent 4" w:uiPriority="67"/>
+    <w:lsdException w:name="Medium Grid 2 Accent 4" w:uiPriority="68"/>
+    <w:lsdException w:name="Medium Grid 3 Accent 4" w:uiPriority="69"/>
+    <w:lsdException w:name="Dark List Accent 4" w:uiPriority="70"/>
+    <w:lsdException w:name="Colorful Shading Accent 4" w:uiPriority="71"/>
+    <w:lsdException w:name="Colorful List Accent 4" w:uiPriority="72"/>
+    <w:lsdException w:name="Colorful Grid Accent 4" w:uiPriority="73"/>
+    <w:lsdException w:name="Light Shading Accent 5" w:uiPriority="60"/>
+    <w:lsdException w:name="Light List Accent 5" w:uiPriority="61"/>
+    <w:lsdException w:name="Light Grid Accent 5" w:uiPriority="62"/>
+    <w:lsdException w:name="Medium Shading 1 Accent 5" w:uiPriority="63"/>
+    <w:lsdException w:name="Medium Shading 2 Accent 5" w:uiPriority="64"/>
+    <w:lsdException w:name="Medium List 1 Accent 5" w:uiPriority="65"/>
+    <w:lsdException w:name="Medium List 2 Accent 5" w:uiPriority="66"/>
+    <w:lsdException w:name="Medium Grid 1 Accent 5" w:uiPriority="67"/>
+    <w:lsdException w:name="Medium Grid 2 Accent 5" w:uiPriority="68"/>
+    <w:lsdException w:name="Medium Grid 3 Accent 5" w:uiPriority="69"/>
+    <w:lsdException w:name="Dark List Accent 5" w:uiPriority="70"/>
+    <w:lsdException w:name="Colorful Shading Accent 5" w:uiPriority="71"/>
+    <w:lsdException w:name="Colorful List Accent 5" w:uiPriority="72"/>
+    <w:lsdException w:name="Colorful Grid Accent 5" w:uiPriority="73"/>
+    <w:lsdException w:name="Light Shading Accent 6" w:uiPriority="60"/>
+    <w:lsdException w:name="Light List Accent 6" w:uiPriority="61"/>
+    <w:lsdException w:name="Light Grid Accent 6" w:uiPriority="62"/>
+    <w:lsdException w:name="Medium Shading 1 Accent 6" w:uiPriority="63"/>
+    <w:lsdException w:name="Medium Shading 2 Accent 6" w:uiPriority="64"/>
+    <w:lsdException w:name="Medium List 1 Accent 6" w:uiPriority="65"/>
+    <w:lsdException w:name="Medium List 2 Accent 6" w:uiPriority="66"/>
+    <w:lsdException w:name="Medium Grid 1 Accent 6" w:uiPriority="67"/>
+    <w:lsdException w:name="Medium Grid 2 Accent 6" w:uiPriority="68"/>
+    <w:lsdException w:name="Medium Grid 3 Accent 6" w:uiPriority="69"/>
+    <w:lsdException w:name="Dark List Accent 6" w:uiPriority="70"/>
+    <w:lsdException w:name="Colorful Shading Accent 6" w:uiPriority="71"/>
+    <w:lsdException w:name="Colorful List Accent 6" w:uiPriority="72"/>
+    <w:lsdException w:name="Colorful Grid Accent 6" w:uiPriority="73"/>
+    <w:lsdException w:name="Subtle Emphasis" w:uiPriority="19" w:qFormat="1"/>
+    <w:lsdException w:name="Intense Emphasis" w:uiPriority="21" w:qFormat="1"/>
+    <w:lsdException w:name="Subtle Reference" w:uiPriority="31" w:qFormat="1"/>
+    <w:lsdException w:name="Intense Reference" w:uiPriority="32" w:qFormat="1"/>
+    <w:lsdException w:name="Book Title" w:uiPriority="33" w:qFormat="1"/>
+    <w:lsdException w:name="Bibliography" w:semiHidden="1" w:uiPriority="37" w:unhideWhenUsed="1"/>
+    <w:lsdException w:name="TOC Heading" w:semiHidden="1" w:uiPriority="39" w:unhideWhenUsed="1" w:qFormat="1"/>
+    <w:lsdException w:name="Plain Table 1" w:uiPriority="41"/>
+    <w:lsdException w:name="Plain Table 2" w:uiPriority="42"/>
+    <w:lsdException w:name="Plain Table 3" w:uiPriority="43"/>
+    <w:lsdException w:name="Plain Table 4" w:uiPriority="44"/>
+    <w:lsdException w:name="Plain Table 5" w:uiPriority="45"/>
+    <w:lsdException w:name="Grid Table Light" w:uiPriority="40"/>
+    <w:lsdException w:name="Grid Table 1 Light" w:uiPriority="46"/>
+    <w:lsdException w:name="Grid Table 2" w:uiPriority="47"/>
+    <w:lsdException w:name="Grid Table 3" w:uiPriority="48"/>
+    <w:lsdException w:name="Grid Table 4" w:uiPriority="49"/>
+    <w:lsdException w:name="Grid Table 5 Dark" w:uiPriority="50"/>
+    <w:lsdException w:name="Grid Table 6 Colorful" w:uiPriority="51"/>
+    <w:lsdException w:name="Grid Table 7 Colorful" w:uiPriority="52"/>
+    <w:lsdException w:name="Grid Table 1 Light Accent 1" w:uiPriority="46"/>
+    <w:lsdException w:name="Grid Table 2 Accent 1" w:uiPriority="47"/>
+    <w:lsdException w:name="Grid Table 3 Accent 1" w:uiPriority="48"/>
+    <w:lsdException w:name="Grid Table 4 Accent 1" w:uiPriority="49"/>
+    <w:lsdException w:name="Grid Table 5 Dark Accent 1" w:uiPriority="50"/>
+    <w:lsdException w:name="Grid Table 6 Colorful Accent 1" w:uiPriority="51"/>
+    <w:lsdException w:name="Grid Table 7 Colorful Accent 1" w:uiPriority="52"/>
+    <w:lsdException w:name="Grid Table 1 Light Accent 2" w:uiPriority="46"/>
+    <w:lsdException w:name="Grid Table 2 Accent 2" w:uiPriority="47"/>
+    <w:lsdException w:name="Grid Table 3 Accent 2" w:uiPriority="48"/>
+    <w:lsdException w:name="Grid Table 4 Accent 2" w:uiPriority="49"/>
+    <w:lsdException w:name="Grid Table 5 Dark Accent 2" w:uiPriority="50"/>
+    <w:lsdException w:name="Grid Table 6 Colorful Accent 2" w:uiPriority="51"/>
+    <w:lsdException w:name="Grid Table 7 Colorful Accent 2" w:uiPriority="52"/>
+    <w:lsdException w:name="Grid Table 1 Light Accent 3" w:uiPriority="46"/>
+    <w:lsdException w:name="Grid Table 2 Accent 3" w:uiPriority="47"/>
+    <w:lsdException w:name="Grid Table 3 Accent 3" w:uiPriority="48"/>
+    <w:lsdException w:name="Grid Table 4 Accent 3" w:uiPriority="49"/>
+    <w:lsdException w:name="Grid Table 5 Dark Accent 3" w:uiPriority="50"/>
+    <w:lsdException w:name="Grid Table 6 Colorful Accent 3" w:uiPriority="51"/>
+    <w:lsdException w:name="Grid Table 7 Colorful Accent 3" w:uiPriority="52"/>
+    <w:lsdException w:name="Grid Table 1 Light Accent 4" w:uiPriority="46"/>
+    <w:lsdException w:name="Grid Table 2 Accent 4" w:uiPriority="47"/>
+    <w:lsdException w:name="Grid Table 3 Accent 4" w:uiPriority="48"/>
+    <w:lsdException w:name="Grid Table 4 Accent 4" w:uiPriority="49"/>
+    <w:lsdException w:name="Grid Table 5 Dark Accent 4" w:uiPriority="50"/>
+    <w:lsdException w:name="Grid Table 6 Colorful Accent 4" w:uiPriority="51"/>
+    <w:lsdException w:name="Grid Table 7 Colorful Accent 4" w:uiPriority="52"/>
+    <w:lsdException w:name="Grid Table 1 Light Accent 5" w:uiPriority="46"/>
+    <w:lsdException w:name="Grid Table 2 Accent 5" w:uiPriority="47"/>
+    <w:lsdException w:name="Grid Table 3 Accent 5" w:uiPriority="48"/>
+    <w:lsdException w:name="Grid Table 4 Accent 5" w:uiPriority="49"/>
+    <w:lsdException w:name="Grid Table 5 Dark Accent 5" w:uiPriority="50"/>
+    <w:lsdException w:name="Grid Table 6 Colorful Accent 5" w:uiPriority="51"/>
+    <w:lsdException w:name="Grid Table 7 Colorful Accent 5" w:uiPriority="52"/>
+    <w:lsdException w:name="Grid Table 1 Light Accent 6" w:uiPriority="46"/>
+    <w:lsdException w:name="Grid Table 2 Accent 6" w:uiPriority="47"/>
+    <w:lsdException w:name="Grid Table 3 Accent 6" w:uiPriority="48"/>
+    <w:lsdException w:name="Grid Table 4 Accent 6" w:uiPriority="49"/>
+    <w:lsdException w:name="Grid Table 5 Dark Accent 6" w:uiPriority="50"/>
+    <w:lsdException w:name="Grid Table 6 Colorful Accent 6" w:uiPriority="51"/>
+    <w:lsdException w:name="Grid Table 7 Colorful Accent 6" w:uiPriority="52"/>
+    <w:lsdException w:name="List Table 1 Light" w:uiPriority="46"/>
+    <w:lsdException w:name="List Table 2" w:uiPriority="47"/>
+    <w:lsdException w:name="List Table 3" w:uiPriority="48"/>
+    <w:lsdException w:name="List Table 4" w:uiPriority="49"/>
+    <w:lsdException w:name="List Table 5 Dark" w:uiPriority="50"/>
+    <w:lsdException w:name="List Table 6 Colorful" w:uiPriority="51"/>
+    <w:lsdException w:name="List Table 7 Colorful" w:uiPriority="52"/>
+    <w:lsdException w:name="List Table 1 Light Accent 1" w:uiPriority="46"/>
+    <w:lsdException w:name="List Table 2 Accent 1" w:uiPriority="47"/>
+    <w:lsdException w:name="List Table 3 Accent 1" w:uiPriority="48"/>
+    <w:lsdException w:name="List Table 4 Accent 1" w:uiPriority="49"/>
+    <w:lsdException w:name="List Table 5 Dark Accent 1" w:uiPriority="50"/>
+    <w:lsdException w:name="List Table 6 Colorful Accent 1" w:uiPriority="51"/>
+    <w:lsdException w:name="List Table 7 Colorful Accent 1" w:uiPriority="52"/>
+    <w:lsdException w:name="List Table 1 Light Accent 2" w:uiPriority="46"/>
+    <w:lsdException w:name="List Table 2 Accent 2" w:uiPriority="47"/>
+    <w:lsdException w:name="List Table 3 Accent 2" w:uiPriority="48"/>
+    <w:lsdException w:name="List Table 4 Accent 2" w:uiPriority="49"/>
+    <w:lsdException w:name="List Table 5 Dark Accent 2" w:uiPriority="50"/>
+    <w:lsdException w:name="List Table 6 Colorful Accent 2" w:uiPriority="51"/>
+    <w:lsdException w:name="List Table 7 Colorful Accent 2" w:uiPriority="52"/>
+    <w:lsdException w:name="List Table 1 Light Accent 3" w:uiPriority="46"/>
+    <w:lsdException w:name="List Table 2 Accent 3" w:uiPriority="47"/>
+    <w:lsdException w:name="List Table 3 Accent 3" w:uiPriority="48"/>
+    <w:lsdException w:name="List Table 4 Accent 3" w:uiPriority="49"/>
+    <w:lsdException w:name="List Table 5 Dark Accent 3" w:uiPriority="50"/>
+    <w:lsdException w:name="List Table 6 Colorful Accent 3" w:uiPriority="51"/>
+    <w:lsdException w:name="List Table 7 Colorful Accent 3" w:uiPriority="52"/>
+    <w:lsdException w:name="List Table 1 Light Accent 4" w:uiPriority="46"/>
+    <w:lsdException w:name="List Table 2 Accent 4" w:uiPriority="47"/>
+    <w:lsdException w:name="List Table 3 Accent 4" w:uiPriority="48"/>
+    <w:lsdException w:name="List Table 4 Accent 4" w:uiPriority="49"/>
+    <w:lsdException w:name="List Table 5 Dark Accent 4" w:uiPriority="50"/>
+    <w:lsdException w:name="List Table 6 Colorful Accent 4" w:uiPriority="51"/>
+    <w:lsdException w:name="List Table 7 Colorful Accent 4" w:uiPriority="52"/>
+    <w:lsdException w:name="List Table 1 Light Accent 5" w:uiPriority="46"/>
+    <w:lsdException w:name="List Table 2 Accent 5" w:uiPriority="47"/>
+    <w:lsdException w:name="List Table 3 Accent 5" w:uiPriority="48"/>
+    <w:lsdException w:name="List Table 4 Accent 5" w:uiPriority="49"/>
+    <w:lsdException w:name="List Table 5 Dark Accent 5" w:uiPriority="50"/>
+    <w:lsdException w:name="List Table 6 Colorful Accent 5" w:uiPriority="51"/>
+    <w:lsdException w:name="List Table 7 Colorful Accent 5" w:uiPriority="52"/>
+    <w:lsdException w:name="List Table 1 Light Accent 6" w:uiPriority="46"/>
+    <w:lsdException w:name="List Table 2 Accent 6" w:uiPriority="47"/>
+    <w:lsdException w:name="List Table 3 Accent 6" w:uiPriority="48"/>
+    <w:lsdException w:name="List Table 4 Accent 6" w:uiPriority="49"/>
+    <w:lsdException w:name="List Table 5 Dark Accent 6" w:uiPriority="50"/>
+    <w:lsdException w:name="List Table 6 Colorful Accent 6" w:uiPriority="51"/>
+    <w:lsdException w:name="List Table 7 Colorful Accent 6" w:uiPriority="52"/>
+    <w:lsdException w:name="Mention" w:semiHidden="1" w:unhideWhenUsed="1"/>
+    <w:lsdException w:name="Smart Hyperlink" w:semiHidden="1" w:unhideWhenUsed="1"/>
+    <w:lsdException w:name="Hashtag" w:semiHidden="1" w:unhideWhenUsed="1"/>
+    <w:lsdException w:name="Unresolved Mention" w:semiHidden="1" w:unhideWhenUsed="1"/>
+    <w:lsdException w:name="Smart Link" w:semiHidden="1" w:unhideWhenUsed="1"/>
+  </w:latentStyles>
   <w:style w:type="paragraph" w:default="1" w:styleId="Normal">
     <w:name w:val="Normal"/>
     <w:qFormat/>
+    <w:rsid w:val="000F627B"/>
+    <w:pPr>
+      <w:spacing w:after="0" w:line="360" w:lineRule="auto"/>
+      <w:ind w:firstLine="720"/>
+      <w:jc w:val="both"/>
+    </w:pPr>
+    <w:rPr>
+      <w:color w:val="000000" w:themeColor="text1"/>
+    </w:rPr>
   </w:style>
-  <w:style w:type="paragraph" w:styleId="BodyText">
-    <w:name w:val="Body Text"/>
+  <w:style w:type="paragraph" w:styleId="Heading1">
+    <w:name w:val="heading 1"/>
     <w:basedOn w:val="Normal"/>
-    <w:link w:val="BodyTextChar"/>
-    <w:pPr>
-      <w:spacing w:before="180" w:after="180"/>
-    </w:pPr>
+    <w:next w:val="Normal"/>
+    <w:link w:val="Heading1Char"/>
+    <w:uiPriority w:val="9"/>
     <w:qFormat/>
-  </w:style>
-  <w:style w:type="paragraph" w:customStyle="1" w:styleId="FirstParagraph">
-    <w:name w:val="First Paragraph"/>
-    <w:basedOn w:val="BodyText"/>
-    <w:next w:val="BodyText"/>
-    <w:qFormat/>
-  </w:style>
-  <w:style w:type="paragraph" w:customStyle="1" w:styleId="Compact">
-    <w:name w:val="Compact"/>
-    <w:basedOn w:val="BodyText"/>
-    <w:qFormat/>
-    <w:pPr>
-      <w:spacing w:before="36" w:after="36"/>
-    </w:pPr>
-  </w:style>
-  <w:style w:type="paragraph" w:styleId="Title">
-    <w:name w:val="Title"/>
-    <w:basedOn w:val="Normal"/>
-    <w:next w:val="BodyText"/>
-    <w:qFormat/>
+    <w:rsid w:val="00C941BA"/>
     <w:pPr>
       <w:keepNext/>
       <w:keepLines/>
-      <w:spacing w:before="480" w:after="240"/>
+      <w:numPr>
+        <w:numId w:val="2"/>
+      </w:numPr>
+      <w:spacing w:before="240" w:after="120"/>
       <w:jc w:val="center"/>
-    </w:pPr>
-    <w:rPr>
-      <w:rFonts w:asciiTheme="majorHAnsi" w:eastAsiaTheme="majorEastAsia" w:hAnsiTheme="majorHAnsi" w:cstheme="majorBidi"/>
-      <w:b/>
-      <w:bCs/>
-      <w:color w:val="345A8A" w:themeColor="accent1" w:themeShade="B5"/>
-      <w:sz w:val="36"/>
-      <w:szCs w:val="36"/>
-    </w:rPr>
-  </w:style>
-  <w:style w:type="paragraph" w:styleId="Subtitle">
-    <w:name w:val="Subtitle"/>
-    <w:basedOn w:val="Title"/>
-    <w:next w:val="BodyText"/>
-    <w:qFormat/>
-    <w:pPr>
-      <w:keepNext/>
-      <w:keepLines/>
-      <w:spacing w:before="240" w:after="240"/>
-      <w:jc w:val="center"/>
-    </w:pPr>
-    <w:rPr>
-      <w:sz w:val="30"/>
-      <w:szCs w:val="30"/>
-    </w:rPr>
-  </w:style>
-  <w:style w:type="paragraph" w:customStyle="1" w:styleId="Author">
-    <w:name w:val="Author"/>
-    <w:next w:val="BodyText"/>
-    <w:qFormat/>
-    <w:pPr>
-      <w:keepNext/>
-      <w:keepLines/>
-      <w:jc w:val="center"/>
-    </w:pPr>
-  </w:style>
-  <w:style w:type="paragraph" w:styleId="Date">
-    <w:name w:val="Date"/>
-    <w:next w:val="BodyText"/>
-    <w:qFormat/>
-    <w:pPr>
-      <w:keepNext/>
-      <w:keepLines/>
-      <w:jc w:val="center"/>
-    </w:pPr>
-  </w:style>
-  <w:style w:type="paragraph" w:customStyle="1" w:styleId="Abstract">
-    <w:name w:val="Abstract"/>
-    <w:basedOn w:val="Normal"/>
-    <w:next w:val="BodyText"/>
-    <w:qFormat/>
-    <w:pPr>
-      <w:keepNext/>
-      <w:keepLines/>
-      <w:spacing w:before="300" w:after="300"/>
-    </w:pPr>
-    <w:rPr>
-      <w:sz w:val="20"/>
-      <w:szCs w:val="20"/>
-    </w:rPr>
-  </w:style>
-  <w:style w:type="paragraph" w:styleId="Bibliography">
-    <w:name w:val="Bibliography"/>
-    <w:basedOn w:val="Normal"/>
-    <w:next w:val="Bibliography"/>
-    <w:qFormat/>
-    <w:pPr/>
-    <w:rPr/>
-  </w:style>
-  <w:style w:type="paragraph" w:styleId="Heading1">
-    <w:name w:val="Heading 1"/>
-    <w:basedOn w:val="Normal"/>
-    <w:next w:val="BodyText"/>
-    <w:uiPriority w:val="9"/>
-    <w:qFormat/>
-    <w:pPr>
-      <w:keepNext/>
-      <w:keepLines/>
-      <w:spacing w:before="480" w:after="0"/>
       <w:outlineLvl w:val="0"/>
     </w:pPr>
     <w:rPr>
       <w:rFonts w:asciiTheme="majorHAnsi" w:eastAsiaTheme="majorEastAsia" w:hAnsiTheme="majorHAnsi" w:cstheme="majorBidi"/>
       <w:b/>
-      <w:bCs/>
-      <w:color w:val="4F81BD" w:themeColor="accent1"/>
       <w:sz w:val="32"/>
-      <w:szCs w:val="32"/>
+      <w:szCs w:val="40"/>
     </w:rPr>
   </w:style>
   <w:style w:type="paragraph" w:styleId="Heading2">
-    <w:name w:val="Heading 2"/>
+    <w:name w:val="heading 2"/>
     <w:basedOn w:val="Normal"/>
-    <w:next w:val="BodyText"/>
+    <w:next w:val="Normal"/>
+    <w:link w:val="Heading2Char"/>
     <w:uiPriority w:val="9"/>
     <w:unhideWhenUsed/>
     <w:qFormat/>
+    <w:rsid w:val="00D21D0D"/>
     <w:pPr>
       <w:keepNext/>
       <w:keepLines/>
-      <w:spacing w:before="200" w:after="0"/>
+      <w:numPr>
+        <w:ilvl w:val="1"/>
+        <w:numId w:val="2"/>
+      </w:numPr>
+      <w:spacing w:before="120" w:after="120"/>
+      <w:ind w:left="850" w:hanging="850"/>
+      <w:jc w:val="left"/>
       <w:outlineLvl w:val="1"/>
     </w:pPr>
     <w:rPr>
       <w:rFonts w:asciiTheme="majorHAnsi" w:eastAsiaTheme="majorEastAsia" w:hAnsiTheme="majorHAnsi" w:cstheme="majorBidi"/>
       <w:b/>
-      <w:bCs/>
-      <w:color w:val="4F81BD" w:themeColor="accent1"/>
+      <w:color w:val="auto"/>
       <w:sz w:val="28"/>
+      <w:szCs w:val="32"/>
+    </w:rPr>
+  </w:style>
+  <w:style w:type="paragraph" w:styleId="Heading3">
+    <w:name w:val="heading 3"/>
+    <w:basedOn w:val="Normal"/>
+    <w:next w:val="Normal"/>
+    <w:link w:val="Heading3Char"/>
+    <w:uiPriority w:val="9"/>
+    <w:unhideWhenUsed/>
+    <w:qFormat/>
+    <w:rsid w:val="00D21D0D"/>
+    <w:pPr>
+      <w:keepNext/>
+      <w:keepLines/>
+      <w:numPr>
+        <w:ilvl w:val="2"/>
+        <w:numId w:val="2"/>
+      </w:numPr>
+      <w:spacing w:before="120" w:after="120"/>
+      <w:ind w:left="1138" w:hanging="1138"/>
+      <w:jc w:val="left"/>
+      <w:outlineLvl w:val="2"/>
+    </w:pPr>
+    <w:rPr>
+      <w:rFonts w:eastAsiaTheme="majorEastAsia" w:cstheme="majorBidi"/>
+      <w:b/>
+      <w:color w:val="auto"/>
       <w:szCs w:val="28"/>
     </w:rPr>
   </w:style>
-  <w:style w:type="paragraph" w:styleId="Heading3">
-    <w:name w:val="Heading 3"/>
+  <w:style w:type="paragraph" w:styleId="Heading4">
+    <w:name w:val="heading 4"/>
     <w:basedOn w:val="Normal"/>
-    <w:next w:val="BodyText"/>
+    <w:next w:val="Normal"/>
+    <w:link w:val="Heading4Char"/>
     <w:uiPriority w:val="9"/>
     <w:unhideWhenUsed/>
     <w:qFormat/>
+    <w:rsid w:val="00D21D0D"/>
     <w:pPr>
       <w:keepNext/>
       <w:keepLines/>
-      <w:spacing w:before="200" w:after="0"/>
-      <w:outlineLvl w:val="2"/>
+      <w:numPr>
+        <w:ilvl w:val="3"/>
+        <w:numId w:val="2"/>
+      </w:numPr>
+      <w:spacing w:before="120" w:after="120"/>
+      <w:ind w:left="1411" w:hanging="1411"/>
+      <w:jc w:val="left"/>
+      <w:outlineLvl w:val="3"/>
     </w:pPr>
     <w:rPr>
-      <w:rFonts w:asciiTheme="majorHAnsi" w:eastAsiaTheme="majorEastAsia" w:hAnsiTheme="majorHAnsi" w:cstheme="majorBidi"/>
+      <w:rFonts w:eastAsiaTheme="majorEastAsia" w:cstheme="majorBidi"/>
       <w:b/>
-      <w:bCs/>
-      <w:color w:val="4F81BD" w:themeColor="accent1"/>
-      <w:sz w:val="24"/>
-      <w:szCs w:val="24"/>
+      <w:iCs/>
+      <w:color w:val="auto"/>
     </w:rPr>
   </w:style>
-  <w:style w:type="paragraph" w:styleId="Heading4">
-    <w:name w:val="Heading 4"/>
+  <w:style w:type="paragraph" w:styleId="Heading5">
+    <w:name w:val="heading 5"/>
     <w:basedOn w:val="Normal"/>
-    <w:next w:val="BodyText"/>
+    <w:next w:val="Normal"/>
+    <w:link w:val="Heading5Char"/>
     <w:uiPriority w:val="9"/>
+    <w:semiHidden/>
     <w:unhideWhenUsed/>
     <w:qFormat/>
+    <w:rsid w:val="00FA0F06"/>
     <w:pPr>
       <w:keepNext/>
       <w:keepLines/>
-      <w:spacing w:before="200" w:after="0"/>
-      <w:outlineLvl w:val="3"/>
+      <w:spacing w:before="80" w:after="40"/>
+      <w:outlineLvl w:val="4"/>
     </w:pPr>
     <w:rPr>
-      <w:rFonts w:asciiTheme="majorHAnsi" w:eastAsiaTheme="majorEastAsia" w:hAnsiTheme="majorHAnsi" w:cstheme="majorBidi"/>
-      <w:i/>
-      <w:bCs/>
-      <w:color w:val="4F81BD" w:themeColor="accent1"/>
-      <w:sz w:val="24"/>
-      <w:szCs w:val="24"/>
+      <w:rFonts w:eastAsiaTheme="majorEastAsia" w:cstheme="majorBidi"/>
+      <w:color w:val="0F4761" w:themeColor="accent1" w:themeShade="BF"/>
     </w:rPr>
   </w:style>
-  <w:style w:type="paragraph" w:styleId="Heading5">
-    <w:name w:val="Heading 5"/>
+  <w:style w:type="paragraph" w:styleId="Heading6">
+    <w:name w:val="heading 6"/>
     <w:basedOn w:val="Normal"/>
-    <w:next w:val="BodyText"/>
+    <w:next w:val="Normal"/>
+    <w:link w:val="Heading6Char"/>
     <w:uiPriority w:val="9"/>
+    <w:semiHidden/>
     <w:unhideWhenUsed/>
     <w:qFormat/>
+    <w:rsid w:val="00FA0F06"/>
     <w:pPr>
       <w:keepNext/>
       <w:keepLines/>
-      <w:spacing w:before="200" w:after="0"/>
-      <w:outlineLvl w:val="4"/>
+      <w:spacing w:before="40"/>
+      <w:outlineLvl w:val="5"/>
     </w:pPr>
     <w:rPr>
-      <w:rFonts w:asciiTheme="majorHAnsi" w:eastAsiaTheme="majorEastAsia" w:hAnsiTheme="majorHAnsi" w:cstheme="majorBidi"/>
+      <w:rFonts w:eastAsiaTheme="majorEastAsia" w:cstheme="majorBidi"/>
+      <w:i/>
       <w:iCs/>
-      <w:color w:val="4F81BD" w:themeColor="accent1"/>
-      <w:sz w:val="24"/>
-      <w:szCs w:val="24"/>
+      <w:color w:val="595959" w:themeColor="text1" w:themeTint="A6"/>
     </w:rPr>
   </w:style>
-  <w:style w:type="paragraph" w:styleId="Heading6">
-    <w:name w:val="Heading 6"/>
+  <w:style w:type="paragraph" w:styleId="Heading7">
+    <w:name w:val="heading 7"/>
     <w:basedOn w:val="Normal"/>
-    <w:next w:val="BodyText"/>
+    <w:next w:val="Normal"/>
+    <w:link w:val="Heading7Char"/>
     <w:uiPriority w:val="9"/>
+    <w:semiHidden/>
     <w:unhideWhenUsed/>
     <w:qFormat/>
+    <w:rsid w:val="00FA0F06"/>
     <w:pPr>
       <w:keepNext/>
       <w:keepLines/>
-      <w:spacing w:before="200" w:after="0"/>
-      <w:outlineLvl w:val="5"/>
+      <w:spacing w:before="40"/>
+      <w:outlineLvl w:val="6"/>
     </w:pPr>
     <w:rPr>
-      <w:rFonts w:asciiTheme="majorHAnsi" w:eastAsiaTheme="majorEastAsia" w:hAnsiTheme="majorHAnsi" w:cstheme="majorBidi"/>
-      <w:color w:val="4F81BD" w:themeColor="accent1"/>
-      <w:sz w:val="24"/>
-      <w:szCs w:val="24"/>
+      <w:rFonts w:eastAsiaTheme="majorEastAsia" w:cstheme="majorBidi"/>
+      <w:color w:val="595959" w:themeColor="text1" w:themeTint="A6"/>
     </w:rPr>
   </w:style>
-  <w:style w:type="paragraph" w:styleId="Heading7">
-    <w:name w:val="Heading 7"/>
+  <w:style w:type="paragraph" w:styleId="Heading8">
+    <w:name w:val="heading 8"/>
     <w:basedOn w:val="Normal"/>
-    <w:next w:val="BodyText"/>
+    <w:next w:val="Normal"/>
+    <w:link w:val="Heading8Char"/>
     <w:uiPriority w:val="9"/>
+    <w:semiHidden/>
     <w:unhideWhenUsed/>
     <w:qFormat/>
+    <w:rsid w:val="00FA0F06"/>
     <w:pPr>
       <w:keepNext/>
       <w:keepLines/>
-      <w:spacing w:before="200" w:after="0"/>
-      <w:outlineLvl w:val="6"/>
+      <w:outlineLvl w:val="7"/>
     </w:pPr>
     <w:rPr>
-      <w:rFonts w:asciiTheme="majorHAnsi" w:eastAsiaTheme="majorEastAsia" w:hAnsiTheme="majorHAnsi" w:cstheme="majorBidi"/>
-      <w:color w:val="4F81BD" w:themeColor="accent1"/>
-      <w:sz w:val="24"/>
-      <w:szCs w:val="24"/>
+      <w:rFonts w:eastAsiaTheme="majorEastAsia" w:cstheme="majorBidi"/>
+      <w:i/>
+      <w:iCs/>
+      <w:color w:val="272727" w:themeColor="text1" w:themeTint="D8"/>
     </w:rPr>
   </w:style>
-  <w:style w:type="paragraph" w:styleId="Heading8">
-    <w:name w:val="Heading 8"/>
+  <w:style w:type="paragraph" w:styleId="Heading9">
+    <w:name w:val="heading 9"/>
     <w:basedOn w:val="Normal"/>
-    <w:next w:val="BodyText"/>
+    <w:next w:val="Normal"/>
+    <w:link w:val="Heading9Char"/>
     <w:uiPriority w:val="9"/>
+    <w:semiHidden/>
     <w:unhideWhenUsed/>
     <w:qFormat/>
+    <w:rsid w:val="00FA0F06"/>
     <w:pPr>
       <w:keepNext/>
       <w:keepLines/>
-      <w:spacing w:before="200" w:after="0"/>
-      <w:outlineLvl w:val="7"/>
-    </w:pPr>
-    <w:rPr>
-      <w:rFonts w:asciiTheme="majorHAnsi" w:eastAsiaTheme="majorEastAsia" w:hAnsiTheme="majorHAnsi" w:cstheme="majorBidi"/>
-      <w:color w:val="4F81BD" w:themeColor="accent1"/>
-      <w:sz w:val="24"/>
-      <w:szCs w:val="24"/>
-    </w:rPr>
-  </w:style>
-  <w:style w:type="paragraph" w:styleId="Heading9">
-    <w:name w:val="Heading 9"/>
-    <w:basedOn w:val="Normal"/>
-    <w:next w:val="BodyText"/>
-    <w:uiPriority w:val="9"/>
-    <w:unhideWhenUsed/>
-    <w:qFormat/>
-    <w:pPr>
-      <w:keepNext/>
-      <w:keepLines/>
-      <w:spacing w:before="200" w:after="0"/>
       <w:outlineLvl w:val="8"/>
     </w:pPr>
     <w:rPr>
-      <w:rFonts w:asciiTheme="majorHAnsi" w:eastAsiaTheme="majorEastAsia" w:hAnsiTheme="majorHAnsi" w:cstheme="majorBidi"/>
-      <w:color w:val="4F81BD" w:themeColor="accent1"/>
-      <w:sz w:val="24"/>
-      <w:szCs w:val="24"/>
+      <w:rFonts w:eastAsiaTheme="majorEastAsia" w:cstheme="majorBidi"/>
+      <w:color w:val="272727" w:themeColor="text1" w:themeTint="D8"/>
     </w:rPr>
-  </w:style>
-  <w:style w:type="paragraph" w:styleId="BlockText">
-    <w:name w:val="Block Text"/>
-    <w:basedOn w:val="BodyText"/>
-    <w:next w:val="BodyText"/>
-    <w:uiPriority w:val="9"/>
-    <w:unhideWhenUsed/>
-    <w:qFormat/>
-    <w:pPr>
-      <w:spacing w:before="100" w:after="100"/>
-      <w:ind w:firstLine="0" w:left="480" w:right="480"/>
-    </w:pPr>
-  </w:style>
-  <w:style w:type="paragraph" w:styleId="FootnoteText">
-    <w:name w:val="Footnote Text"/>
-    <w:basedOn w:val="Normal"/>
-    <w:next w:val="FootnoteText"/>
-    <w:uiPriority w:val="9"/>
-    <w:unhideWhenUsed/>
-    <w:qFormat/>
   </w:style>
   <w:style w:type="character" w:default="1" w:styleId="DefaultParagraphFont">
     <w:name w:val="Default Paragraph Font"/>
+    <w:uiPriority w:val="1"/>
+    <w:unhideWhenUsed/>
+  </w:style>
+  <w:style w:type="table" w:default="1" w:styleId="TableNormal">
+    <w:name w:val="Normal Table"/>
+    <w:uiPriority w:val="99"/>
     <w:semiHidden/>
     <w:unhideWhenUsed/>
-  </w:style>
-  <w:style w:type="table" w:default="1" w:styleId="Table">
-    <w:name w:val="Table"/>
-    <w:basedOn w:val="TableNormal"/>
-    <w:semiHidden/>
-    <w:unhideWhenUsed/>
-    <w:qFormat/>
     <w:tblPr>
       <w:tblInd w:w="0" w:type="dxa"/>
       <w:tblCellMar>
@@ -42269,99 +42802,391 @@
       </w:tblCellMar>
     </w:tblPr>
   </w:style>
-  <w:style w:type="paragraph" w:customStyle="1" w:styleId="DefinitionTerm">
-    <w:name w:val="Definition Term"/>
+  <w:style w:type="numbering" w:default="1" w:styleId="NoList">
+    <w:name w:val="No List"/>
+    <w:uiPriority w:val="99"/>
+    <w:semiHidden/>
+    <w:unhideWhenUsed/>
+  </w:style>
+  <w:style w:type="character" w:customStyle="1" w:styleId="Heading1Char">
+    <w:name w:val="Heading 1 Char"/>
+    <w:basedOn w:val="DefaultParagraphFont"/>
+    <w:link w:val="Heading1"/>
+    <w:uiPriority w:val="9"/>
+    <w:rsid w:val="000F627B"/>
+    <w:rPr>
+      <w:rFonts w:asciiTheme="majorHAnsi" w:eastAsiaTheme="majorEastAsia" w:hAnsiTheme="majorHAnsi" w:cstheme="majorBidi"/>
+      <w:b/>
+      <w:color w:val="000000" w:themeColor="text1"/>
+      <w:sz w:val="32"/>
+      <w:szCs w:val="40"/>
+    </w:rPr>
+  </w:style>
+  <w:style w:type="character" w:customStyle="1" w:styleId="Heading2Char">
+    <w:name w:val="Heading 2 Char"/>
+    <w:basedOn w:val="DefaultParagraphFont"/>
+    <w:link w:val="Heading2"/>
+    <w:uiPriority w:val="9"/>
+    <w:rsid w:val="00D21D0D"/>
+    <w:rPr>
+      <w:rFonts w:asciiTheme="majorHAnsi" w:eastAsiaTheme="majorEastAsia" w:hAnsiTheme="majorHAnsi" w:cstheme="majorBidi"/>
+      <w:b/>
+      <w:sz w:val="28"/>
+      <w:szCs w:val="32"/>
+    </w:rPr>
+  </w:style>
+  <w:style w:type="character" w:customStyle="1" w:styleId="Heading3Char">
+    <w:name w:val="Heading 3 Char"/>
+    <w:basedOn w:val="DefaultParagraphFont"/>
+    <w:link w:val="Heading3"/>
+    <w:uiPriority w:val="9"/>
+    <w:rsid w:val="00D21D0D"/>
+    <w:rPr>
+      <w:rFonts w:eastAsiaTheme="majorEastAsia" w:cstheme="majorBidi"/>
+      <w:b/>
+      <w:szCs w:val="28"/>
+    </w:rPr>
+  </w:style>
+  <w:style w:type="character" w:customStyle="1" w:styleId="Heading4Char">
+    <w:name w:val="Heading 4 Char"/>
+    <w:basedOn w:val="DefaultParagraphFont"/>
+    <w:link w:val="Heading4"/>
+    <w:uiPriority w:val="9"/>
+    <w:rsid w:val="00D21D0D"/>
+    <w:rPr>
+      <w:rFonts w:eastAsiaTheme="majorEastAsia" w:cstheme="majorBidi"/>
+      <w:b/>
+      <w:iCs/>
+    </w:rPr>
+  </w:style>
+  <w:style w:type="character" w:customStyle="1" w:styleId="Heading5Char">
+    <w:name w:val="Heading 5 Char"/>
+    <w:basedOn w:val="DefaultParagraphFont"/>
+    <w:link w:val="Heading5"/>
+    <w:uiPriority w:val="9"/>
+    <w:semiHidden/>
+    <w:rsid w:val="00FA0F06"/>
+    <w:rPr>
+      <w:rFonts w:eastAsiaTheme="majorEastAsia" w:cstheme="majorBidi"/>
+      <w:color w:val="0F4761" w:themeColor="accent1" w:themeShade="BF"/>
+    </w:rPr>
+  </w:style>
+  <w:style w:type="character" w:customStyle="1" w:styleId="Heading6Char">
+    <w:name w:val="Heading 6 Char"/>
+    <w:basedOn w:val="DefaultParagraphFont"/>
+    <w:link w:val="Heading6"/>
+    <w:uiPriority w:val="9"/>
+    <w:semiHidden/>
+    <w:rsid w:val="00FA0F06"/>
+    <w:rPr>
+      <w:rFonts w:eastAsiaTheme="majorEastAsia" w:cstheme="majorBidi"/>
+      <w:i/>
+      <w:iCs/>
+      <w:color w:val="595959" w:themeColor="text1" w:themeTint="A6"/>
+    </w:rPr>
+  </w:style>
+  <w:style w:type="character" w:customStyle="1" w:styleId="Heading7Char">
+    <w:name w:val="Heading 7 Char"/>
+    <w:basedOn w:val="DefaultParagraphFont"/>
+    <w:link w:val="Heading7"/>
+    <w:uiPriority w:val="9"/>
+    <w:semiHidden/>
+    <w:rsid w:val="00FA0F06"/>
+    <w:rPr>
+      <w:rFonts w:eastAsiaTheme="majorEastAsia" w:cstheme="majorBidi"/>
+      <w:color w:val="595959" w:themeColor="text1" w:themeTint="A6"/>
+    </w:rPr>
+  </w:style>
+  <w:style w:type="character" w:customStyle="1" w:styleId="Heading8Char">
+    <w:name w:val="Heading 8 Char"/>
+    <w:basedOn w:val="DefaultParagraphFont"/>
+    <w:link w:val="Heading8"/>
+    <w:uiPriority w:val="9"/>
+    <w:semiHidden/>
+    <w:rsid w:val="00FA0F06"/>
+    <w:rPr>
+      <w:rFonts w:eastAsiaTheme="majorEastAsia" w:cstheme="majorBidi"/>
+      <w:i/>
+      <w:iCs/>
+      <w:color w:val="272727" w:themeColor="text1" w:themeTint="D8"/>
+    </w:rPr>
+  </w:style>
+  <w:style w:type="character" w:customStyle="1" w:styleId="Heading9Char">
+    <w:name w:val="Heading 9 Char"/>
+    <w:basedOn w:val="DefaultParagraphFont"/>
+    <w:link w:val="Heading9"/>
+    <w:uiPriority w:val="9"/>
+    <w:semiHidden/>
+    <w:rsid w:val="00FA0F06"/>
+    <w:rPr>
+      <w:rFonts w:eastAsiaTheme="majorEastAsia" w:cstheme="majorBidi"/>
+      <w:color w:val="272727" w:themeColor="text1" w:themeTint="D8"/>
+    </w:rPr>
+  </w:style>
+  <w:style w:type="paragraph" w:styleId="Title">
+    <w:name w:val="Title"/>
     <w:basedOn w:val="Normal"/>
-    <w:next w:val="Definition"/>
+    <w:next w:val="Normal"/>
+    <w:link w:val="TitleChar"/>
+    <w:uiPriority w:val="10"/>
+    <w:qFormat/>
+    <w:rsid w:val="00DC3B55"/>
     <w:pPr>
-      <w:keepNext/>
-      <w:keepLines/>
-      <w:spacing w:after="0"/>
+      <w:spacing w:after="80" w:line="240" w:lineRule="auto"/>
+      <w:contextualSpacing/>
+      <w:jc w:val="center"/>
     </w:pPr>
     <w:rPr>
+      <w:rFonts w:asciiTheme="majorHAnsi" w:eastAsiaTheme="majorEastAsia" w:hAnsiTheme="majorHAnsi" w:cstheme="majorBidi"/>
       <w:b/>
+      <w:spacing w:val="-10"/>
+      <w:kern w:val="28"/>
+      <w:sz w:val="32"/>
+      <w:szCs w:val="56"/>
     </w:rPr>
   </w:style>
-  <w:style w:type="paragraph" w:customStyle="1" w:styleId="Definition">
-    <w:name w:val="Definition"/>
+  <w:style w:type="character" w:customStyle="1" w:styleId="TitleChar">
+    <w:name w:val="Title Char"/>
+    <w:basedOn w:val="DefaultParagraphFont"/>
+    <w:link w:val="Title"/>
+    <w:uiPriority w:val="10"/>
+    <w:rsid w:val="00DC3B55"/>
+    <w:rPr>
+      <w:rFonts w:asciiTheme="majorHAnsi" w:eastAsiaTheme="majorEastAsia" w:hAnsiTheme="majorHAnsi" w:cstheme="majorBidi"/>
+      <w:b/>
+      <w:spacing w:val="-10"/>
+      <w:kern w:val="28"/>
+      <w:sz w:val="32"/>
+      <w:szCs w:val="56"/>
+    </w:rPr>
+  </w:style>
+  <w:style w:type="paragraph" w:styleId="Subtitle">
+    <w:name w:val="Subtitle"/>
     <w:basedOn w:val="Normal"/>
+    <w:next w:val="Normal"/>
+    <w:link w:val="SubtitleChar"/>
+    <w:uiPriority w:val="11"/>
+    <w:qFormat/>
+    <w:rsid w:val="00FA0F06"/>
+    <w:pPr>
+      <w:numPr>
+        <w:ilvl w:val="1"/>
+      </w:numPr>
+      <w:ind w:firstLine="720"/>
+    </w:pPr>
+    <w:rPr>
+      <w:rFonts w:eastAsiaTheme="majorEastAsia" w:cstheme="majorBidi"/>
+      <w:color w:val="595959" w:themeColor="text1" w:themeTint="A6"/>
+      <w:spacing w:val="15"/>
+      <w:sz w:val="28"/>
+      <w:szCs w:val="28"/>
+    </w:rPr>
   </w:style>
-  <w:style w:type="paragraph" w:styleId="Caption">
-    <w:name w:val="Caption"/>
+  <w:style w:type="character" w:customStyle="1" w:styleId="SubtitleChar">
+    <w:name w:val="Subtitle Char"/>
+    <w:basedOn w:val="DefaultParagraphFont"/>
+    <w:link w:val="Subtitle"/>
+    <w:uiPriority w:val="11"/>
+    <w:rsid w:val="00FA0F06"/>
+    <w:rPr>
+      <w:rFonts w:eastAsiaTheme="majorEastAsia" w:cstheme="majorBidi"/>
+      <w:color w:val="595959" w:themeColor="text1" w:themeTint="A6"/>
+      <w:spacing w:val="15"/>
+      <w:sz w:val="28"/>
+      <w:szCs w:val="28"/>
+    </w:rPr>
+  </w:style>
+  <w:style w:type="paragraph" w:styleId="Quote">
+    <w:name w:val="Quote"/>
     <w:basedOn w:val="Normal"/>
-    <w:link w:val="BodyTextChar"/>
+    <w:next w:val="Normal"/>
+    <w:link w:val="QuoteChar"/>
+    <w:uiPriority w:val="29"/>
+    <w:qFormat/>
+    <w:rsid w:val="00FA0F06"/>
     <w:pPr>
-      <w:spacing w:before="0" w:after="120"/>
+      <w:spacing w:before="160"/>
+      <w:jc w:val="center"/>
     </w:pPr>
     <w:rPr>
       <w:i/>
+      <w:iCs/>
+      <w:color w:val="404040" w:themeColor="text1" w:themeTint="BF"/>
     </w:rPr>
+  </w:style>
+  <w:style w:type="character" w:customStyle="1" w:styleId="QuoteChar">
+    <w:name w:val="Quote Char"/>
+    <w:basedOn w:val="DefaultParagraphFont"/>
+    <w:link w:val="Quote"/>
+    <w:uiPriority w:val="29"/>
+    <w:rsid w:val="00FA0F06"/>
+    <w:rPr>
+      <w:i/>
+      <w:iCs/>
+      <w:color w:val="404040" w:themeColor="text1" w:themeTint="BF"/>
+    </w:rPr>
+  </w:style>
+  <w:style w:type="paragraph" w:styleId="ListParagraph">
+    <w:name w:val="List Paragraph"/>
+    <w:basedOn w:val="Normal"/>
+    <w:uiPriority w:val="34"/>
+    <w:qFormat/>
+    <w:rsid w:val="00FA0F06"/>
+    <w:pPr>
+      <w:ind w:left="720"/>
+      <w:contextualSpacing/>
+    </w:pPr>
+  </w:style>
+  <w:style w:type="character" w:styleId="IntenseEmphasis">
+    <w:name w:val="Intense Emphasis"/>
+    <w:basedOn w:val="DefaultParagraphFont"/>
+    <w:uiPriority w:val="21"/>
+    <w:qFormat/>
+    <w:rsid w:val="00FA0F06"/>
+    <w:rPr>
+      <w:i/>
+      <w:iCs/>
+      <w:color w:val="0F4761" w:themeColor="accent1" w:themeShade="BF"/>
+    </w:rPr>
+  </w:style>
+  <w:style w:type="paragraph" w:styleId="IntenseQuote">
+    <w:name w:val="Intense Quote"/>
+    <w:basedOn w:val="Normal"/>
+    <w:next w:val="Normal"/>
+    <w:link w:val="IntenseQuoteChar"/>
+    <w:uiPriority w:val="30"/>
+    <w:qFormat/>
+    <w:rsid w:val="00FA0F06"/>
+    <w:pPr>
+      <w:pBdr>
+        <w:top w:val="single" w:sz="4" w:space="10" w:color="0F4761" w:themeColor="accent1" w:themeShade="BF"/>
+        <w:bottom w:val="single" w:sz="4" w:space="10" w:color="0F4761" w:themeColor="accent1" w:themeShade="BF"/>
+      </w:pBdr>
+      <w:spacing w:before="360" w:after="360"/>
+      <w:ind w:left="864" w:right="864"/>
+      <w:jc w:val="center"/>
+    </w:pPr>
+    <w:rPr>
+      <w:i/>
+      <w:iCs/>
+      <w:color w:val="0F4761" w:themeColor="accent1" w:themeShade="BF"/>
+    </w:rPr>
+  </w:style>
+  <w:style w:type="character" w:customStyle="1" w:styleId="IntenseQuoteChar">
+    <w:name w:val="Intense Quote Char"/>
+    <w:basedOn w:val="DefaultParagraphFont"/>
+    <w:link w:val="IntenseQuote"/>
+    <w:uiPriority w:val="30"/>
+    <w:rsid w:val="00FA0F06"/>
+    <w:rPr>
+      <w:i/>
+      <w:iCs/>
+      <w:color w:val="0F4761" w:themeColor="accent1" w:themeShade="BF"/>
+    </w:rPr>
+  </w:style>
+  <w:style w:type="character" w:styleId="IntenseReference">
+    <w:name w:val="Intense Reference"/>
+    <w:basedOn w:val="DefaultParagraphFont"/>
+    <w:uiPriority w:val="32"/>
+    <w:qFormat/>
+    <w:rsid w:val="00FA0F06"/>
+    <w:rPr>
+      <w:b/>
+      <w:bCs/>
+      <w:smallCaps/>
+      <w:color w:val="0F4761" w:themeColor="accent1" w:themeShade="BF"/>
+      <w:spacing w:val="5"/>
+    </w:rPr>
+  </w:style>
+  <w:style w:type="paragraph" w:styleId="Header">
+    <w:name w:val="header"/>
+    <w:basedOn w:val="Normal"/>
+    <w:link w:val="HeaderChar"/>
+    <w:uiPriority w:val="99"/>
+    <w:unhideWhenUsed/>
+    <w:rsid w:val="000F627B"/>
+    <w:pPr>
+      <w:tabs>
+        <w:tab w:val="center" w:pos="4513"/>
+        <w:tab w:val="right" w:pos="9026"/>
+      </w:tabs>
+      <w:spacing w:line="240" w:lineRule="auto"/>
+    </w:pPr>
+  </w:style>
+  <w:style w:type="character" w:customStyle="1" w:styleId="HeaderChar">
+    <w:name w:val="Header Char"/>
+    <w:basedOn w:val="DefaultParagraphFont"/>
+    <w:link w:val="Header"/>
+    <w:uiPriority w:val="99"/>
+    <w:rsid w:val="000F627B"/>
+  </w:style>
+  <w:style w:type="paragraph" w:styleId="Footer">
+    <w:name w:val="footer"/>
+    <w:basedOn w:val="Normal"/>
+    <w:link w:val="FooterChar"/>
+    <w:uiPriority w:val="99"/>
+    <w:unhideWhenUsed/>
+    <w:rsid w:val="000F627B"/>
+    <w:pPr>
+      <w:tabs>
+        <w:tab w:val="center" w:pos="4513"/>
+        <w:tab w:val="right" w:pos="9026"/>
+      </w:tabs>
+      <w:spacing w:line="240" w:lineRule="auto"/>
+    </w:pPr>
+  </w:style>
+  <w:style w:type="character" w:customStyle="1" w:styleId="FooterChar">
+    <w:name w:val="Footer Char"/>
+    <w:basedOn w:val="DefaultParagraphFont"/>
+    <w:link w:val="Footer"/>
+    <w:uiPriority w:val="99"/>
+    <w:rsid w:val="000F627B"/>
   </w:style>
   <w:style w:type="paragraph" w:customStyle="1" w:styleId="TableCaption">
     <w:name w:val="Table Caption"/>
     <w:basedOn w:val="Caption"/>
+    <w:qFormat/>
+    <w:rsid w:val="006C1819"/>
     <w:pPr>
-      <w:keepNext/>
+      <w:spacing w:before="120" w:after="60"/>
+      <w:jc w:val="center"/>
     </w:pPr>
-  </w:style>
-  <w:style w:type="paragraph" w:customStyle="1" w:styleId="ImageCaption">
-    <w:name w:val="Image Caption"/>
-    <w:basedOn w:val="Caption"/>
-  </w:style>
-  <w:style w:type="paragraph" w:customStyle="1" w:styleId="Figure">
-    <w:name w:val="Figure"/>
-    <w:basedOn w:val="Normal"/>
-  </w:style>
-  <w:style w:type="paragraph" w:customStyle="1" w:styleId="CaptionedFigure">
-    <w:name w:val="Captioned Figure"/>
-    <w:basedOn w:val="Figure"/>
-    <w:pPr>
-      <w:keepNext/>
-    </w:pPr>
-  </w:style>
-  <w:style w:type="character" w:customStyle="1" w:styleId="BodyTextChar">
-    <w:name w:val="Body Text Char"/>
-    <w:basedOn w:val="DefaultParagraphFont"/>
-    <w:link w:val="BodyText"/>
-  </w:style>
-  <w:style w:type="character" w:customStyle="1" w:styleId="VerbatimChar">
-    <w:name w:val="Verbatim Char"/>
-    <w:basedOn w:val="BodyTextChar"/>
     <w:rPr>
-      <w:rFonts w:ascii="Consolas" w:hAnsi="Consolas"/>
-      <w:sz w:val="22"/>
+      <w:color w:val="000000" w:themeColor="text1"/>
+      <w:sz w:val="24"/>
+      <w:lang w:val="en-US"/>
     </w:rPr>
   </w:style>
-  <w:style w:type="character" w:styleId="FootnoteReference">
-    <w:name w:val="Footnote Reference"/>
-    <w:basedOn w:val="BodyTextChar"/>
+  <w:style w:type="paragraph" w:styleId="Caption">
+    <w:name w:val="caption"/>
+    <w:basedOn w:val="Normal"/>
+    <w:next w:val="Normal"/>
+    <w:uiPriority w:val="35"/>
+    <w:unhideWhenUsed/>
+    <w:qFormat/>
+    <w:rsid w:val="00D21D0D"/>
+    <w:pPr>
+      <w:spacing w:after="200" w:line="240" w:lineRule="auto"/>
+    </w:pPr>
     <w:rPr>
-      <w:vertAlign w:val="superscript"/>
+      <w:i/>
+      <w:iCs/>
+      <w:color w:val="0E2841" w:themeColor="text2"/>
+      <w:sz w:val="18"/>
+      <w:szCs w:val="18"/>
     </w:rPr>
   </w:style>
-  <w:style w:type="character" w:styleId="Hyperlink">
-    <w:name w:val="Hyperlink"/>
-    <w:basedOn w:val="BodyTextChar"/>
-    <w:rPr>
-      <w:color w:val="4F81BD" w:themeColor="accent1"/>
-    </w:rPr>
-  </w:style>
-  <w:style w:type="paragraph" w:styleId="TOCHeading">
-    <w:name w:val="TOC Heading"/>
-    <w:basedOn w:val="Heading1"/>
-    <w:next w:val="BodyText"/>
-    <w:uiPriority w:val="39"/>
-    <w:unhideWhenUsed/>
+  <w:style w:type="paragraph" w:customStyle="1" w:styleId="FigureCaption">
+    <w:name w:val="Figure Caption"/>
+    <w:basedOn w:val="Caption"/>
     <w:qFormat/>
+    <w:rsid w:val="002A65D4"/>
     <w:pPr>
-      <w:spacing w:before="240" w:line="259" w:lineRule="auto"/>
-      <w:outlineLvl w:val="9"/>
+      <w:jc w:val="center"/>
     </w:pPr>
     <w:rPr>
-      <w:rFonts w:asciiTheme="majorHAnsi" w:eastAsiaTheme="majorEastAsia" w:hAnsiTheme="majorHAnsi" w:cstheme="majorBidi"/>
-      <w:b w:val="0"/>
-      <w:bCs w:val="0"/>
-      <w:color w:val="365F91" w:themeColor="accent1" w:themeShade="BF"/>
+      <w:color w:val="000000" w:themeColor="text1"/>
+      <w:sz w:val="24"/>
     </w:rPr>
   </w:style>
   <w:style w:type="paragraph" w:customStyle="1" w:styleId="SourceCode">
@@ -42370,13 +43195,15 @@
     <w:link w:val="VerbatimChar"/>
     <w:pPr>
       <w:wordWrap w:val="off"/>
+      <w:shd w:val="clear" w:fill="f8f8f8"/>
     </w:pPr>
   </w:style>
   <w:style w:type="character" w:customStyle="1" w:styleId="KeywordTok">
     <w:name w:val="KeywordTok"/>
     <w:basedOn w:val="VerbatimChar"/>
     <w:rPr>
-      <w:color w:val="007020"/>
+      <w:color w:val="204a87"/>
+      <w:shd w:val="clear" w:fill="f8f8f8"/>
       <w:b/>
     </w:rPr>
   </w:style>
@@ -42384,82 +43211,95 @@
     <w:name w:val="DataTypeTok"/>
     <w:basedOn w:val="VerbatimChar"/>
     <w:rPr>
-      <w:color w:val="902000"/>
+      <w:color w:val="204a87"/>
+      <w:shd w:val="clear" w:fill="f8f8f8"/>
     </w:rPr>
   </w:style>
   <w:style w:type="character" w:customStyle="1" w:styleId="DecValTok">
     <w:name w:val="DecValTok"/>
     <w:basedOn w:val="VerbatimChar"/>
     <w:rPr>
-      <w:color w:val="40a070"/>
+      <w:color w:val="0000cf"/>
+      <w:shd w:val="clear" w:fill="f8f8f8"/>
     </w:rPr>
   </w:style>
   <w:style w:type="character" w:customStyle="1" w:styleId="BaseNTok">
     <w:name w:val="BaseNTok"/>
     <w:basedOn w:val="VerbatimChar"/>
     <w:rPr>
-      <w:color w:val="40a070"/>
+      <w:color w:val="0000cf"/>
+      <w:shd w:val="clear" w:fill="f8f8f8"/>
     </w:rPr>
   </w:style>
   <w:style w:type="character" w:customStyle="1" w:styleId="FloatTok">
     <w:name w:val="FloatTok"/>
     <w:basedOn w:val="VerbatimChar"/>
     <w:rPr>
-      <w:color w:val="40a070"/>
+      <w:color w:val="0000cf"/>
+      <w:shd w:val="clear" w:fill="f8f8f8"/>
     </w:rPr>
   </w:style>
   <w:style w:type="character" w:customStyle="1" w:styleId="ConstantTok">
     <w:name w:val="ConstantTok"/>
     <w:basedOn w:val="VerbatimChar"/>
     <w:rPr>
-      <w:color w:val="880000"/>
+      <w:color w:val="000000"/>
+      <w:shd w:val="clear" w:fill="f8f8f8"/>
     </w:rPr>
   </w:style>
   <w:style w:type="character" w:customStyle="1" w:styleId="CharTok">
     <w:name w:val="CharTok"/>
     <w:basedOn w:val="VerbatimChar"/>
     <w:rPr>
-      <w:color w:val="4070a0"/>
+      <w:color w:val="4e9a06"/>
+      <w:shd w:val="clear" w:fill="f8f8f8"/>
     </w:rPr>
   </w:style>
   <w:style w:type="character" w:customStyle="1" w:styleId="SpecialCharTok">
     <w:name w:val="SpecialCharTok"/>
     <w:basedOn w:val="VerbatimChar"/>
     <w:rPr>
-      <w:color w:val="4070a0"/>
+      <w:color w:val="000000"/>
+      <w:shd w:val="clear" w:fill="f8f8f8"/>
     </w:rPr>
   </w:style>
   <w:style w:type="character" w:customStyle="1" w:styleId="StringTok">
     <w:name w:val="StringTok"/>
     <w:basedOn w:val="VerbatimChar"/>
     <w:rPr>
-      <w:color w:val="4070a0"/>
+      <w:color w:val="4e9a06"/>
+      <w:shd w:val="clear" w:fill="f8f8f8"/>
     </w:rPr>
   </w:style>
   <w:style w:type="character" w:customStyle="1" w:styleId="VerbatimStringTok">
     <w:name w:val="VerbatimStringTok"/>
     <w:basedOn w:val="VerbatimChar"/>
     <w:rPr>
-      <w:color w:val="4070a0"/>
+      <w:color w:val="4e9a06"/>
+      <w:shd w:val="clear" w:fill="f8f8f8"/>
     </w:rPr>
   </w:style>
   <w:style w:type="character" w:customStyle="1" w:styleId="SpecialStringTok">
     <w:name w:val="SpecialStringTok"/>
     <w:basedOn w:val="VerbatimChar"/>
     <w:rPr>
-      <w:color w:val="bb6688"/>
+      <w:color w:val="4e9a06"/>
+      <w:shd w:val="clear" w:fill="f8f8f8"/>
     </w:rPr>
   </w:style>
   <w:style w:type="character" w:customStyle="1" w:styleId="ImportTok">
     <w:name w:val="ImportTok"/>
     <w:basedOn w:val="VerbatimChar"/>
-    <w:rPr/>
+    <w:rPr>
+      <w:shd w:val="clear" w:fill="f8f8f8"/>
+    </w:rPr>
   </w:style>
   <w:style w:type="character" w:customStyle="1" w:styleId="CommentTok">
     <w:name w:val="CommentTok"/>
     <w:basedOn w:val="VerbatimChar"/>
     <w:rPr>
-      <w:color w:val="60a0b0"/>
+      <w:color w:val="8f5902"/>
+      <w:shd w:val="clear" w:fill="f8f8f8"/>
       <w:i/>
     </w:rPr>
   </w:style>
@@ -42467,7 +43307,9 @@
     <w:name w:val="DocumentationTok"/>
     <w:basedOn w:val="VerbatimChar"/>
     <w:rPr>
-      <w:color w:val="ba2121"/>
+      <w:color w:val="8f5902"/>
+      <w:shd w:val="clear" w:fill="f8f8f8"/>
+      <w:b/>
       <w:i/>
     </w:rPr>
   </w:style>
@@ -42475,7 +43317,8 @@
     <w:name w:val="AnnotationTok"/>
     <w:basedOn w:val="VerbatimChar"/>
     <w:rPr>
-      <w:color w:val="60a0b0"/>
+      <w:color w:val="8f5902"/>
+      <w:shd w:val="clear" w:fill="f8f8f8"/>
       <w:b/>
       <w:i/>
     </w:rPr>
@@ -42484,7 +43327,8 @@
     <w:name w:val="CommentVarTok"/>
     <w:basedOn w:val="VerbatimChar"/>
     <w:rPr>
-      <w:color w:val="60a0b0"/>
+      <w:color w:val="8f5902"/>
+      <w:shd w:val="clear" w:fill="f8f8f8"/>
       <w:b/>
       <w:i/>
     </w:rPr>
@@ -42493,28 +43337,32 @@
     <w:name w:val="OtherTok"/>
     <w:basedOn w:val="VerbatimChar"/>
     <w:rPr>
-      <w:color w:val="007020"/>
+      <w:color w:val="8f5902"/>
+      <w:shd w:val="clear" w:fill="f8f8f8"/>
     </w:rPr>
   </w:style>
   <w:style w:type="character" w:customStyle="1" w:styleId="FunctionTok">
     <w:name w:val="FunctionTok"/>
     <w:basedOn w:val="VerbatimChar"/>
     <w:rPr>
-      <w:color w:val="06287e"/>
+      <w:color w:val="000000"/>
+      <w:shd w:val="clear" w:fill="f8f8f8"/>
     </w:rPr>
   </w:style>
   <w:style w:type="character" w:customStyle="1" w:styleId="VariableTok">
     <w:name w:val="VariableTok"/>
     <w:basedOn w:val="VerbatimChar"/>
     <w:rPr>
-      <w:color w:val="19177c"/>
+      <w:color w:val="000000"/>
+      <w:shd w:val="clear" w:fill="f8f8f8"/>
     </w:rPr>
   </w:style>
   <w:style w:type="character" w:customStyle="1" w:styleId="ControlFlowTok">
     <w:name w:val="ControlFlowTok"/>
     <w:basedOn w:val="VerbatimChar"/>
     <w:rPr>
-      <w:color w:val="007020"/>
+      <w:color w:val="204a87"/>
+      <w:shd w:val="clear" w:fill="f8f8f8"/>
       <w:b/>
     </w:rPr>
   </w:style>
@@ -42522,43 +43370,55 @@
     <w:name w:val="OperatorTok"/>
     <w:basedOn w:val="VerbatimChar"/>
     <w:rPr>
-      <w:color w:val="666666"/>
+      <w:color w:val="ce5c00"/>
+      <w:shd w:val="clear" w:fill="f8f8f8"/>
+      <w:b/>
     </w:rPr>
   </w:style>
   <w:style w:type="character" w:customStyle="1" w:styleId="BuiltInTok">
     <w:name w:val="BuiltInTok"/>
     <w:basedOn w:val="VerbatimChar"/>
-    <w:rPr/>
+    <w:rPr>
+      <w:shd w:val="clear" w:fill="f8f8f8"/>
+    </w:rPr>
   </w:style>
   <w:style w:type="character" w:customStyle="1" w:styleId="ExtensionTok">
     <w:name w:val="ExtensionTok"/>
     <w:basedOn w:val="VerbatimChar"/>
-    <w:rPr/>
+    <w:rPr>
+      <w:shd w:val="clear" w:fill="f8f8f8"/>
+    </w:rPr>
   </w:style>
   <w:style w:type="character" w:customStyle="1" w:styleId="PreprocessorTok">
     <w:name w:val="PreprocessorTok"/>
     <w:basedOn w:val="VerbatimChar"/>
     <w:rPr>
-      <w:color w:val="bc7a00"/>
+      <w:color w:val="8f5902"/>
+      <w:shd w:val="clear" w:fill="f8f8f8"/>
+      <w:i/>
     </w:rPr>
   </w:style>
   <w:style w:type="character" w:customStyle="1" w:styleId="AttributeTok">
     <w:name w:val="AttributeTok"/>
     <w:basedOn w:val="VerbatimChar"/>
     <w:rPr>
-      <w:color w:val="7d9029"/>
+      <w:color w:val="c4a000"/>
+      <w:shd w:val="clear" w:fill="f8f8f8"/>
     </w:rPr>
   </w:style>
   <w:style w:type="character" w:customStyle="1" w:styleId="RegionMarkerTok">
     <w:name w:val="RegionMarkerTok"/>
     <w:basedOn w:val="VerbatimChar"/>
-    <w:rPr/>
+    <w:rPr>
+      <w:shd w:val="clear" w:fill="f8f8f8"/>
+    </w:rPr>
   </w:style>
   <w:style w:type="character" w:customStyle="1" w:styleId="InformationTok">
     <w:name w:val="InformationTok"/>
     <w:basedOn w:val="VerbatimChar"/>
     <w:rPr>
-      <w:color w:val="60a0b0"/>
+      <w:color w:val="8f5902"/>
+      <w:shd w:val="clear" w:fill="f8f8f8"/>
       <w:b/>
       <w:i/>
     </w:rPr>
@@ -42567,7 +43427,8 @@
     <w:name w:val="WarningTok"/>
     <w:basedOn w:val="VerbatimChar"/>
     <w:rPr>
-      <w:color w:val="60a0b0"/>
+      <w:color w:val="8f5902"/>
+      <w:shd w:val="clear" w:fill="f8f8f8"/>
       <w:b/>
       <w:i/>
     </w:rPr>
@@ -42576,22 +43437,25 @@
     <w:name w:val="AlertTok"/>
     <w:basedOn w:val="VerbatimChar"/>
     <w:rPr>
-      <w:color w:val="ff0000"/>
-      <w:b/>
+      <w:color w:val="ef2929"/>
+      <w:shd w:val="clear" w:fill="f8f8f8"/>
     </w:rPr>
   </w:style>
   <w:style w:type="character" w:customStyle="1" w:styleId="ErrorTok">
     <w:name w:val="ErrorTok"/>
     <w:basedOn w:val="VerbatimChar"/>
     <w:rPr>
-      <w:color w:val="ff0000"/>
+      <w:color w:val="a40000"/>
+      <w:shd w:val="clear" w:fill="f8f8f8"/>
       <w:b/>
     </w:rPr>
   </w:style>
   <w:style w:type="character" w:customStyle="1" w:styleId="NormalTok">
     <w:name w:val="NormalTok"/>
     <w:basedOn w:val="VerbatimChar"/>
-    <w:rPr/>
+    <w:rPr>
+      <w:shd w:val="clear" w:fill="f8f8f8"/>
+    </w:rPr>
   </w:style>
 </w:styles>
 </file>
@@ -42607,44 +43471,44 @@
         <a:sysClr val="window" lastClr="FFFFFF"/>
       </a:lt1>
       <a:dk2>
-        <a:srgbClr val="1F497D"/>
+        <a:srgbClr val="0E2841"/>
       </a:dk2>
       <a:lt2>
-        <a:srgbClr val="EEECE1"/>
+        <a:srgbClr val="E8E8E8"/>
       </a:lt2>
       <a:accent1>
-        <a:srgbClr val="4F81BD"/>
+        <a:srgbClr val="156082"/>
       </a:accent1>
       <a:accent2>
-        <a:srgbClr val="C0504D"/>
+        <a:srgbClr val="E97132"/>
       </a:accent2>
       <a:accent3>
-        <a:srgbClr val="9BBB59"/>
+        <a:srgbClr val="196B24"/>
       </a:accent3>
       <a:accent4>
-        <a:srgbClr val="8064A2"/>
+        <a:srgbClr val="0F9ED5"/>
       </a:accent4>
       <a:accent5>
-        <a:srgbClr val="4BACC6"/>
+        <a:srgbClr val="A02B93"/>
       </a:accent5>
       <a:accent6>
-        <a:srgbClr val="F79646"/>
+        <a:srgbClr val="4EA72E"/>
       </a:accent6>
       <a:hlink>
-        <a:srgbClr val="0000FF"/>
+        <a:srgbClr val="467886"/>
       </a:hlink>
       <a:folHlink>
-        <a:srgbClr val="800080"/>
+        <a:srgbClr val="96607D"/>
       </a:folHlink>
     </a:clrScheme>
     <a:fontScheme name="Office">
       <a:majorFont>
-        <a:latin typeface="Calibri"/>
+        <a:latin typeface="Aptos Display" panose="02110004020202020204"/>
         <a:ea typeface=""/>
         <a:cs typeface=""/>
-        <a:font script="Jpan" typeface="ＭＳ ゴシック"/>
+        <a:font script="Jpan" typeface="游ゴシック Light"/>
         <a:font script="Hang" typeface="맑은 고딕"/>
-        <a:font script="Hans" typeface="宋体"/>
+        <a:font script="Hans" typeface="等线 Light"/>
         <a:font script="Hant" typeface="新細明體"/>
         <a:font script="Arab" typeface="Times New Roman"/>
         <a:font script="Hebr" typeface="Times New Roman"/>
@@ -42671,14 +43535,32 @@
         <a:font script="Mong" typeface="Mongolian Baiti"/>
         <a:font script="Viet" typeface="Times New Roman"/>
         <a:font script="Uigh" typeface="Microsoft Uighur"/>
+        <a:font script="Geor" typeface="Sylfaen"/>
+        <a:font script="Armn" typeface="Arial"/>
+        <a:font script="Bugi" typeface="Leelawadee UI"/>
+        <a:font script="Bopo" typeface="Microsoft JhengHei"/>
+        <a:font script="Java" typeface="Javanese Text"/>
+        <a:font script="Lisu" typeface="Segoe UI"/>
+        <a:font script="Mymr" typeface="Myanmar Text"/>
+        <a:font script="Nkoo" typeface="Ebrima"/>
+        <a:font script="Olck" typeface="Nirmala UI"/>
+        <a:font script="Osma" typeface="Ebrima"/>
+        <a:font script="Phag" typeface="Phagspa"/>
+        <a:font script="Syrn" typeface="Estrangelo Edessa"/>
+        <a:font script="Syrj" typeface="Estrangelo Edessa"/>
+        <a:font script="Syre" typeface="Estrangelo Edessa"/>
+        <a:font script="Sora" typeface="Nirmala UI"/>
+        <a:font script="Tale" typeface="Microsoft Tai Le"/>
+        <a:font script="Talu" typeface="Microsoft New Tai Lue"/>
+        <a:font script="Tfng" typeface="Ebrima"/>
       </a:majorFont>
       <a:minorFont>
-        <a:latin typeface="Cambria"/>
+        <a:latin typeface="Aptos" panose="02110004020202020204"/>
         <a:ea typeface=""/>
         <a:cs typeface=""/>
-        <a:font script="Jpan" typeface="ＭＳ 明朝"/>
+        <a:font script="Jpan" typeface="游明朝"/>
         <a:font script="Hang" typeface="맑은 고딕"/>
-        <a:font script="Hans" typeface="宋体"/>
+        <a:font script="Hans" typeface="等线"/>
         <a:font script="Hant" typeface="新細明體"/>
         <a:font script="Arab" typeface="Arial"/>
         <a:font script="Hebr" typeface="Arial"/>
@@ -42705,6 +43587,24 @@
         <a:font script="Mong" typeface="Mongolian Baiti"/>
         <a:font script="Viet" typeface="Arial"/>
         <a:font script="Uigh" typeface="Microsoft Uighur"/>
+        <a:font script="Geor" typeface="Sylfaen"/>
+        <a:font script="Armn" typeface="Arial"/>
+        <a:font script="Bugi" typeface="Leelawadee UI"/>
+        <a:font script="Bopo" typeface="Microsoft JhengHei"/>
+        <a:font script="Java" typeface="Javanese Text"/>
+        <a:font script="Lisu" typeface="Segoe UI"/>
+        <a:font script="Mymr" typeface="Myanmar Text"/>
+        <a:font script="Nkoo" typeface="Ebrima"/>
+        <a:font script="Olck" typeface="Nirmala UI"/>
+        <a:font script="Osma" typeface="Ebrima"/>
+        <a:font script="Phag" typeface="Phagspa"/>
+        <a:font script="Syrn" typeface="Estrangelo Edessa"/>
+        <a:font script="Syrj" typeface="Estrangelo Edessa"/>
+        <a:font script="Syre" typeface="Estrangelo Edessa"/>
+        <a:font script="Sora" typeface="Nirmala UI"/>
+        <a:font script="Tale" typeface="Microsoft Tai Le"/>
+        <a:font script="Talu" typeface="Microsoft New Tai Lue"/>
+        <a:font script="Tfng" typeface="Ebrima"/>
       </a:minorFont>
     </a:fontScheme>
     <a:fmtScheme name="Office">
@@ -42716,200 +43616,141 @@
           <a:gsLst>
             <a:gs pos="0">
               <a:schemeClr val="phClr">
-                <a:tint val="50000"/>
-                <a:satMod val="300000"/>
+                <a:lumMod val="110000"/>
+                <a:satMod val="105000"/>
+                <a:tint val="67000"/>
               </a:schemeClr>
             </a:gs>
-            <a:gs pos="35000">
+            <a:gs pos="50000">
               <a:schemeClr val="phClr">
-                <a:tint val="37000"/>
-                <a:satMod val="300000"/>
+                <a:lumMod val="105000"/>
+                <a:satMod val="103000"/>
+                <a:tint val="73000"/>
               </a:schemeClr>
             </a:gs>
             <a:gs pos="100000">
               <a:schemeClr val="phClr">
-                <a:tint val="15000"/>
-                <a:satMod val="350000"/>
+                <a:lumMod val="105000"/>
+                <a:satMod val="109000"/>
+                <a:tint val="81000"/>
               </a:schemeClr>
             </a:gs>
           </a:gsLst>
-          <a:lin ang="16200000" scaled="1"/>
+          <a:lin ang="5400000" scaled="0"/>
         </a:gradFill>
         <a:gradFill rotWithShape="1">
           <a:gsLst>
             <a:gs pos="0">
               <a:schemeClr val="phClr">
-                <a:tint val="100000"/>
+                <a:satMod val="103000"/>
+                <a:lumMod val="102000"/>
+                <a:tint val="94000"/>
+              </a:schemeClr>
+            </a:gs>
+            <a:gs pos="50000">
+              <a:schemeClr val="phClr">
+                <a:satMod val="110000"/>
+                <a:lumMod val="100000"/>
                 <a:shade val="100000"/>
-                <a:satMod val="130000"/>
               </a:schemeClr>
             </a:gs>
             <a:gs pos="100000">
               <a:schemeClr val="phClr">
-                <a:tint val="50000"/>
-                <a:shade val="100000"/>
-                <a:satMod val="350000"/>
+                <a:lumMod val="99000"/>
+                <a:satMod val="120000"/>
+                <a:shade val="78000"/>
               </a:schemeClr>
             </a:gs>
           </a:gsLst>
-          <a:lin ang="16200000" scaled="0"/>
+          <a:lin ang="5400000" scaled="0"/>
         </a:gradFill>
       </a:fillStyleLst>
       <a:lnStyleLst>
-        <a:ln w="9525" cap="flat" cmpd="sng" algn="ctr">
-          <a:solidFill>
-            <a:schemeClr val="phClr">
-              <a:shade val="95000"/>
-              <a:satMod val="105000"/>
-            </a:schemeClr>
-          </a:solidFill>
-          <a:prstDash val="solid"/>
-        </a:ln>
-        <a:ln w="25400" cap="flat" cmpd="sng" algn="ctr">
+        <a:ln w="6350" cap="flat" cmpd="sng" algn="ctr">
           <a:solidFill>
             <a:schemeClr val="phClr"/>
           </a:solidFill>
           <a:prstDash val="solid"/>
+          <a:miter lim="800000"/>
         </a:ln>
-        <a:ln w="38100" cap="flat" cmpd="sng" algn="ctr">
+        <a:ln w="12700" cap="flat" cmpd="sng" algn="ctr">
           <a:solidFill>
             <a:schemeClr val="phClr"/>
           </a:solidFill>
           <a:prstDash val="solid"/>
+          <a:miter lim="800000"/>
+        </a:ln>
+        <a:ln w="19050" cap="flat" cmpd="sng" algn="ctr">
+          <a:solidFill>
+            <a:schemeClr val="phClr"/>
+          </a:solidFill>
+          <a:prstDash val="solid"/>
+          <a:miter lim="800000"/>
         </a:ln>
       </a:lnStyleLst>
       <a:effectStyleLst>
         <a:effectStyle>
+          <a:effectLst/>
+        </a:effectStyle>
+        <a:effectStyle>
+          <a:effectLst/>
+        </a:effectStyle>
+        <a:effectStyle>
           <a:effectLst>
-            <a:outerShdw blurRad="40000" dist="20000" dir="5400000" rotWithShape="0">
+            <a:outerShdw blurRad="57150" dist="19050" dir="5400000" algn="ctr" rotWithShape="0">
               <a:srgbClr val="000000">
-                <a:alpha val="38000"/>
+                <a:alpha val="63000"/>
               </a:srgbClr>
             </a:outerShdw>
           </a:effectLst>
-        </a:effectStyle>
-        <a:effectStyle>
-          <a:effectLst>
-            <a:outerShdw blurRad="40000" dist="23000" dir="5400000" rotWithShape="0">
-              <a:srgbClr val="000000">
-                <a:alpha val="35000"/>
-              </a:srgbClr>
-            </a:outerShdw>
-          </a:effectLst>
-        </a:effectStyle>
-        <a:effectStyle>
-          <a:effectLst>
-            <a:outerShdw blurRad="40000" dist="23000" dir="5400000" rotWithShape="0">
-              <a:srgbClr val="000000">
-                <a:alpha val="35000"/>
-              </a:srgbClr>
-            </a:outerShdw>
-          </a:effectLst>
-          <a:scene3d>
-            <a:camera prst="orthographicFront">
-              <a:rot lat="0" lon="0" rev="0"/>
-            </a:camera>
-            <a:lightRig rig="threePt" dir="t">
-              <a:rot lat="0" lon="0" rev="1200000"/>
-            </a:lightRig>
-          </a:scene3d>
-          <a:sp3d>
-            <a:bevelT w="63500" h="25400"/>
-          </a:sp3d>
         </a:effectStyle>
       </a:effectStyleLst>
       <a:bgFillStyleLst>
         <a:solidFill>
           <a:schemeClr val="phClr"/>
         </a:solidFill>
+        <a:solidFill>
+          <a:schemeClr val="phClr">
+            <a:tint val="95000"/>
+            <a:satMod val="170000"/>
+          </a:schemeClr>
+        </a:solidFill>
         <a:gradFill rotWithShape="1">
           <a:gsLst>
             <a:gs pos="0">
               <a:schemeClr val="phClr">
-                <a:tint val="40000"/>
-                <a:satMod val="350000"/>
+                <a:tint val="93000"/>
+                <a:satMod val="150000"/>
+                <a:shade val="98000"/>
+                <a:lumMod val="102000"/>
               </a:schemeClr>
             </a:gs>
-            <a:gs pos="40000">
+            <a:gs pos="50000">
               <a:schemeClr val="phClr">
-                <a:tint val="45000"/>
-                <a:shade val="99000"/>
-                <a:satMod val="350000"/>
+                <a:tint val="98000"/>
+                <a:satMod val="130000"/>
+                <a:shade val="90000"/>
+                <a:lumMod val="103000"/>
               </a:schemeClr>
             </a:gs>
             <a:gs pos="100000">
               <a:schemeClr val="phClr">
-                <a:shade val="20000"/>
-                <a:satMod val="255000"/>
+                <a:shade val="63000"/>
+                <a:satMod val="120000"/>
               </a:schemeClr>
             </a:gs>
           </a:gsLst>
-          <a:path path="circle">
-            <a:fillToRect l="50000" t="-80000" r="50000" b="180000"/>
-          </a:path>
-        </a:gradFill>
-        <a:gradFill rotWithShape="1">
-          <a:gsLst>
-            <a:gs pos="0">
-              <a:schemeClr val="phClr">
-                <a:tint val="80000"/>
-                <a:satMod val="300000"/>
-              </a:schemeClr>
-            </a:gs>
-            <a:gs pos="100000">
-              <a:schemeClr val="phClr">
-                <a:shade val="30000"/>
-                <a:satMod val="200000"/>
-              </a:schemeClr>
-            </a:gs>
-          </a:gsLst>
-          <a:path path="circle">
-            <a:fillToRect l="50000" t="50000" r="50000" b="50000"/>
-          </a:path>
+          <a:lin ang="5400000" scaled="0"/>
         </a:gradFill>
       </a:bgFillStyleLst>
     </a:fmtScheme>
   </a:themeElements>
-  <a:objectDefaults>
-    <a:spDef>
-      <a:spPr/>
-      <a:bodyPr/>
-      <a:lstStyle/>
-      <a:style>
-        <a:lnRef idx="1">
-          <a:schemeClr val="accent1"/>
-        </a:lnRef>
-        <a:fillRef idx="3">
-          <a:schemeClr val="accent1"/>
-        </a:fillRef>
-        <a:effectRef idx="2">
-          <a:schemeClr val="accent1"/>
-        </a:effectRef>
-        <a:fontRef idx="minor">
-          <a:schemeClr val="lt1"/>
-        </a:fontRef>
-      </a:style>
-    </a:spDef>
-    <a:lnDef>
-      <a:spPr/>
-      <a:bodyPr/>
-      <a:lstStyle/>
-      <a:style>
-        <a:lnRef idx="2">
-          <a:schemeClr val="accent1"/>
-        </a:lnRef>
-        <a:fillRef idx="0">
-          <a:schemeClr val="accent1"/>
-        </a:fillRef>
-        <a:effectRef idx="1">
-          <a:schemeClr val="accent1"/>
-        </a:effectRef>
-        <a:fontRef idx="minor">
-          <a:schemeClr val="tx1"/>
-        </a:fontRef>
-      </a:style>
-    </a:lnDef>
-  </a:objectDefaults>
+  <a:objectDefaults/>
   <a:extraClrSchemeLst/>
+  <a:extLst>
+    <a:ext uri="{05A4C25C-085E-4340-85A3-A5531E510DB2}">
+      <thm15:themeFamily xmlns:thm15="http://schemas.microsoft.com/office/thememl/2012/main" name="Office Theme" id="{2E142A2C-CD16-42D6-873A-C26D2A0506FA}" vid="{1BDDFF52-6CD6-40A5-AB3C-68EB2F1E4D0A}"/>
+    </a:ext>
+  </a:extLst>
 </a:theme>
 </file>
</xml_diff>

<commit_message>
fix: Xóa AI khỏi hình Use Case và Architecture diagram
- Tạo lại mobile-use-case-user.png (không còn AI-Powered, Nhận gợi ý)
- Tạo lại kien-truc-tong-the.png (không còn Recommend System)
- Cập nhật diagrams/architecture.png và use-case.png
- Rebuild DOCX với template + fix captions
- 42 figures + 27 tables caption đầy đủ
</commit_message>
<xml_diff>
--- a/bao-cao.docx
+++ b/bao-cao.docx
@@ -9691,7 +9691,7 @@
       <w:r>
         <w:drawing>
           <wp:inline>
-            <wp:extent cx="5753100" cy="2609291"/>
+            <wp:extent cx="5753100" cy="3093333"/>
             <wp:effectExtent b="0" l="0" r="0" t="0"/>
             <wp:docPr descr="Hình 3: Sơ đồ kiến trúc Microservices SmartVN" title="" id="1" name="Picture"/>
             <a:graphic>
@@ -9712,7 +9712,7 @@
                   <pic:spPr bwMode="auto">
                     <a:xfrm>
                       <a:off x="0" y="0"/>
-                      <a:ext cx="5753100" cy="2609291"/>
+                      <a:ext cx="5753100" cy="3093333"/>
                     </a:xfrm>
                     <a:prstGeom prst="rect">
                       <a:avLst/>
@@ -9754,7 +9754,7 @@
       <w:r>
         <w:drawing>
           <wp:inline>
-            <wp:extent cx="3810000" cy="2540000"/>
+            <wp:extent cx="5753100" cy="3093333"/>
             <wp:effectExtent b="0" l="0" r="0" t="0"/>
             <wp:docPr descr="Hình 4: Sơ đồ kiến trúc tổng thể hệ thống SmartVN" title="" id="1" name="Picture"/>
             <a:graphic>
@@ -9775,7 +9775,7 @@
                   <pic:spPr bwMode="auto">
                     <a:xfrm>
                       <a:off x="0" y="0"/>
-                      <a:ext cx="3810000" cy="2540000"/>
+                      <a:ext cx="5753100" cy="3093333"/>
                     </a:xfrm>
                     <a:prstGeom prst="rect">
                       <a:avLst/>
@@ -21433,7 +21433,7 @@
       <w:r>
         <w:drawing>
           <wp:inline>
-            <wp:extent cx="3810000" cy="2540000"/>
+            <wp:extent cx="5753100" cy="749201"/>
             <wp:effectExtent b="0" l="0" r="0" t="0"/>
             <wp:docPr descr="Hình 12: Sơ đồ Use Case tổng quan ứng dụng Mobile — Phía người dùng" title="" id="1" name="Picture"/>
             <a:graphic>
@@ -21454,7 +21454,7 @@
                   <pic:spPr bwMode="auto">
                     <a:xfrm>
                       <a:off x="0" y="0"/>
-                      <a:ext cx="3810000" cy="2540000"/>
+                      <a:ext cx="5753100" cy="749201"/>
                     </a:xfrm>
                     <a:prstGeom prst="rect">
                       <a:avLst/>

</xml_diff>